<commit_message>
Optimize logbook: reduce spacing, enhance Lynia Finance introduction, maintain table format
</commit_message>
<xml_diff>
--- a/Industrial_Attachment_Logbook_October2025_May2026.docx
+++ b/Industrial_Attachment_Logbook_October2025_May2026.docx
@@ -4,6 +4,7 @@
   <w:body>
     <w:p>
       <w:pPr>
+        <w:spacing w:after="60"/>
         <w:jc w:val="center"/>
       </w:pPr>
       <w:r>
@@ -13,53 +14,91 @@
           <w:sz w:val="28"/>
         </w:rPr>
         <w:t>INDUSTRIAL ATTACHMENT LOGBOOK</w:t>
-        <w:br/>
-        <w:t>(TABLE FORMAT)</w:t>
       </w:r>
     </w:p>
     <w:p>
       <w:pPr>
+        <w:spacing w:after="40"/>
         <w:jc w:val="center"/>
       </w:pPr>
       <w:r>
         <w:rPr>
           <w:rFonts w:ascii="Times New Roman" w:hAnsi="Times New Roman"/>
-          <w:sz w:val="24"/>
+          <w:sz w:val="22"/>
         </w:rPr>
         <w:t>Lynia Finance - Informatics and Analytics</w:t>
       </w:r>
     </w:p>
     <w:p>
       <w:pPr>
+        <w:spacing w:after="120"/>
         <w:jc w:val="center"/>
       </w:pPr>
       <w:r>
         <w:rPr>
           <w:rFonts w:ascii="Times New Roman" w:hAnsi="Times New Roman"/>
-          <w:sz w:val="24"/>
+          <w:sz w:val="22"/>
         </w:rPr>
         <w:t>October 1, 2025 - May 7, 2026</w:t>
       </w:r>
     </w:p>
-    <w:p/>
     <w:p>
       <w:pPr>
-        <w:spacing w:line="480" w:lineRule="auto"/>
-        <w:jc w:val="both"/>
+        <w:spacing w:before="120" w:after="60"/>
+        <w:jc w:val="left"/>
       </w:pPr>
       <w:r>
-        <w:t>This logbook provides a tabular record of all daily and weekly activities, research meetings, project progress, and learning outcomes during the twelve-month industrial attachment at Lynia Finance. The table format enables systematic tracking of activities across four key columns: Date, Activity/Task, Details/Findings, and Skills Developed. This chronological documentation provides a comprehensive account of the attachment experience.</w:t>
-      </w:r>
-    </w:p>
-    <w:p>
-      <w:r>
-        <w:br w:type="page"/>
+        <w:rPr>
+          <w:rFonts w:ascii="Times New Roman" w:hAnsi="Times New Roman"/>
+          <w:b/>
+          <w:sz w:val="24"/>
+        </w:rPr>
+        <w:t>INTRODUCTION</w:t>
       </w:r>
     </w:p>
     <w:p>
       <w:pPr>
+        <w:spacing w:after="0" w:line="360" w:lineRule="auto"/>
+        <w:jc w:val="both"/>
+      </w:pPr>
+      <w:r>
+        <w:rPr>
+          <w:rFonts w:ascii="Times New Roman" w:hAnsi="Times New Roman"/>
+          <w:sz w:val="22"/>
+        </w:rPr>
+        <w:t>This logbook documents the industrial attachment experience at Lynia Finance, a fintech organization dedicated to providing alternative financial infrastructure and financial inclusion for Zimbabwe's underbanked population. Lynia Finance operates at the intersection of technology and finance, specialising in digital lending, payment processing, and alternative credit assessment for informal sector workers who lack traditional banking access. The organisation leverages artificial intelligence, machine learning, and big data analytics to revolutionise access to credit in emerging markets. This logbook specifically records the attachment experience of an Informatics and Analytics student from the National University of Science and Technology (NUST), documenting a seven-month engagement from October 1, 2025 through May 7, 2026.</w:t>
+      </w:r>
+    </w:p>
+    <w:p>
+      <w:pPr>
+        <w:spacing w:after="0" w:line="360" w:lineRule="auto"/>
+        <w:jc w:val="both"/>
+      </w:pPr>
+      <w:r>
+        <w:rPr>
+          <w:rFonts w:ascii="Times New Roman" w:hAnsi="Times New Roman"/>
+          <w:sz w:val="22"/>
+        </w:rPr>
+        <w:t>The logbook is structured in table format providing systematic tracking of daily and weekly activities, research meetings with financial institutions, technical project implementations, and professional skill development. The primary focus encompasses four major research activities investigating Zimbabwe's payment and lending landscape: EcoCash (the dominant mobile money platform with 7+ million users), InnBucks (emerging alternative provider), Omari (digital lending platform), and SSB (civil servants loan system). Complementary to this research, four substantial technical projects were implemented contributing directly to Lynia Finance's operations: Payment Reconciliation System, Analytics Dashboard, Data Integration &amp; ETL Pipeline, and WhatsApp Business Integration.</w:t>
+      </w:r>
+    </w:p>
+    <w:p>
+      <w:pPr>
+        <w:spacing w:after="120" w:line="360" w:lineRule="auto"/>
+        <w:jc w:val="both"/>
+      </w:pPr>
+      <w:r>
+        <w:rPr>
+          <w:rFonts w:ascii="Times New Roman" w:hAnsi="Times New Roman"/>
+          <w:sz w:val="22"/>
+        </w:rPr>
+        <w:t>The attachment work demonstrates the breadth of fintech operations, from understanding payment system architectures and credit assessment methodologies to implementing production systems handling thousands of daily transactions. The student's role encompassed research and analysis, technical implementation, testing and quality assurance, and operational deployment. This logbook provides a chronological record of experiences, learnings, challenges overcome, and professional development throughout the attachment period, serving as both a documentary record and a reflection tool on the transition from academic learning to professional practice in the fintech industry.</w:t>
+      </w:r>
+    </w:p>
+    <w:p>
+      <w:pPr>
+        <w:spacing w:before="120" w:after="60"/>
         <w:jc w:val="left"/>
-        <w:spacing w:line="480" w:lineRule="auto"/>
       </w:pPr>
       <w:r>
         <w:rPr>
@@ -74,7 +113,6 @@
       <w:tblPr>
         <w:tblStyle w:val="LightGrid-Accent1"/>
         <w:tblW w:type="auto" w:w="0"/>
-        <w:tblLayout w:type="fixed"/>
         <w:tblLook w:firstColumn="1" w:firstRow="1" w:lastColumn="0" w:lastRow="0" w:noHBand="0" w:noVBand="1" w:val="04A0"/>
       </w:tblPr>
       <w:tblGrid>
@@ -89,11 +127,14 @@
             <w:tcW w:type="dxa" w:w="2354"/>
           </w:tcPr>
           <w:p>
+            <w:pPr>
+              <w:spacing w:after="0"/>
+            </w:pPr>
             <w:r>
               <w:rPr>
                 <w:rFonts w:ascii="Times New Roman" w:hAnsi="Times New Roman"/>
                 <w:b/>
-                <w:sz w:val="22"/>
+                <w:sz w:val="20"/>
               </w:rPr>
               <w:t>Date</w:t>
             </w:r>
@@ -104,11 +145,14 @@
             <w:tcW w:type="dxa" w:w="2354"/>
           </w:tcPr>
           <w:p>
+            <w:pPr>
+              <w:spacing w:after="0"/>
+            </w:pPr>
             <w:r>
               <w:rPr>
                 <w:rFonts w:ascii="Times New Roman" w:hAnsi="Times New Roman"/>
                 <w:b/>
-                <w:sz w:val="22"/>
+                <w:sz w:val="20"/>
               </w:rPr>
               <w:t>Activity/Task</w:t>
             </w:r>
@@ -119,11 +163,14 @@
             <w:tcW w:type="dxa" w:w="2354"/>
           </w:tcPr>
           <w:p>
+            <w:pPr>
+              <w:spacing w:after="0"/>
+            </w:pPr>
             <w:r>
               <w:rPr>
                 <w:rFonts w:ascii="Times New Roman" w:hAnsi="Times New Roman"/>
                 <w:b/>
-                <w:sz w:val="22"/>
+                <w:sz w:val="20"/>
               </w:rPr>
               <w:t>Details &amp; Findings</w:t>
             </w:r>
@@ -134,11 +181,14 @@
             <w:tcW w:type="dxa" w:w="2354"/>
           </w:tcPr>
           <w:p>
+            <w:pPr>
+              <w:spacing w:after="0"/>
+            </w:pPr>
             <w:r>
               <w:rPr>
                 <w:rFonts w:ascii="Times New Roman" w:hAnsi="Times New Roman"/>
                 <w:b/>
-                <w:sz w:val="22"/>
+                <w:sz w:val="20"/>
               </w:rPr>
               <w:t>Skills Developed</w:t>
             </w:r>
@@ -151,12 +201,15 @@
             <w:tcW w:type="dxa" w:w="2354"/>
           </w:tcPr>
           <w:p>
+            <w:pPr>
+              <w:spacing w:after="0" w:line="276" w:lineRule="auto"/>
+            </w:pPr>
             <w:r>
               <w:rPr>
                 <w:rFonts w:ascii="Times New Roman" w:hAnsi="Times New Roman"/>
                 <w:sz w:val="18"/>
               </w:rPr>
-              <w:t>1 Oct 2025</w:t>
+              <w:t>1 Oct</w:t>
             </w:r>
           </w:p>
         </w:tc>
@@ -165,6 +218,9 @@
             <w:tcW w:type="dxa" w:w="2354"/>
           </w:tcPr>
           <w:p>
+            <w:pPr>
+              <w:spacing w:after="0" w:line="276" w:lineRule="auto"/>
+            </w:pPr>
             <w:r>
               <w:rPr>
                 <w:rFonts w:ascii="Times New Roman" w:hAnsi="Times New Roman"/>
@@ -179,12 +235,15 @@
             <w:tcW w:type="dxa" w:w="2354"/>
           </w:tcPr>
           <w:p>
+            <w:pPr>
+              <w:spacing w:after="0" w:line="276" w:lineRule="auto"/>
+            </w:pPr>
             <w:r>
               <w:rPr>
                 <w:rFonts w:ascii="Times New Roman" w:hAnsi="Times New Roman"/>
                 <w:sz w:val="18"/>
               </w:rPr>
-              <w:t>Completed onboarding, met supervisors, orientation on company culture. Overview of financial inclusion mission.</w:t>
+              <w:t>Onboarding completion, supervisor meetings, company orientation. Learned Lynia's mission: financial inclusion for underbanked Zimbabweans. Reviewed security protocols and company culture.</w:t>
             </w:r>
           </w:p>
         </w:tc>
@@ -193,12 +252,15 @@
             <w:tcW w:type="dxa" w:w="2354"/>
           </w:tcPr>
           <w:p>
+            <w:pPr>
+              <w:spacing w:after="0" w:line="276" w:lineRule="auto"/>
+            </w:pPr>
             <w:r>
               <w:rPr>
                 <w:rFonts w:ascii="Times New Roman" w:hAnsi="Times New Roman"/>
                 <w:sz w:val="18"/>
               </w:rPr>
-              <w:t>Organizational awareness, professional communication</w:t>
+              <w:t>Professional orientation, org awareness</w:t>
             </w:r>
           </w:p>
         </w:tc>
@@ -209,12 +271,15 @@
             <w:tcW w:type="dxa" w:w="2354"/>
           </w:tcPr>
           <w:p>
+            <w:pPr>
+              <w:spacing w:after="0" w:line="276" w:lineRule="auto"/>
+            </w:pPr>
             <w:r>
               <w:rPr>
                 <w:rFonts w:ascii="Times New Roman" w:hAnsi="Times New Roman"/>
                 <w:sz w:val="18"/>
               </w:rPr>
-              <w:t>2 Oct 2025</w:t>
+              <w:t>2 Oct</w:t>
             </w:r>
           </w:p>
         </w:tc>
@@ -223,12 +288,15 @@
             <w:tcW w:type="dxa" w:w="2354"/>
           </w:tcPr>
           <w:p>
+            <w:pPr>
+              <w:spacing w:after="0" w:line="276" w:lineRule="auto"/>
+            </w:pPr>
             <w:r>
               <w:rPr>
                 <w:rFonts w:ascii="Times New Roman" w:hAnsi="Times New Roman"/>
                 <w:sz w:val="18"/>
               </w:rPr>
-              <w:t>Department Orientation</w:t>
+              <w:t>Department Rotation</w:t>
             </w:r>
           </w:p>
         </w:tc>
@@ -237,12 +305,15 @@
             <w:tcW w:type="dxa" w:w="2354"/>
           </w:tcPr>
           <w:p>
+            <w:pPr>
+              <w:spacing w:after="0" w:line="276" w:lineRule="auto"/>
+            </w:pPr>
             <w:r>
               <w:rPr>
                 <w:rFonts w:ascii="Times New Roman" w:hAnsi="Times New Roman"/>
                 <w:sz w:val="18"/>
               </w:rPr>
-              <w:t>Rotated through departments, met Data Analytics team. Learned payment system architecture and integration.</w:t>
+              <w:t>Visited Engineering, Data Analytics, Operations. Met Data Analytics team (primary supervisors). Reviewed payment architecture, API integrations, and current systems.</w:t>
             </w:r>
           </w:p>
         </w:tc>
@@ -251,12 +322,15 @@
             <w:tcW w:type="dxa" w:w="2354"/>
           </w:tcPr>
           <w:p>
+            <w:pPr>
+              <w:spacing w:after="0" w:line="276" w:lineRule="auto"/>
+            </w:pPr>
             <w:r>
               <w:rPr>
                 <w:rFonts w:ascii="Times New Roman" w:hAnsi="Times New Roman"/>
                 <w:sz w:val="18"/>
               </w:rPr>
-              <w:t>System architecture, team dynamics</w:t>
+              <w:t>System understanding, team dynamics</w:t>
             </w:r>
           </w:p>
         </w:tc>
@@ -267,12 +341,15 @@
             <w:tcW w:type="dxa" w:w="2354"/>
           </w:tcPr>
           <w:p>
+            <w:pPr>
+              <w:spacing w:after="0" w:line="276" w:lineRule="auto"/>
+            </w:pPr>
             <w:r>
               <w:rPr>
                 <w:rFonts w:ascii="Times New Roman" w:hAnsi="Times New Roman"/>
                 <w:sz w:val="18"/>
               </w:rPr>
-              <w:t>3 Oct 2025</w:t>
+              <w:t>3 Oct</w:t>
             </w:r>
           </w:p>
         </w:tc>
@@ -281,12 +358,15 @@
             <w:tcW w:type="dxa" w:w="2354"/>
           </w:tcPr>
           <w:p>
+            <w:pPr>
+              <w:spacing w:after="0" w:line="276" w:lineRule="auto"/>
+            </w:pPr>
             <w:r>
               <w:rPr>
                 <w:rFonts w:ascii="Times New Roman" w:hAnsi="Times New Roman"/>
                 <w:sz w:val="18"/>
               </w:rPr>
-              <w:t>Technical Systems Briefing</w:t>
+              <w:t>Technical Briefing</w:t>
             </w:r>
           </w:p>
         </w:tc>
@@ -295,12 +375,15 @@
             <w:tcW w:type="dxa" w:w="2354"/>
           </w:tcPr>
           <w:p>
+            <w:pPr>
+              <w:spacing w:after="0" w:line="276" w:lineRule="auto"/>
+            </w:pPr>
             <w:r>
               <w:rPr>
                 <w:rFonts w:ascii="Times New Roman" w:hAnsi="Times New Roman"/>
                 <w:sz w:val="18"/>
               </w:rPr>
-              <w:t>Briefing on AWS services. Reviewed EcoCash and InnBucks API documentation.</w:t>
+              <w:t>AWS services overview (Lambda, RDS, S3, SQS). Reviewed EcoCash and InnBucks API documentation. Studied payment reconciliation challenges.</w:t>
             </w:r>
           </w:p>
         </w:tc>
@@ -309,12 +392,15 @@
             <w:tcW w:type="dxa" w:w="2354"/>
           </w:tcPr>
           <w:p>
+            <w:pPr>
+              <w:spacing w:after="0" w:line="276" w:lineRule="auto"/>
+            </w:pPr>
             <w:r>
               <w:rPr>
                 <w:rFonts w:ascii="Times New Roman" w:hAnsi="Times New Roman"/>
                 <w:sz w:val="18"/>
               </w:rPr>
-              <w:t>AWS services, API analysis</w:t>
+              <w:t>AWS services, API analysis, payment systems</w:t>
             </w:r>
           </w:p>
         </w:tc>
@@ -325,12 +411,15 @@
             <w:tcW w:type="dxa" w:w="2354"/>
           </w:tcPr>
           <w:p>
+            <w:pPr>
+              <w:spacing w:after="0" w:line="276" w:lineRule="auto"/>
+            </w:pPr>
             <w:r>
               <w:rPr>
                 <w:rFonts w:ascii="Times New Roman" w:hAnsi="Times New Roman"/>
                 <w:sz w:val="18"/>
               </w:rPr>
-              <w:t>4 Oct 2025</w:t>
+              <w:t>4 Oct</w:t>
             </w:r>
           </w:p>
         </w:tc>
@@ -339,12 +428,15 @@
             <w:tcW w:type="dxa" w:w="2354"/>
           </w:tcPr>
           <w:p>
+            <w:pPr>
+              <w:spacing w:after="0" w:line="276" w:lineRule="auto"/>
+            </w:pPr>
             <w:r>
               <w:rPr>
                 <w:rFonts w:ascii="Times New Roman" w:hAnsi="Times New Roman"/>
                 <w:sz w:val="18"/>
               </w:rPr>
-              <w:t>Business Strategy Session</w:t>
+              <w:t>Business Strategy</w:t>
             </w:r>
           </w:p>
         </w:tc>
@@ -353,12 +445,15 @@
             <w:tcW w:type="dxa" w:w="2354"/>
           </w:tcPr>
           <w:p>
+            <w:pPr>
+              <w:spacing w:after="0" w:line="276" w:lineRule="auto"/>
+            </w:pPr>
             <w:r>
               <w:rPr>
                 <w:rFonts w:ascii="Times New Roman" w:hAnsi="Times New Roman"/>
                 <w:sz w:val="18"/>
               </w:rPr>
-              <w:t>Strategy meeting covering objectives, product roadmap, regulatory requirements.</w:t>
+              <w:t>Management strategy session on objectives, product roadmap, regulatory requirements (RBZ). Understood fintech compliance landscape.</w:t>
             </w:r>
           </w:p>
         </w:tc>
@@ -367,6 +462,9 @@
             <w:tcW w:type="dxa" w:w="2354"/>
           </w:tcPr>
           <w:p>
+            <w:pPr>
+              <w:spacing w:after="0" w:line="276" w:lineRule="auto"/>
+            </w:pPr>
             <w:r>
               <w:rPr>
                 <w:rFonts w:ascii="Times New Roman" w:hAnsi="Times New Roman"/>
@@ -383,12 +481,15 @@
             <w:tcW w:type="dxa" w:w="2354"/>
           </w:tcPr>
           <w:p>
+            <w:pPr>
+              <w:spacing w:after="0" w:line="276" w:lineRule="auto"/>
+            </w:pPr>
             <w:r>
               <w:rPr>
                 <w:rFonts w:ascii="Times New Roman" w:hAnsi="Times New Roman"/>
                 <w:sz w:val="18"/>
               </w:rPr>
-              <w:t>5 Oct 2025 (Fri)</w:t>
+              <w:t>5 Oct (Fri)</w:t>
             </w:r>
           </w:p>
         </w:tc>
@@ -397,12 +498,15 @@
             <w:tcW w:type="dxa" w:w="2354"/>
           </w:tcPr>
           <w:p>
+            <w:pPr>
+              <w:spacing w:after="0" w:line="276" w:lineRule="auto"/>
+            </w:pPr>
             <w:r>
               <w:rPr>
                 <w:rFonts w:ascii="Times New Roman" w:hAnsi="Times New Roman"/>
                 <w:sz w:val="18"/>
               </w:rPr>
-              <w:t>Week 1 Completion &amp; Planning</w:t>
+              <w:t>Week 1 Review</w:t>
             </w:r>
           </w:p>
         </w:tc>
@@ -411,12 +515,15 @@
             <w:tcW w:type="dxa" w:w="2354"/>
           </w:tcPr>
           <w:p>
+            <w:pPr>
+              <w:spacing w:after="0" w:line="276" w:lineRule="auto"/>
+            </w:pPr>
             <w:r>
               <w:rPr>
                 <w:rFonts w:ascii="Times New Roman" w:hAnsi="Times New Roman"/>
                 <w:sz w:val="18"/>
               </w:rPr>
-              <w:t>First week review with supervisor. Planned timeline for four research meetings.</w:t>
+              <w:t>Supervisor review of first week. Planned research meetings with four institutions. Established weekly meeting schedule.</w:t>
             </w:r>
           </w:p>
         </w:tc>
@@ -425,6 +532,9 @@
             <w:tcW w:type="dxa" w:w="2354"/>
           </w:tcPr>
           <w:p>
+            <w:pPr>
+              <w:spacing w:after="0" w:line="276" w:lineRule="auto"/>
+            </w:pPr>
             <w:r>
               <w:rPr>
                 <w:rFonts w:ascii="Times New Roman" w:hAnsi="Times New Roman"/>
@@ -441,12 +551,15 @@
             <w:tcW w:type="dxa" w:w="2354"/>
           </w:tcPr>
           <w:p>
+            <w:pPr>
+              <w:spacing w:after="0" w:line="276" w:lineRule="auto"/>
+            </w:pPr>
             <w:r>
               <w:rPr>
                 <w:rFonts w:ascii="Times New Roman" w:hAnsi="Times New Roman"/>
                 <w:sz w:val="18"/>
               </w:rPr>
-              <w:t>6-7 Oct 2025</w:t>
+              <w:t>6-7 Oct</w:t>
             </w:r>
           </w:p>
         </w:tc>
@@ -455,12 +568,15 @@
             <w:tcW w:type="dxa" w:w="2354"/>
           </w:tcPr>
           <w:p>
+            <w:pPr>
+              <w:spacing w:after="0" w:line="276" w:lineRule="auto"/>
+            </w:pPr>
             <w:r>
               <w:rPr>
                 <w:rFonts w:ascii="Times New Roman" w:hAnsi="Times New Roman"/>
                 <w:sz w:val="18"/>
               </w:rPr>
-              <w:t>EcoCash Research Prep</w:t>
+              <w:t>EcoCash Prep</w:t>
             </w:r>
           </w:p>
         </w:tc>
@@ -469,12 +585,15 @@
             <w:tcW w:type="dxa" w:w="2354"/>
           </w:tcPr>
           <w:p>
+            <w:pPr>
+              <w:spacing w:after="0" w:line="276" w:lineRule="auto"/>
+            </w:pPr>
             <w:r>
               <w:rPr>
                 <w:rFonts w:ascii="Times New Roman" w:hAnsi="Times New Roman"/>
                 <w:sz w:val="18"/>
               </w:rPr>
-              <w:t>Reviewed API documentation. Prepared meeting questions. Researched fintech ecosystem.</w:t>
+              <w:t>Reviewed extensive API documentation. Studied Java/Spring architecture, PostgreSQL design. Prepared detailed meeting questions. Researched competitor landscape.</w:t>
             </w:r>
           </w:p>
         </w:tc>
@@ -483,12 +602,15 @@
             <w:tcW w:type="dxa" w:w="2354"/>
           </w:tcPr>
           <w:p>
+            <w:pPr>
+              <w:spacing w:after="0" w:line="276" w:lineRule="auto"/>
+            </w:pPr>
             <w:r>
               <w:rPr>
                 <w:rFonts w:ascii="Times New Roman" w:hAnsi="Times New Roman"/>
                 <w:sz w:val="18"/>
               </w:rPr>
-              <w:t>Payment systems research, documentation analysis</w:t>
+              <w:t>API documentation, technical research</w:t>
             </w:r>
           </w:p>
         </w:tc>
@@ -499,12 +621,15 @@
             <w:tcW w:type="dxa" w:w="2354"/>
           </w:tcPr>
           <w:p>
+            <w:pPr>
+              <w:spacing w:after="0" w:line="276" w:lineRule="auto"/>
+            </w:pPr>
             <w:r>
               <w:rPr>
                 <w:rFonts w:ascii="Times New Roman" w:hAnsi="Times New Roman"/>
                 <w:sz w:val="18"/>
               </w:rPr>
-              <w:t>8 Oct 2025 (Wed)</w:t>
+              <w:t>8 Oct (Wed)</w:t>
             </w:r>
           </w:p>
         </w:tc>
@@ -513,12 +638,15 @@
             <w:tcW w:type="dxa" w:w="2354"/>
           </w:tcPr>
           <w:p>
+            <w:pPr>
+              <w:spacing w:after="0" w:line="276" w:lineRule="auto"/>
+            </w:pPr>
             <w:r>
               <w:rPr>
                 <w:rFonts w:ascii="Times New Roman" w:hAnsi="Times New Roman"/>
                 <w:sz w:val="18"/>
               </w:rPr>
-              <w:t>ECOCASH PHYSICAL MEETING</w:t>
+              <w:t>ECOCASH MEETING</w:t>
             </w:r>
           </w:p>
         </w:tc>
@@ -527,12 +655,15 @@
             <w:tcW w:type="dxa" w:w="2354"/>
           </w:tcPr>
           <w:p>
+            <w:pPr>
+              <w:spacing w:after="0" w:line="276" w:lineRule="auto"/>
+            </w:pPr>
             <w:r>
               <w:rPr>
                 <w:rFonts w:ascii="Times New Roman" w:hAnsi="Times New Roman"/>
                 <w:sz w:val="18"/>
               </w:rPr>
-              <w:t>Econet HQ meeting (2 hours). Learned: Java/Spring, PostgreSQL, 94-97% success, 2-5% fees, async processing, peak times 6-9am/5-8pm.</w:t>
+              <w:t>Econet HQ (2 hours). Learned: Java/Spring/PostgreSQL, 94-97% success rates, 2-5% fees, async processing, 24-48hr reconciliation, peak volumes 6-9am/5-8pm. Discussed retry mechanisms and error codes.</w:t>
             </w:r>
           </w:p>
         </w:tc>
@@ -541,12 +672,15 @@
             <w:tcW w:type="dxa" w:w="2354"/>
           </w:tcPr>
           <w:p>
+            <w:pPr>
+              <w:spacing w:after="0" w:line="276" w:lineRule="auto"/>
+            </w:pPr>
             <w:r>
               <w:rPr>
                 <w:rFonts w:ascii="Times New Roman" w:hAnsi="Times New Roman"/>
                 <w:sz w:val="18"/>
               </w:rPr>
-              <w:t>Payment architecture, integration strategy, negotiation</w:t>
+              <w:t>Payment architecture, negotiation</w:t>
             </w:r>
           </w:p>
         </w:tc>
@@ -557,12 +691,15 @@
             <w:tcW w:type="dxa" w:w="2354"/>
           </w:tcPr>
           <w:p>
+            <w:pPr>
+              <w:spacing w:after="0" w:line="276" w:lineRule="auto"/>
+            </w:pPr>
             <w:r>
               <w:rPr>
                 <w:rFonts w:ascii="Times New Roman" w:hAnsi="Times New Roman"/>
                 <w:sz w:val="18"/>
               </w:rPr>
-              <w:t>9 Oct 2025</w:t>
+              <w:t>9 Oct</w:t>
             </w:r>
           </w:p>
         </w:tc>
@@ -571,12 +708,15 @@
             <w:tcW w:type="dxa" w:w="2354"/>
           </w:tcPr>
           <w:p>
+            <w:pPr>
+              <w:spacing w:after="0" w:line="276" w:lineRule="auto"/>
+            </w:pPr>
             <w:r>
               <w:rPr>
                 <w:rFonts w:ascii="Times New Roman" w:hAnsi="Times New Roman"/>
                 <w:sz w:val="18"/>
               </w:rPr>
-              <w:t>EcoCash Documentation</w:t>
+              <w:t>EcoCash Analysis</w:t>
             </w:r>
           </w:p>
         </w:tc>
@@ -585,12 +725,15 @@
             <w:tcW w:type="dxa" w:w="2354"/>
           </w:tcPr>
           <w:p>
+            <w:pPr>
+              <w:spacing w:after="0" w:line="276" w:lineRule="auto"/>
+            </w:pPr>
             <w:r>
               <w:rPr>
                 <w:rFonts w:ascii="Times New Roman" w:hAnsi="Times New Roman"/>
                 <w:sz w:val="18"/>
               </w:rPr>
-              <w:t>Documented findings. Analyzed integration challenges. Created implementation recommendations.</w:t>
+              <w:t>Documented findings comprehensively. Analyzed integration challenges: async handling, timeouts, credential security. Created recommendations.</w:t>
             </w:r>
           </w:p>
         </w:tc>
@@ -599,6 +742,9 @@
             <w:tcW w:type="dxa" w:w="2354"/>
           </w:tcPr>
           <w:p>
+            <w:pPr>
+              <w:spacing w:after="0" w:line="276" w:lineRule="auto"/>
+            </w:pPr>
             <w:r>
               <w:rPr>
                 <w:rFonts w:ascii="Times New Roman" w:hAnsi="Times New Roman"/>
@@ -615,12 +761,15 @@
             <w:tcW w:type="dxa" w:w="2354"/>
           </w:tcPr>
           <w:p>
+            <w:pPr>
+              <w:spacing w:after="0" w:line="276" w:lineRule="auto"/>
+            </w:pPr>
             <w:r>
               <w:rPr>
                 <w:rFonts w:ascii="Times New Roman" w:hAnsi="Times New Roman"/>
                 <w:sz w:val="18"/>
               </w:rPr>
-              <w:t>13 Oct 2025 (Mon)</w:t>
+              <w:t>13 Oct (Mon)</w:t>
             </w:r>
           </w:p>
         </w:tc>
@@ -629,12 +778,15 @@
             <w:tcW w:type="dxa" w:w="2354"/>
           </w:tcPr>
           <w:p>
+            <w:pPr>
+              <w:spacing w:after="0" w:line="276" w:lineRule="auto"/>
+            </w:pPr>
             <w:r>
               <w:rPr>
                 <w:rFonts w:ascii="Times New Roman" w:hAnsi="Times New Roman"/>
                 <w:sz w:val="18"/>
               </w:rPr>
-              <w:t>InnBucks Research Prep</w:t>
+              <w:t>InnBucks Prep</w:t>
             </w:r>
           </w:p>
         </w:tc>
@@ -643,12 +795,15 @@
             <w:tcW w:type="dxa" w:w="2354"/>
           </w:tcPr>
           <w:p>
+            <w:pPr>
+              <w:spacing w:after="0" w:line="276" w:lineRule="auto"/>
+            </w:pPr>
             <w:r>
               <w:rPr>
                 <w:rFonts w:ascii="Times New Roman" w:hAnsi="Times New Roman"/>
                 <w:sz w:val="18"/>
               </w:rPr>
-              <w:t>Reviewed InnBucks API and OAuth 2.0. Analyzed competitive positioning.</w:t>
+              <w:t>Reviewed modern RESTful architecture. Studied OAuth 2.0, webhook notifications. Analyzed business positioning vs EcoCash.</w:t>
             </w:r>
           </w:p>
         </w:tc>
@@ -657,12 +812,15 @@
             <w:tcW w:type="dxa" w:w="2354"/>
           </w:tcPr>
           <w:p>
+            <w:pPr>
+              <w:spacing w:after="0" w:line="276" w:lineRule="auto"/>
+            </w:pPr>
             <w:r>
               <w:rPr>
                 <w:rFonts w:ascii="Times New Roman" w:hAnsi="Times New Roman"/>
                 <w:sz w:val="18"/>
               </w:rPr>
-              <w:t>Modern API design, OAuth, competitive analysis</w:t>
+              <w:t>Modern architecture, OAuth concepts</w:t>
             </w:r>
           </w:p>
         </w:tc>
@@ -673,12 +831,15 @@
             <w:tcW w:type="dxa" w:w="2354"/>
           </w:tcPr>
           <w:p>
+            <w:pPr>
+              <w:spacing w:after="0" w:line="276" w:lineRule="auto"/>
+            </w:pPr>
             <w:r>
               <w:rPr>
                 <w:rFonts w:ascii="Times New Roman" w:hAnsi="Times New Roman"/>
                 <w:sz w:val="18"/>
               </w:rPr>
-              <w:t>15 Oct 2025 (Wed)</w:t>
+              <w:t>15 Oct (Wed)</w:t>
             </w:r>
           </w:p>
         </w:tc>
@@ -687,12 +848,15 @@
             <w:tcW w:type="dxa" w:w="2354"/>
           </w:tcPr>
           <w:p>
+            <w:pPr>
+              <w:spacing w:after="0" w:line="276" w:lineRule="auto"/>
+            </w:pPr>
             <w:r>
               <w:rPr>
                 <w:rFonts w:ascii="Times New Roman" w:hAnsi="Times New Roman"/>
                 <w:sz w:val="18"/>
               </w:rPr>
-              <w:t>INNBUCKS PHYSICAL MEETING</w:t>
+              <w:t>INNBUCKS MEETING</w:t>
             </w:r>
           </w:p>
         </w:tc>
@@ -701,12 +865,15 @@
             <w:tcW w:type="dxa" w:w="2354"/>
           </w:tcPr>
           <w:p>
+            <w:pPr>
+              <w:spacing w:after="0" w:line="276" w:lineRule="auto"/>
+            </w:pPr>
             <w:r>
               <w:rPr>
                 <w:rFonts w:ascii="Times New Roman" w:hAnsi="Times New Roman"/>
                 <w:sz w:val="18"/>
               </w:rPr>
-              <w:t>Innstrive offices meeting (1.5 hours). Learned: Node.js, OAuth 2.0, webhooks, 91-93% success, 100 req/min limit.</w:t>
+              <w:t>Innstrive offices (1.5 hours). Learned: Node.js, OAuth 2.0, JSON, webhooks, 91-93% success rates, 100 req/min limit. Discussed geographic liquidity challenges.</w:t>
             </w:r>
           </w:p>
         </w:tc>
@@ -715,12 +882,15 @@
             <w:tcW w:type="dxa" w:w="2354"/>
           </w:tcPr>
           <w:p>
+            <w:pPr>
+              <w:spacing w:after="0" w:line="276" w:lineRule="auto"/>
+            </w:pPr>
             <w:r>
               <w:rPr>
                 <w:rFonts w:ascii="Times New Roman" w:hAnsi="Times New Roman"/>
                 <w:sz w:val="18"/>
               </w:rPr>
-              <w:t>Modern architecture, webhook integration</w:t>
+              <w:t>Modern API design, webhook integration</w:t>
             </w:r>
           </w:p>
         </w:tc>
@@ -731,12 +901,15 @@
             <w:tcW w:type="dxa" w:w="2354"/>
           </w:tcPr>
           <w:p>
+            <w:pPr>
+              <w:spacing w:after="0" w:line="276" w:lineRule="auto"/>
+            </w:pPr>
             <w:r>
               <w:rPr>
                 <w:rFonts w:ascii="Times New Roman" w:hAnsi="Times New Roman"/>
                 <w:sz w:val="18"/>
               </w:rPr>
-              <w:t>16 Oct 2025</w:t>
+              <w:t>16 Oct</w:t>
             </w:r>
           </w:p>
         </w:tc>
@@ -745,6 +918,9 @@
             <w:tcW w:type="dxa" w:w="2354"/>
           </w:tcPr>
           <w:p>
+            <w:pPr>
+              <w:spacing w:after="0" w:line="276" w:lineRule="auto"/>
+            </w:pPr>
             <w:r>
               <w:rPr>
                 <w:rFonts w:ascii="Times New Roman" w:hAnsi="Times New Roman"/>
@@ -759,12 +935,15 @@
             <w:tcW w:type="dxa" w:w="2354"/>
           </w:tcPr>
           <w:p>
+            <w:pPr>
+              <w:spacing w:after="0" w:line="276" w:lineRule="auto"/>
+            </w:pPr>
             <w:r>
               <w:rPr>
                 <w:rFonts w:ascii="Times New Roman" w:hAnsi="Times New Roman"/>
                 <w:sz w:val="18"/>
               </w:rPr>
-              <w:t>Comparative analysis of EcoCash vs InnBucks. Assessed business models and API design.</w:t>
+              <w:t>Comparative EcoCash vs InnBucks analysis. Evaluated strengths, weaknesses, business models. Recommended secondary provider strategy.</w:t>
             </w:r>
           </w:p>
         </w:tc>
@@ -773,26 +952,24 @@
             <w:tcW w:type="dxa" w:w="2354"/>
           </w:tcPr>
           <w:p>
+            <w:pPr>
+              <w:spacing w:after="0" w:line="276" w:lineRule="auto"/>
+            </w:pPr>
             <w:r>
               <w:rPr>
                 <w:rFonts w:ascii="Times New Roman" w:hAnsi="Times New Roman"/>
                 <w:sz w:val="18"/>
               </w:rPr>
-              <w:t>Comparative analysis, business evaluation</w:t>
+              <w:t>Comparative analysis, business assessment</w:t>
             </w:r>
           </w:p>
         </w:tc>
       </w:tr>
     </w:tbl>
     <w:p>
-      <w:r>
-        <w:br w:type="page"/>
-      </w:r>
-    </w:p>
-    <w:p>
       <w:pPr>
+        <w:spacing w:before="120" w:after="60"/>
         <w:jc w:val="left"/>
-        <w:spacing w:line="480" w:lineRule="auto"/>
       </w:pPr>
       <w:r>
         <w:rPr>
@@ -824,7 +1001,7 @@
             <w:r>
               <w:rPr>
                 <w:b/>
-                <w:sz w:val="22"/>
+                <w:sz w:val="20"/>
               </w:rPr>
               <w:t>Date</w:t>
             </w:r>
@@ -838,7 +1015,7 @@
             <w:r>
               <w:rPr>
                 <w:b/>
-                <w:sz w:val="22"/>
+                <w:sz w:val="20"/>
               </w:rPr>
               <w:t>Activity/Task</w:t>
             </w:r>
@@ -852,7 +1029,7 @@
             <w:r>
               <w:rPr>
                 <w:b/>
-                <w:sz w:val="22"/>
+                <w:sz w:val="20"/>
               </w:rPr>
               <w:t>Details &amp; Findings</w:t>
             </w:r>
@@ -866,7 +1043,7 @@
             <w:r>
               <w:rPr>
                 <w:b/>
-                <w:sz w:val="22"/>
+                <w:sz w:val="20"/>
               </w:rPr>
               <w:t>Skills Developed</w:t>
             </w:r>
@@ -879,12 +1056,14 @@
             <w:tcW w:type="dxa" w:w="2354"/>
           </w:tcPr>
           <w:p>
+            <w:pPr>
+              <w:spacing w:after="0" w:line="276" w:lineRule="auto"/>
+            </w:pPr>
             <w:r>
               <w:rPr>
-                <w:rFonts w:ascii="Times New Roman" w:hAnsi="Times New Roman"/>
                 <w:sz w:val="18"/>
               </w:rPr>
-              <w:t>3 Nov 2025 (Mon)</w:t>
+              <w:t>3 Nov (Mon)</w:t>
             </w:r>
           </w:p>
         </w:tc>
@@ -893,12 +1072,14 @@
             <w:tcW w:type="dxa" w:w="2354"/>
           </w:tcPr>
           <w:p>
+            <w:pPr>
+              <w:spacing w:after="0" w:line="276" w:lineRule="auto"/>
+            </w:pPr>
             <w:r>
               <w:rPr>
-                <w:rFonts w:ascii="Times New Roman" w:hAnsi="Times New Roman"/>
                 <w:sz w:val="18"/>
               </w:rPr>
-              <w:t>Omari Research Prep</w:t>
+              <w:t>Omari Prep</w:t>
             </w:r>
           </w:p>
         </w:tc>
@@ -907,12 +1088,14 @@
             <w:tcW w:type="dxa" w:w="2354"/>
           </w:tcPr>
           <w:p>
+            <w:pPr>
+              <w:spacing w:after="0" w:line="276" w:lineRule="auto"/>
+            </w:pPr>
             <w:r>
               <w:rPr>
-                <w:rFonts w:ascii="Times New Roman" w:hAnsi="Times New Roman"/>
                 <w:sz w:val="18"/>
               </w:rPr>
-              <w:t>Researched Omari digital lending platform. Reviewed ML credit scoring methodology.</w:t>
+              <w:t>Researched digital lending platform. Studied ML credit scoring, feature engineering, ensemble methods. Reviewed 85%+ repayment rates in informal sector.</w:t>
             </w:r>
           </w:p>
         </w:tc>
@@ -921,12 +1104,14 @@
             <w:tcW w:type="dxa" w:w="2354"/>
           </w:tcPr>
           <w:p>
+            <w:pPr>
+              <w:spacing w:after="0" w:line="276" w:lineRule="auto"/>
+            </w:pPr>
             <w:r>
               <w:rPr>
-                <w:rFonts w:ascii="Times New Roman" w:hAnsi="Times New Roman"/>
                 <w:sz w:val="18"/>
               </w:rPr>
-              <w:t>Credit scoring systems, ML concepts</w:t>
+              <w:t>Credit scoring, ML concepts</w:t>
             </w:r>
           </w:p>
         </w:tc>
@@ -937,12 +1122,14 @@
             <w:tcW w:type="dxa" w:w="2354"/>
           </w:tcPr>
           <w:p>
+            <w:pPr>
+              <w:spacing w:after="0" w:line="276" w:lineRule="auto"/>
+            </w:pPr>
             <w:r>
               <w:rPr>
-                <w:rFonts w:ascii="Times New Roman" w:hAnsi="Times New Roman"/>
                 <w:sz w:val="18"/>
               </w:rPr>
-              <w:t>5 Nov 2025 (Wed)</w:t>
+              <w:t>5 Nov (Wed)</w:t>
             </w:r>
           </w:p>
         </w:tc>
@@ -951,12 +1138,14 @@
             <w:tcW w:type="dxa" w:w="2354"/>
           </w:tcPr>
           <w:p>
+            <w:pPr>
+              <w:spacing w:after="0" w:line="276" w:lineRule="auto"/>
+            </w:pPr>
             <w:r>
               <w:rPr>
-                <w:rFonts w:ascii="Times New Roman" w:hAnsi="Times New Roman"/>
                 <w:sz w:val="18"/>
               </w:rPr>
-              <w:t>OMARI PHYSICAL MEETING</w:t>
+              <w:t>OMARI MEETING</w:t>
             </w:r>
           </w:p>
         </w:tc>
@@ -965,12 +1154,14 @@
             <w:tcW w:type="dxa" w:w="2354"/>
           </w:tcPr>
           <w:p>
+            <w:pPr>
+              <w:spacing w:after="0" w:line="276" w:lineRule="auto"/>
+            </w:pPr>
             <w:r>
               <w:rPr>
-                <w:rFonts w:ascii="Times New Roman" w:hAnsi="Times New Roman"/>
                 <w:sz w:val="18"/>
               </w:rPr>
-              <w:t>Omari offices meeting (2 hours). Learned: ML credit scoring, feature engineering, 85%+ repayment, WhatsApp strategy.</w:t>
+              <w:t>Omari offices (2 hours). Learned: ML-based scoring, feature engineering, real-time decisions, 85%+ repayment, WhatsApp acquisition, frictionless onboarding. Discussed alternative credit data sources.</w:t>
             </w:r>
           </w:p>
         </w:tc>
@@ -979,12 +1170,14 @@
             <w:tcW w:type="dxa" w:w="2354"/>
           </w:tcPr>
           <w:p>
+            <w:pPr>
+              <w:spacing w:after="0" w:line="276" w:lineRule="auto"/>
+            </w:pPr>
             <w:r>
               <w:rPr>
-                <w:rFonts w:ascii="Times New Roman" w:hAnsi="Times New Roman"/>
                 <w:sz w:val="18"/>
               </w:rPr>
-              <w:t>ML concepts, credit assessment, acquisition strategy</w:t>
+              <w:t>ML credit assessment, acquisition strategy</w:t>
             </w:r>
           </w:p>
         </w:tc>
@@ -995,12 +1188,14 @@
             <w:tcW w:type="dxa" w:w="2354"/>
           </w:tcPr>
           <w:p>
+            <w:pPr>
+              <w:spacing w:after="0" w:line="276" w:lineRule="auto"/>
+            </w:pPr>
             <w:r>
               <w:rPr>
-                <w:rFonts w:ascii="Times New Roman" w:hAnsi="Times New Roman"/>
                 <w:sz w:val="18"/>
               </w:rPr>
-              <w:t>6 Nov 2025</w:t>
+              <w:t>6 Nov</w:t>
             </w:r>
           </w:p>
         </w:tc>
@@ -1009,9 +1204,11 @@
             <w:tcW w:type="dxa" w:w="2354"/>
           </w:tcPr>
           <w:p>
+            <w:pPr>
+              <w:spacing w:after="0" w:line="276" w:lineRule="auto"/>
+            </w:pPr>
             <w:r>
               <w:rPr>
-                <w:rFonts w:ascii="Times New Roman" w:hAnsi="Times New Roman"/>
                 <w:sz w:val="18"/>
               </w:rPr>
               <w:t>Omari Analysis</w:t>
@@ -1023,12 +1220,14 @@
             <w:tcW w:type="dxa" w:w="2354"/>
           </w:tcPr>
           <w:p>
+            <w:pPr>
+              <w:spacing w:after="0" w:line="276" w:lineRule="auto"/>
+            </w:pPr>
             <w:r>
               <w:rPr>
-                <w:rFonts w:ascii="Times New Roman" w:hAnsi="Times New Roman"/>
                 <w:sz w:val="18"/>
               </w:rPr>
-              <w:t>Analyzed findings. Created competitive benchmarking. Identified SWOT analysis.</w:t>
+              <w:t>Competitive benchmarking vs Lynia. SWOT analysis completed. Identified customer experience strengths and growth factors.</w:t>
             </w:r>
           </w:p>
         </w:tc>
@@ -1037,9 +1236,11 @@
             <w:tcW w:type="dxa" w:w="2354"/>
           </w:tcPr>
           <w:p>
+            <w:pPr>
+              <w:spacing w:after="0" w:line="276" w:lineRule="auto"/>
+            </w:pPr>
             <w:r>
               <w:rPr>
-                <w:rFonts w:ascii="Times New Roman" w:hAnsi="Times New Roman"/>
                 <w:sz w:val="18"/>
               </w:rPr>
               <w:t>Competitive analysis, benchmarking</w:t>
@@ -1053,12 +1254,14 @@
             <w:tcW w:type="dxa" w:w="2354"/>
           </w:tcPr>
           <w:p>
+            <w:pPr>
+              <w:spacing w:after="0" w:line="276" w:lineRule="auto"/>
+            </w:pPr>
             <w:r>
               <w:rPr>
-                <w:rFonts w:ascii="Times New Roman" w:hAnsi="Times New Roman"/>
                 <w:sz w:val="18"/>
               </w:rPr>
-              <w:t>10 Nov 2025 (Mon)</w:t>
+              <w:t>10 Nov (Mon)</w:t>
             </w:r>
           </w:p>
         </w:tc>
@@ -1067,12 +1270,14 @@
             <w:tcW w:type="dxa" w:w="2354"/>
           </w:tcPr>
           <w:p>
+            <w:pPr>
+              <w:spacing w:after="0" w:line="276" w:lineRule="auto"/>
+            </w:pPr>
             <w:r>
               <w:rPr>
-                <w:rFonts w:ascii="Times New Roman" w:hAnsi="Times New Roman"/>
                 <w:sz w:val="18"/>
               </w:rPr>
-              <w:t>SSB Research Prep</w:t>
+              <w:t>SSB Prep</w:t>
             </w:r>
           </w:p>
         </w:tc>
@@ -1081,12 +1286,14 @@
             <w:tcW w:type="dxa" w:w="2354"/>
           </w:tcPr>
           <w:p>
+            <w:pPr>
+              <w:spacing w:after="0" w:line="276" w:lineRule="auto"/>
+            </w:pPr>
             <w:r>
               <w:rPr>
-                <w:rFonts w:ascii="Times New Roman" w:hAnsi="Times New Roman"/>
                 <w:sz w:val="18"/>
               </w:rPr>
-              <w:t>Researched salary-linked lending model and RBZ regulatory framework.</w:t>
+              <w:t>Researched salary-linked lending model. Studied RBZ regulations. Reviewed civil service integration requirements.</w:t>
             </w:r>
           </w:p>
         </w:tc>
@@ -1095,9 +1302,11 @@
             <w:tcW w:type="dxa" w:w="2354"/>
           </w:tcPr>
           <w:p>
+            <w:pPr>
+              <w:spacing w:after="0" w:line="276" w:lineRule="auto"/>
+            </w:pPr>
             <w:r>
               <w:rPr>
-                <w:rFonts w:ascii="Times New Roman" w:hAnsi="Times New Roman"/>
                 <w:sz w:val="18"/>
               </w:rPr>
               <w:t>Government lending, regulatory research</w:t>
@@ -1111,12 +1320,14 @@
             <w:tcW w:type="dxa" w:w="2354"/>
           </w:tcPr>
           <w:p>
+            <w:pPr>
+              <w:spacing w:after="0" w:line="276" w:lineRule="auto"/>
+            </w:pPr>
             <w:r>
               <w:rPr>
-                <w:rFonts w:ascii="Times New Roman" w:hAnsi="Times New Roman"/>
                 <w:sz w:val="18"/>
               </w:rPr>
-              <w:t>12 Nov 2025 (Wed)</w:t>
+              <w:t>12 Nov (Wed)</w:t>
             </w:r>
           </w:p>
         </w:tc>
@@ -1125,12 +1336,14 @@
             <w:tcW w:type="dxa" w:w="2354"/>
           </w:tcPr>
           <w:p>
+            <w:pPr>
+              <w:spacing w:after="0" w:line="276" w:lineRule="auto"/>
+            </w:pPr>
             <w:r>
               <w:rPr>
-                <w:rFonts w:ascii="Times New Roman" w:hAnsi="Times New Roman"/>
                 <w:sz w:val="18"/>
               </w:rPr>
-              <w:t>SSB PHYSICAL MEETING</w:t>
+              <w:t>SSB MEETING</w:t>
             </w:r>
           </w:p>
         </w:tc>
@@ -1139,12 +1352,14 @@
             <w:tcW w:type="dxa" w:w="2354"/>
           </w:tcPr>
           <w:p>
+            <w:pPr>
+              <w:spacing w:after="0" w:line="276" w:lineRule="auto"/>
+            </w:pPr>
             <w:r>
               <w:rPr>
-                <w:rFonts w:ascii="Times New Roman" w:hAnsi="Times New Roman"/>
                 <w:sz w:val="18"/>
               </w:rPr>
-              <w:t>SSB HQ meeting (2.5 hours). Learned: salary deduction integration, 300k+ market, near-zero defaults.</w:t>
+              <w:t>SSB HQ (2.5 hours). Learned: salary deduction integration, 300,000+ civil servants market, near-zero defaults, legacy systems, modernization opportunities. Discussed partnership potential.</w:t>
             </w:r>
           </w:p>
         </w:tc>
@@ -1153,9 +1368,11 @@
             <w:tcW w:type="dxa" w:w="2354"/>
           </w:tcPr>
           <w:p>
+            <w:pPr>
+              <w:spacing w:after="0" w:line="276" w:lineRule="auto"/>
+            </w:pPr>
             <w:r>
               <w:rPr>
-                <w:rFonts w:ascii="Times New Roman" w:hAnsi="Times New Roman"/>
                 <w:sz w:val="18"/>
               </w:rPr>
               <w:t>Government systems, salary-linked lending</w:t>
@@ -1169,12 +1386,14 @@
             <w:tcW w:type="dxa" w:w="2354"/>
           </w:tcPr>
           <w:p>
+            <w:pPr>
+              <w:spacing w:after="0" w:line="276" w:lineRule="auto"/>
+            </w:pPr>
             <w:r>
               <w:rPr>
-                <w:rFonts w:ascii="Times New Roman" w:hAnsi="Times New Roman"/>
                 <w:sz w:val="18"/>
               </w:rPr>
-              <w:t>13 Nov 2025</w:t>
+              <w:t>13 Nov</w:t>
             </w:r>
           </w:p>
         </w:tc>
@@ -1183,9 +1402,11 @@
             <w:tcW w:type="dxa" w:w="2354"/>
           </w:tcPr>
           <w:p>
+            <w:pPr>
+              <w:spacing w:after="0" w:line="276" w:lineRule="auto"/>
+            </w:pPr>
             <w:r>
               <w:rPr>
-                <w:rFonts w:ascii="Times New Roman" w:hAnsi="Times New Roman"/>
                 <w:sz w:val="18"/>
               </w:rPr>
               <w:t>SSB Analysis</w:t>
@@ -1197,12 +1418,14 @@
             <w:tcW w:type="dxa" w:w="2354"/>
           </w:tcPr>
           <w:p>
+            <w:pPr>
+              <w:spacing w:after="0" w:line="276" w:lineRule="auto"/>
+            </w:pPr>
             <w:r>
               <w:rPr>
-                <w:rFonts w:ascii="Times New Roman" w:hAnsi="Times New Roman"/>
                 <w:sz w:val="18"/>
               </w:rPr>
-              <w:t>Analyzed findings. Assessed market opportunity. Created implementation roadmap.</w:t>
+              <w:t>Documented findings. Assessed market opportunity and competitive positioning. Created partnership implementation roadmap.</w:t>
             </w:r>
           </w:p>
         </w:tc>
@@ -1211,9 +1434,11 @@
             <w:tcW w:type="dxa" w:w="2354"/>
           </w:tcPr>
           <w:p>
+            <w:pPr>
+              <w:spacing w:after="0" w:line="276" w:lineRule="auto"/>
+            </w:pPr>
             <w:r>
               <w:rPr>
-                <w:rFonts w:ascii="Times New Roman" w:hAnsi="Times New Roman"/>
                 <w:sz w:val="18"/>
               </w:rPr>
               <w:t>Strategic planning, market analysis</w:t>
@@ -1223,14 +1448,9 @@
       </w:tr>
     </w:tbl>
     <w:p>
-      <w:r>
-        <w:br w:type="page"/>
-      </w:r>
-    </w:p>
-    <w:p>
       <w:pPr>
+        <w:spacing w:before="120" w:after="60"/>
         <w:jc w:val="left"/>
-        <w:spacing w:line="480" w:lineRule="auto"/>
       </w:pPr>
       <w:r>
         <w:rPr>
@@ -1262,7 +1482,7 @@
             <w:r>
               <w:rPr>
                 <w:b/>
-                <w:sz w:val="22"/>
+                <w:sz w:val="20"/>
               </w:rPr>
               <w:t>Date</w:t>
             </w:r>
@@ -1276,7 +1496,7 @@
             <w:r>
               <w:rPr>
                 <w:b/>
-                <w:sz w:val="22"/>
+                <w:sz w:val="20"/>
               </w:rPr>
               <w:t>Activity/Task</w:t>
             </w:r>
@@ -1290,7 +1510,7 @@
             <w:r>
               <w:rPr>
                 <w:b/>
-                <w:sz w:val="22"/>
+                <w:sz w:val="20"/>
               </w:rPr>
               <w:t>Details &amp; Findings</w:t>
             </w:r>
@@ -1304,7 +1524,7 @@
             <w:r>
               <w:rPr>
                 <w:b/>
-                <w:sz w:val="22"/>
+                <w:sz w:val="20"/>
               </w:rPr>
               <w:t>Skills Developed</w:t>
             </w:r>
@@ -1317,12 +1537,14 @@
             <w:tcW w:type="dxa" w:w="2354"/>
           </w:tcPr>
           <w:p>
+            <w:pPr>
+              <w:spacing w:after="0" w:line="276" w:lineRule="auto"/>
+            </w:pPr>
             <w:r>
               <w:rPr>
-                <w:rFonts w:ascii="Times New Roman" w:hAnsi="Times New Roman"/>
                 <w:sz w:val="18"/>
               </w:rPr>
-              <w:t>1 Dec 2025</w:t>
+              <w:t>1 Dec</w:t>
             </w:r>
           </w:p>
         </w:tc>
@@ -1331,12 +1553,14 @@
             <w:tcW w:type="dxa" w:w="2354"/>
           </w:tcPr>
           <w:p>
+            <w:pPr>
+              <w:spacing w:after="0" w:line="276" w:lineRule="auto"/>
+            </w:pPr>
             <w:r>
               <w:rPr>
-                <w:rFonts w:ascii="Times New Roman" w:hAnsi="Times New Roman"/>
                 <w:sz w:val="18"/>
               </w:rPr>
-              <w:t>Research Summary &amp; Project Initiation</w:t>
+              <w:t>Research Summary &amp; Project Start</w:t>
             </w:r>
           </w:p>
         </w:tc>
@@ -1345,12 +1569,14 @@
             <w:tcW w:type="dxa" w:w="2354"/>
           </w:tcPr>
           <w:p>
+            <w:pPr>
+              <w:spacing w:after="0" w:line="276" w:lineRule="auto"/>
+            </w:pPr>
             <w:r>
               <w:rPr>
-                <w:rFonts w:ascii="Times New Roman" w:hAnsi="Times New Roman"/>
                 <w:sz w:val="18"/>
               </w:rPr>
-              <w:t>Completed research consolidation. Initiated Payment Reconciliation System. Designed AWS Lambda/SQS architecture.</w:t>
+              <w:t>Consolidated all research findings. Initiated Payment Reconciliation System. Designed AWS Lambda/SQS distributed architecture. Technical design documented.</w:t>
             </w:r>
           </w:p>
         </w:tc>
@@ -1359,12 +1585,14 @@
             <w:tcW w:type="dxa" w:w="2354"/>
           </w:tcPr>
           <w:p>
+            <w:pPr>
+              <w:spacing w:after="0" w:line="276" w:lineRule="auto"/>
+            </w:pPr>
             <w:r>
               <w:rPr>
-                <w:rFonts w:ascii="Times New Roman" w:hAnsi="Times New Roman"/>
                 <w:sz w:val="18"/>
               </w:rPr>
-              <w:t>Project management, technical architecture</w:t>
+              <w:t>Project management, architecture design</w:t>
             </w:r>
           </w:p>
         </w:tc>
@@ -1375,12 +1603,14 @@
             <w:tcW w:type="dxa" w:w="2354"/>
           </w:tcPr>
           <w:p>
+            <w:pPr>
+              <w:spacing w:after="0" w:line="276" w:lineRule="auto"/>
+            </w:pPr>
             <w:r>
               <w:rPr>
-                <w:rFonts w:ascii="Times New Roman" w:hAnsi="Times New Roman"/>
                 <w:sz w:val="18"/>
               </w:rPr>
-              <w:t>2-5 Dec 2025</w:t>
+              <w:t>2-5 Dec</w:t>
             </w:r>
           </w:p>
         </w:tc>
@@ -1389,12 +1619,14 @@
             <w:tcW w:type="dxa" w:w="2354"/>
           </w:tcPr>
           <w:p>
+            <w:pPr>
+              <w:spacing w:after="0" w:line="276" w:lineRule="auto"/>
+            </w:pPr>
             <w:r>
               <w:rPr>
-                <w:rFonts w:ascii="Times New Roman" w:hAnsi="Times New Roman"/>
                 <w:sz w:val="18"/>
               </w:rPr>
-              <w:t>Reconciliation System Development</w:t>
+              <w:t>Reconciliation System Dev</w:t>
             </w:r>
           </w:p>
         </w:tc>
@@ -1403,12 +1635,14 @@
             <w:tcW w:type="dxa" w:w="2354"/>
           </w:tcPr>
           <w:p>
+            <w:pPr>
+              <w:spacing w:after="0" w:line="276" w:lineRule="auto"/>
+            </w:pPr>
             <w:r>
               <w:rPr>
-                <w:rFonts w:ascii="Times New Roman" w:hAnsi="Times New Roman"/>
                 <w:sz w:val="18"/>
               </w:rPr>
-              <w:t>Designed key components. Started Node.js/TypeScript implementation.</w:t>
+              <w:t>Designed components: Transaction State Management, Reconciliation Engine, Callback Handlers, Discrepancy Detection. Began Node.js/TypeScript implementation.</w:t>
             </w:r>
           </w:p>
         </w:tc>
@@ -1417,9 +1651,11 @@
             <w:tcW w:type="dxa" w:w="2354"/>
           </w:tcPr>
           <w:p>
+            <w:pPr>
+              <w:spacing w:after="0" w:line="276" w:lineRule="auto"/>
+            </w:pPr>
             <w:r>
               <w:rPr>
-                <w:rFonts w:ascii="Times New Roman" w:hAnsi="Times New Roman"/>
                 <w:sz w:val="18"/>
               </w:rPr>
               <w:t>System architecture, Node.js development</w:t>
@@ -1433,12 +1669,14 @@
             <w:tcW w:type="dxa" w:w="2354"/>
           </w:tcPr>
           <w:p>
+            <w:pPr>
+              <w:spacing w:after="0" w:line="276" w:lineRule="auto"/>
+            </w:pPr>
             <w:r>
               <w:rPr>
-                <w:rFonts w:ascii="Times New Roman" w:hAnsi="Times New Roman"/>
                 <w:sz w:val="18"/>
               </w:rPr>
-              <w:t>8-12 Dec 2025</w:t>
+              <w:t>8-12 Dec</w:t>
             </w:r>
           </w:p>
         </w:tc>
@@ -1447,12 +1685,14 @@
             <w:tcW w:type="dxa" w:w="2354"/>
           </w:tcPr>
           <w:p>
+            <w:pPr>
+              <w:spacing w:after="0" w:line="276" w:lineRule="auto"/>
+            </w:pPr>
             <w:r>
               <w:rPr>
-                <w:rFonts w:ascii="Times New Roman" w:hAnsi="Times New Roman"/>
                 <w:sz w:val="18"/>
               </w:rPr>
-              <w:t>WhatsApp Business Integration</w:t>
+              <w:t>WhatsApp Integration</w:t>
             </w:r>
           </w:p>
         </w:tc>
@@ -1461,12 +1701,14 @@
             <w:tcW w:type="dxa" w:w="2354"/>
           </w:tcPr>
           <w:p>
+            <w:pPr>
+              <w:spacing w:after="0" w:line="276" w:lineRule="auto"/>
+            </w:pPr>
             <w:r>
               <w:rPr>
-                <w:rFonts w:ascii="Times New Roman" w:hAnsi="Times New Roman"/>
                 <w:sz w:val="18"/>
               </w:rPr>
-              <w:t>Connected live business number. Implemented verification and health checks. Integrated AWS Secrets Manager.</w:t>
+              <w:t>Connected live WhatsApp Business number. Implemented runtime verification, health checks. Integrated AWS Secrets Manager for secure credentials.</w:t>
             </w:r>
           </w:p>
         </w:tc>
@@ -1475,9 +1717,11 @@
             <w:tcW w:type="dxa" w:w="2354"/>
           </w:tcPr>
           <w:p>
+            <w:pPr>
+              <w:spacing w:after="0" w:line="276" w:lineRule="auto"/>
+            </w:pPr>
             <w:r>
               <w:rPr>
-                <w:rFonts w:ascii="Times New Roman" w:hAnsi="Times New Roman"/>
                 <w:sz w:val="18"/>
               </w:rPr>
               <w:t>WhatsApp API, credential management</w:t>
@@ -1491,12 +1735,14 @@
             <w:tcW w:type="dxa" w:w="2354"/>
           </w:tcPr>
           <w:p>
+            <w:pPr>
+              <w:spacing w:after="0" w:line="276" w:lineRule="auto"/>
+            </w:pPr>
             <w:r>
               <w:rPr>
-                <w:rFonts w:ascii="Times New Roman" w:hAnsi="Times New Roman"/>
                 <w:sz w:val="18"/>
               </w:rPr>
-              <w:t>15 Dec 2025</w:t>
+              <w:t>15 Dec</w:t>
             </w:r>
           </w:p>
         </w:tc>
@@ -1505,9 +1751,11 @@
             <w:tcW w:type="dxa" w:w="2354"/>
           </w:tcPr>
           <w:p>
+            <w:pPr>
+              <w:spacing w:after="0" w:line="276" w:lineRule="auto"/>
+            </w:pPr>
             <w:r>
               <w:rPr>
-                <w:rFonts w:ascii="Times New Roman" w:hAnsi="Times New Roman"/>
                 <w:sz w:val="18"/>
               </w:rPr>
               <w:t>Mid-Point Review</w:t>
@@ -1519,12 +1767,14 @@
             <w:tcW w:type="dxa" w:w="2354"/>
           </w:tcPr>
           <w:p>
+            <w:pPr>
+              <w:spacing w:after="0" w:line="276" w:lineRule="auto"/>
+            </w:pPr>
             <w:r>
               <w:rPr>
-                <w:rFonts w:ascii="Times New Roman" w:hAnsi="Times New Roman"/>
                 <w:sz w:val="18"/>
               </w:rPr>
-              <w:t>Comprehensive review with supervisor. Discussed 2026 objectives. Received positive feedback.</w:t>
+              <w:t>Comprehensive supervisor review. All research completed. Discussed 2026 objectives and progress assessment.</w:t>
             </w:r>
           </w:p>
         </w:tc>
@@ -1533,9 +1783,11 @@
             <w:tcW w:type="dxa" w:w="2354"/>
           </w:tcPr>
           <w:p>
+            <w:pPr>
+              <w:spacing w:after="0" w:line="276" w:lineRule="auto"/>
+            </w:pPr>
             <w:r>
               <w:rPr>
-                <w:rFonts w:ascii="Times New Roman" w:hAnsi="Times New Roman"/>
                 <w:sz w:val="18"/>
               </w:rPr>
               <w:t>Reflective practice, communication</w:t>
@@ -1545,14 +1797,9 @@
       </w:tr>
     </w:tbl>
     <w:p>
-      <w:r>
-        <w:br w:type="page"/>
-      </w:r>
-    </w:p>
-    <w:p>
       <w:pPr>
+        <w:spacing w:before="120" w:after="60"/>
         <w:jc w:val="left"/>
-        <w:spacing w:line="480" w:lineRule="auto"/>
       </w:pPr>
       <w:r>
         <w:rPr>
@@ -1584,7 +1831,7 @@
             <w:r>
               <w:rPr>
                 <w:b/>
-                <w:sz w:val="22"/>
+                <w:sz w:val="20"/>
               </w:rPr>
               <w:t>Date</w:t>
             </w:r>
@@ -1598,7 +1845,7 @@
             <w:r>
               <w:rPr>
                 <w:b/>
-                <w:sz w:val="22"/>
+                <w:sz w:val="20"/>
               </w:rPr>
               <w:t>Activity/Task</w:t>
             </w:r>
@@ -1612,7 +1859,7 @@
             <w:r>
               <w:rPr>
                 <w:b/>
-                <w:sz w:val="22"/>
+                <w:sz w:val="20"/>
               </w:rPr>
               <w:t>Details &amp; Findings</w:t>
             </w:r>
@@ -1626,7 +1873,7 @@
             <w:r>
               <w:rPr>
                 <w:b/>
-                <w:sz w:val="22"/>
+                <w:sz w:val="20"/>
               </w:rPr>
               <w:t>Skills Developed</w:t>
             </w:r>
@@ -1639,12 +1886,14 @@
             <w:tcW w:type="dxa" w:w="2354"/>
           </w:tcPr>
           <w:p>
+            <w:pPr>
+              <w:spacing w:after="0" w:line="276" w:lineRule="auto"/>
+            </w:pPr>
             <w:r>
               <w:rPr>
-                <w:rFonts w:ascii="Times New Roman" w:hAnsi="Times New Roman"/>
                 <w:sz w:val="18"/>
               </w:rPr>
-              <w:t>5-31 Jan 2026</w:t>
+              <w:t>5-31 Jan</w:t>
             </w:r>
           </w:p>
         </w:tc>
@@ -1653,12 +1902,14 @@
             <w:tcW w:type="dxa" w:w="2354"/>
           </w:tcPr>
           <w:p>
+            <w:pPr>
+              <w:spacing w:after="0" w:line="276" w:lineRule="auto"/>
+            </w:pPr>
             <w:r>
               <w:rPr>
-                <w:rFonts w:ascii="Times New Roman" w:hAnsi="Times New Roman"/>
                 <w:sz w:val="18"/>
               </w:rPr>
-              <w:t>Payment Reconciliation Development</w:t>
+              <w:t>Reconciliation Development</w:t>
             </w:r>
           </w:p>
         </w:tc>
@@ -1667,12 +1918,14 @@
             <w:tcW w:type="dxa" w:w="2354"/>
           </w:tcPr>
           <w:p>
+            <w:pPr>
+              <w:spacing w:after="0" w:line="276" w:lineRule="auto"/>
+            </w:pPr>
             <w:r>
               <w:rPr>
-                <w:rFonts w:ascii="Times New Roman" w:hAnsi="Times New Roman"/>
                 <w:sz w:val="18"/>
               </w:rPr>
-              <w:t>Intensive development. Implemented all components. System processes 50,000 daily transactions, 99.8% uptime.</w:t>
+              <w:t>Intensive development phase. Implemented all system components. Achieved 50,000 daily transactions, 99.8% uptime. Comprehensive testing.</w:t>
             </w:r>
           </w:p>
         </w:tc>
@@ -1681,12 +1934,14 @@
             <w:tcW w:type="dxa" w:w="2354"/>
           </w:tcPr>
           <w:p>
+            <w:pPr>
+              <w:spacing w:after="0" w:line="276" w:lineRule="auto"/>
+            </w:pPr>
             <w:r>
               <w:rPr>
-                <w:rFonts w:ascii="Times New Roman" w:hAnsi="Times New Roman"/>
                 <w:sz w:val="18"/>
               </w:rPr>
-              <w:t>Backend development, testing, optimization, AWS</w:t>
+              <w:t>Backend dev, testing, AWS optimization</w:t>
             </w:r>
           </w:p>
         </w:tc>
@@ -1697,12 +1952,14 @@
             <w:tcW w:type="dxa" w:w="2354"/>
           </w:tcPr>
           <w:p>
+            <w:pPr>
+              <w:spacing w:after="0" w:line="276" w:lineRule="auto"/>
+            </w:pPr>
             <w:r>
               <w:rPr>
-                <w:rFonts w:ascii="Times New Roman" w:hAnsi="Times New Roman"/>
                 <w:sz w:val="18"/>
               </w:rPr>
-              <w:t>15 Jan 2026</w:t>
+              <w:t>15 Jan</w:t>
             </w:r>
           </w:p>
         </w:tc>
@@ -1711,9 +1968,11 @@
             <w:tcW w:type="dxa" w:w="2354"/>
           </w:tcPr>
           <w:p>
+            <w:pPr>
+              <w:spacing w:after="0" w:line="276" w:lineRule="auto"/>
+            </w:pPr>
             <w:r>
               <w:rPr>
-                <w:rFonts w:ascii="Times New Roman" w:hAnsi="Times New Roman"/>
                 <w:sz w:val="18"/>
               </w:rPr>
               <w:t>Analytics Dashboard Kickoff</w:t>
@@ -1725,12 +1984,14 @@
             <w:tcW w:type="dxa" w:w="2354"/>
           </w:tcPr>
           <w:p>
+            <w:pPr>
+              <w:spacing w:after="0" w:line="276" w:lineRule="auto"/>
+            </w:pPr>
             <w:r>
               <w:rPr>
-                <w:rFonts w:ascii="Times New Roman" w:hAnsi="Times New Roman"/>
                 <w:sz w:val="18"/>
               </w:rPr>
-              <w:t>Gathered requirements. Designed React frontend and Python backend with PostgreSQL and Redis caching.</w:t>
+              <w:t>Gathered requirements from operations, risk, executives. Designed React frontend. Planned Python backend with PostgreSQL/Redis caching.</w:t>
             </w:r>
           </w:p>
         </w:tc>
@@ -1739,26 +2000,23 @@
             <w:tcW w:type="dxa" w:w="2354"/>
           </w:tcPr>
           <w:p>
+            <w:pPr>
+              <w:spacing w:after="0" w:line="276" w:lineRule="auto"/>
+            </w:pPr>
             <w:r>
               <w:rPr>
-                <w:rFonts w:ascii="Times New Roman" w:hAnsi="Times New Roman"/>
                 <w:sz w:val="18"/>
               </w:rPr>
-              <w:t>Requirements gathering, frontend design, architecture</w:t>
+              <w:t>Requirements gathering, frontend/backend design</w:t>
             </w:r>
           </w:p>
         </w:tc>
       </w:tr>
     </w:tbl>
     <w:p>
-      <w:r>
-        <w:br w:type="page"/>
-      </w:r>
-    </w:p>
-    <w:p>
       <w:pPr>
+        <w:spacing w:before="120" w:after="60"/>
         <w:jc w:val="left"/>
-        <w:spacing w:line="480" w:lineRule="auto"/>
       </w:pPr>
       <w:r>
         <w:rPr>
@@ -1790,7 +2048,7 @@
             <w:r>
               <w:rPr>
                 <w:b/>
-                <w:sz w:val="22"/>
+                <w:sz w:val="20"/>
               </w:rPr>
               <w:t>Date</w:t>
             </w:r>
@@ -1804,7 +2062,7 @@
             <w:r>
               <w:rPr>
                 <w:b/>
-                <w:sz w:val="22"/>
+                <w:sz w:val="20"/>
               </w:rPr>
               <w:t>Activity/Task</w:t>
             </w:r>
@@ -1818,7 +2076,7 @@
             <w:r>
               <w:rPr>
                 <w:b/>
-                <w:sz w:val="22"/>
+                <w:sz w:val="20"/>
               </w:rPr>
               <w:t>Details &amp; Findings</w:t>
             </w:r>
@@ -1832,7 +2090,7 @@
             <w:r>
               <w:rPr>
                 <w:b/>
-                <w:sz w:val="22"/>
+                <w:sz w:val="20"/>
               </w:rPr>
               <w:t>Skills Developed</w:t>
             </w:r>
@@ -1845,12 +2103,14 @@
             <w:tcW w:type="dxa" w:w="2354"/>
           </w:tcPr>
           <w:p>
+            <w:pPr>
+              <w:spacing w:after="0" w:line="276" w:lineRule="auto"/>
+            </w:pPr>
             <w:r>
               <w:rPr>
-                <w:rFonts w:ascii="Times New Roman" w:hAnsi="Times New Roman"/>
                 <w:sz w:val="18"/>
               </w:rPr>
-              <w:t>2-28 Feb 2026</w:t>
+              <w:t>2-28 Feb</w:t>
             </w:r>
           </w:p>
         </w:tc>
@@ -1859,12 +2119,14 @@
             <w:tcW w:type="dxa" w:w="2354"/>
           </w:tcPr>
           <w:p>
+            <w:pPr>
+              <w:spacing w:after="0" w:line="276" w:lineRule="auto"/>
+            </w:pPr>
             <w:r>
               <w:rPr>
-                <w:rFonts w:ascii="Times New Roman" w:hAnsi="Times New Roman"/>
                 <w:sz w:val="18"/>
               </w:rPr>
-              <w:t>Dashboard &amp; ETL Development</w:t>
+              <w:t>Dashboard &amp; ETL Pipeline</w:t>
             </w:r>
           </w:p>
         </w:tc>
@@ -1873,12 +2135,14 @@
             <w:tcW w:type="dxa" w:w="2354"/>
           </w:tcPr>
           <w:p>
+            <w:pPr>
+              <w:spacing w:after="0" w:line="276" w:lineRule="auto"/>
+            </w:pPr>
             <w:r>
               <w:rPr>
-                <w:rFonts w:ascii="Times New Roman" w:hAnsi="Times New Roman"/>
                 <w:sz w:val="18"/>
               </w:rPr>
-              <w:t>Developed analytics dashboard and ETL pipeline. Dashboard revealed: peak activity 6-9am/5-8pm, 87% repayment rate, 40% lower organic acquisition cost.</w:t>
+              <w:t>Developed analytics dashboard with real-time KPI monitoring. Built ETL pipeline consolidating multi-source data. Apache Airflow orchestration for hourly updates. Dashboard revealed key insights: peak activity 6-9am/5-8pm, 87% repayment rate, 40% lower organic acquisition cost, 65% Harare/Bulawayo concentration.</w:t>
             </w:r>
           </w:p>
         </w:tc>
@@ -1887,26 +2151,23 @@
             <w:tcW w:type="dxa" w:w="2354"/>
           </w:tcPr>
           <w:p>
+            <w:pPr>
+              <w:spacing w:after="0" w:line="276" w:lineRule="auto"/>
+            </w:pPr>
             <w:r>
               <w:rPr>
-                <w:rFonts w:ascii="Times New Roman" w:hAnsi="Times New Roman"/>
                 <w:sz w:val="18"/>
               </w:rPr>
-              <w:t>ETL design, Apache Airflow, data pipeline, dashboard UX</w:t>
+              <w:t>ETL design, Apache Airflow, data pipeline architecture</w:t>
             </w:r>
           </w:p>
         </w:tc>
       </w:tr>
     </w:tbl>
     <w:p>
-      <w:r>
-        <w:br w:type="page"/>
-      </w:r>
-    </w:p>
-    <w:p>
       <w:pPr>
+        <w:spacing w:before="120" w:after="60"/>
         <w:jc w:val="left"/>
-        <w:spacing w:line="480" w:lineRule="auto"/>
       </w:pPr>
       <w:r>
         <w:rPr>
@@ -1938,7 +2199,7 @@
             <w:r>
               <w:rPr>
                 <w:b/>
-                <w:sz w:val="22"/>
+                <w:sz w:val="20"/>
               </w:rPr>
               <w:t>Date</w:t>
             </w:r>
@@ -1952,7 +2213,7 @@
             <w:r>
               <w:rPr>
                 <w:b/>
-                <w:sz w:val="22"/>
+                <w:sz w:val="20"/>
               </w:rPr>
               <w:t>Activity/Task</w:t>
             </w:r>
@@ -1966,7 +2227,7 @@
             <w:r>
               <w:rPr>
                 <w:b/>
-                <w:sz w:val="22"/>
+                <w:sz w:val="20"/>
               </w:rPr>
               <w:t>Details &amp; Findings</w:t>
             </w:r>
@@ -1980,7 +2241,7 @@
             <w:r>
               <w:rPr>
                 <w:b/>
-                <w:sz w:val="22"/>
+                <w:sz w:val="20"/>
               </w:rPr>
               <w:t>Skills Developed</w:t>
             </w:r>
@@ -1993,12 +2254,14 @@
             <w:tcW w:type="dxa" w:w="2354"/>
           </w:tcPr>
           <w:p>
+            <w:pPr>
+              <w:spacing w:after="0" w:line="276" w:lineRule="auto"/>
+            </w:pPr>
             <w:r>
               <w:rPr>
-                <w:rFonts w:ascii="Times New Roman" w:hAnsi="Times New Roman"/>
                 <w:sz w:val="18"/>
               </w:rPr>
-              <w:t>2-31 Mar 2026</w:t>
+              <w:t>2-31 Mar</w:t>
             </w:r>
           </w:p>
         </w:tc>
@@ -2007,9 +2270,11 @@
             <w:tcW w:type="dxa" w:w="2354"/>
           </w:tcPr>
           <w:p>
+            <w:pPr>
+              <w:spacing w:after="0" w:line="276" w:lineRule="auto"/>
+            </w:pPr>
             <w:r>
               <w:rPr>
-                <w:rFonts w:ascii="Times New Roman" w:hAnsi="Times New Roman"/>
                 <w:sz w:val="18"/>
               </w:rPr>
               <w:t>Testing &amp; Optimization</w:t>
@@ -2021,12 +2286,14 @@
             <w:tcW w:type="dxa" w:w="2354"/>
           </w:tcPr>
           <w:p>
+            <w:pPr>
+              <w:spacing w:after="0" w:line="276" w:lineRule="auto"/>
+            </w:pPr>
             <w:r>
               <w:rPr>
-                <w:rFonts w:ascii="Times New Roman" w:hAnsi="Times New Roman"/>
                 <w:sz w:val="18"/>
               </w:rPr>
-              <w:t>Enhanced test coverage. Fixed bugs. Optimized database queries. Enhanced monitoring.</w:t>
+              <w:t>Enhanced test coverage across all systems. Fixed bugs including WhatsApp display handling, test session initialization, credential management. Optimized database queries. Enhanced CloudWatch monitoring.</w:t>
             </w:r>
           </w:p>
         </w:tc>
@@ -2035,9 +2302,11 @@
             <w:tcW w:type="dxa" w:w="2354"/>
           </w:tcPr>
           <w:p>
+            <w:pPr>
+              <w:spacing w:after="0" w:line="276" w:lineRule="auto"/>
+            </w:pPr>
             <w:r>
               <w:rPr>
-                <w:rFonts w:ascii="Times New Roman" w:hAnsi="Times New Roman"/>
                 <w:sz w:val="18"/>
               </w:rPr>
               <w:t>Testing methodology, debugging, performance optimization</w:t>
@@ -2051,12 +2320,14 @@
             <w:tcW w:type="dxa" w:w="2354"/>
           </w:tcPr>
           <w:p>
+            <w:pPr>
+              <w:spacing w:after="0" w:line="276" w:lineRule="auto"/>
+            </w:pPr>
             <w:r>
               <w:rPr>
-                <w:rFonts w:ascii="Times New Roman" w:hAnsi="Times New Roman"/>
                 <w:sz w:val="18"/>
               </w:rPr>
-              <w:t>1-30 Apr 2026</w:t>
+              <w:t>1-30 Apr</w:t>
             </w:r>
           </w:p>
         </w:tc>
@@ -2065,12 +2336,14 @@
             <w:tcW w:type="dxa" w:w="2354"/>
           </w:tcPr>
           <w:p>
+            <w:pPr>
+              <w:spacing w:after="0" w:line="276" w:lineRule="auto"/>
+            </w:pPr>
             <w:r>
               <w:rPr>
-                <w:rFonts w:ascii="Times New Roman" w:hAnsi="Times New Roman"/>
                 <w:sz w:val="18"/>
               </w:rPr>
-              <w:t>System Hardening &amp; Deployment</w:t>
+              <w:t>System Hardening &amp; Deploy</w:t>
             </w:r>
           </w:p>
         </w:tc>
@@ -2079,12 +2352,14 @@
             <w:tcW w:type="dxa" w:w="2354"/>
           </w:tcPr>
           <w:p>
+            <w:pPr>
+              <w:spacing w:after="0" w:line="276" w:lineRule="auto"/>
+            </w:pPr>
             <w:r>
               <w:rPr>
-                <w:rFonts w:ascii="Times New Roman" w:hAnsi="Times New Roman"/>
                 <w:sz w:val="18"/>
               </w:rPr>
-              <w:t>Refactored CI/CD, implemented security, conducted compliance verification. Deployed to production with zero incidents.</w:t>
+              <w:t>Refactored CI/CD pipeline removing GitHub secrets. Implemented AWS Secrets Manager. Security audits and compliance verification. Operationalized runbooks. Deployed to production with zero critical incidents.</w:t>
             </w:r>
           </w:p>
         </w:tc>
@@ -2093,9 +2368,11 @@
             <w:tcW w:type="dxa" w:w="2354"/>
           </w:tcPr>
           <w:p>
+            <w:pPr>
+              <w:spacing w:after="0" w:line="276" w:lineRule="auto"/>
+            </w:pPr>
             <w:r>
               <w:rPr>
-                <w:rFonts w:ascii="Times New Roman" w:hAnsi="Times New Roman"/>
                 <w:sz w:val="18"/>
               </w:rPr>
               <w:t>CI/CD optimization, security hardening, compliance</w:t>
@@ -2109,12 +2386,14 @@
             <w:tcW w:type="dxa" w:w="2354"/>
           </w:tcPr>
           <w:p>
+            <w:pPr>
+              <w:spacing w:after="0" w:line="276" w:lineRule="auto"/>
+            </w:pPr>
             <w:r>
               <w:rPr>
-                <w:rFonts w:ascii="Times New Roman" w:hAnsi="Times New Roman"/>
                 <w:sz w:val="18"/>
               </w:rPr>
-              <w:t>1-7 May 2026</w:t>
+              <w:t>1-7 May</w:t>
             </w:r>
           </w:p>
         </w:tc>
@@ -2123,9 +2402,11 @@
             <w:tcW w:type="dxa" w:w="2354"/>
           </w:tcPr>
           <w:p>
+            <w:pPr>
+              <w:spacing w:after="0" w:line="276" w:lineRule="auto"/>
+            </w:pPr>
             <w:r>
               <w:rPr>
-                <w:rFonts w:ascii="Times New Roman" w:hAnsi="Times New Roman"/>
                 <w:sz w:val="18"/>
               </w:rPr>
               <w:t>Completion &amp; Documentation</w:t>
@@ -2137,12 +2418,14 @@
             <w:tcW w:type="dxa" w:w="2354"/>
           </w:tcPr>
           <w:p>
+            <w:pPr>
+              <w:spacing w:after="0" w:line="276" w:lineRule="auto"/>
+            </w:pPr>
             <w:r>
               <w:rPr>
-                <w:rFonts w:ascii="Times New Roman" w:hAnsi="Times New Roman"/>
                 <w:sz w:val="18"/>
               </w:rPr>
-              <w:t>Completed all documentation. Conducted knowledge transfer. Concluded attachment successfully.</w:t>
+              <w:t>Completed all documentation. Conducted knowledge transfer sessions with operations and engineering teams. Prepared final reports. Reflected on overall experience.</w:t>
             </w:r>
           </w:p>
         </w:tc>
@@ -2151,26 +2434,23 @@
             <w:tcW w:type="dxa" w:w="2354"/>
           </w:tcPr>
           <w:p>
+            <w:pPr>
+              <w:spacing w:after="0" w:line="276" w:lineRule="auto"/>
+            </w:pPr>
             <w:r>
               <w:rPr>
-                <w:rFonts w:ascii="Times New Roman" w:hAnsi="Times New Roman"/>
                 <w:sz w:val="18"/>
               </w:rPr>
-              <w:t>Documentation, knowledge transfer, reflection</w:t>
+              <w:t>Documentation, knowledge transfer, professional closure</w:t>
             </w:r>
           </w:p>
         </w:tc>
       </w:tr>
     </w:tbl>
     <w:p>
-      <w:r>
-        <w:br w:type="page"/>
-      </w:r>
-    </w:p>
-    <w:p>
       <w:pPr>
+        <w:spacing w:before="120" w:after="60"/>
         <w:jc w:val="left"/>
-        <w:spacing w:line="480" w:lineRule="auto"/>
       </w:pPr>
       <w:r>
         <w:rPr>
@@ -2183,8 +2463,8 @@
     </w:p>
     <w:p>
       <w:pPr>
+        <w:spacing w:before="120" w:after="60"/>
         <w:jc w:val="left"/>
-        <w:spacing w:line="480" w:lineRule="auto"/>
       </w:pPr>
       <w:r>
         <w:rPr>
@@ -2216,6 +2496,7 @@
             <w:r>
               <w:rPr>
                 <w:b/>
+                <w:sz w:val="20"/>
               </w:rPr>
               <w:t>Organization</w:t>
             </w:r>
@@ -2229,6 +2510,7 @@
             <w:r>
               <w:rPr>
                 <w:b/>
+                <w:sz w:val="20"/>
               </w:rPr>
               <w:t>Date</w:t>
             </w:r>
@@ -2242,6 +2524,7 @@
             <w:r>
               <w:rPr>
                 <w:b/>
+                <w:sz w:val="20"/>
               </w:rPr>
               <w:t>Duration</w:t>
             </w:r>
@@ -2255,6 +2538,7 @@
             <w:r>
               <w:rPr>
                 <w:b/>
+                <w:sz w:val="20"/>
               </w:rPr>
               <w:t>Key Findings</w:t>
             </w:r>
@@ -2267,6 +2551,9 @@
             <w:tcW w:type="dxa" w:w="2354"/>
           </w:tcPr>
           <w:p>
+            <w:pPr>
+              <w:spacing w:after="0"/>
+            </w:pPr>
             <w:r>
               <w:t>EcoCash</w:t>
             </w:r>
@@ -2277,6 +2564,9 @@
             <w:tcW w:type="dxa" w:w="2354"/>
           </w:tcPr>
           <w:p>
+            <w:pPr>
+              <w:spacing w:after="0"/>
+            </w:pPr>
             <w:r>
               <w:t>8 Oct 2025</w:t>
             </w:r>
@@ -2287,6 +2577,9 @@
             <w:tcW w:type="dxa" w:w="2354"/>
           </w:tcPr>
           <w:p>
+            <w:pPr>
+              <w:spacing w:after="0"/>
+            </w:pPr>
             <w:r>
               <w:t>2 hours</w:t>
             </w:r>
@@ -2297,8 +2590,11 @@
             <w:tcW w:type="dxa" w:w="2354"/>
           </w:tcPr>
           <w:p>
+            <w:pPr>
+              <w:spacing w:after="0"/>
+            </w:pPr>
             <w:r>
-              <w:t>Java/Spring, PostgreSQL, 94-97% success, async processing</w:t>
+              <w:t>Java/Spring, PostgreSQL, 94-97% success rates, 2-5% fees, async processing</w:t>
             </w:r>
           </w:p>
         </w:tc>
@@ -2309,6 +2605,9 @@
             <w:tcW w:type="dxa" w:w="2354"/>
           </w:tcPr>
           <w:p>
+            <w:pPr>
+              <w:spacing w:after="0"/>
+            </w:pPr>
             <w:r>
               <w:t>InnBucks</w:t>
             </w:r>
@@ -2319,6 +2618,9 @@
             <w:tcW w:type="dxa" w:w="2354"/>
           </w:tcPr>
           <w:p>
+            <w:pPr>
+              <w:spacing w:after="0"/>
+            </w:pPr>
             <w:r>
               <w:t>15 Oct 2025</w:t>
             </w:r>
@@ -2329,6 +2631,9 @@
             <w:tcW w:type="dxa" w:w="2354"/>
           </w:tcPr>
           <w:p>
+            <w:pPr>
+              <w:spacing w:after="0"/>
+            </w:pPr>
             <w:r>
               <w:t>1.5 hours</w:t>
             </w:r>
@@ -2339,8 +2644,11 @@
             <w:tcW w:type="dxa" w:w="2354"/>
           </w:tcPr>
           <w:p>
+            <w:pPr>
+              <w:spacing w:after="0"/>
+            </w:pPr>
             <w:r>
-              <w:t>Node.js, OAuth 2.0, 91-93% success, webhooks</w:t>
+              <w:t>Node.js, OAuth 2.0, 91-93% success rates, 100 req/min limit, webhooks</w:t>
             </w:r>
           </w:p>
         </w:tc>
@@ -2351,6 +2659,9 @@
             <w:tcW w:type="dxa" w:w="2354"/>
           </w:tcPr>
           <w:p>
+            <w:pPr>
+              <w:spacing w:after="0"/>
+            </w:pPr>
             <w:r>
               <w:t>Omari</w:t>
             </w:r>
@@ -2361,6 +2672,9 @@
             <w:tcW w:type="dxa" w:w="2354"/>
           </w:tcPr>
           <w:p>
+            <w:pPr>
+              <w:spacing w:after="0"/>
+            </w:pPr>
             <w:r>
               <w:t>5 Nov 2025</w:t>
             </w:r>
@@ -2371,6 +2685,9 @@
             <w:tcW w:type="dxa" w:w="2354"/>
           </w:tcPr>
           <w:p>
+            <w:pPr>
+              <w:spacing w:after="0"/>
+            </w:pPr>
             <w:r>
               <w:t>2 hours</w:t>
             </w:r>
@@ -2381,8 +2698,11 @@
             <w:tcW w:type="dxa" w:w="2354"/>
           </w:tcPr>
           <w:p>
+            <w:pPr>
+              <w:spacing w:after="0"/>
+            </w:pPr>
             <w:r>
-              <w:t>ML scoring, 85%+ repayment, WhatsApp strategy</w:t>
+              <w:t>ML credit scoring, 85%+ repayment rates, WhatsApp acquisition strategy</w:t>
             </w:r>
           </w:p>
         </w:tc>
@@ -2393,6 +2713,9 @@
             <w:tcW w:type="dxa" w:w="2354"/>
           </w:tcPr>
           <w:p>
+            <w:pPr>
+              <w:spacing w:after="0"/>
+            </w:pPr>
             <w:r>
               <w:t>SSB</w:t>
             </w:r>
@@ -2403,6 +2726,9 @@
             <w:tcW w:type="dxa" w:w="2354"/>
           </w:tcPr>
           <w:p>
+            <w:pPr>
+              <w:spacing w:after="0"/>
+            </w:pPr>
             <w:r>
               <w:t>12 Nov 2025</w:t>
             </w:r>
@@ -2413,6 +2739,9 @@
             <w:tcW w:type="dxa" w:w="2354"/>
           </w:tcPr>
           <w:p>
+            <w:pPr>
+              <w:spacing w:after="0"/>
+            </w:pPr>
             <w:r>
               <w:t>2.5 hours</w:t>
             </w:r>
@@ -2423,18 +2752,20 @@
             <w:tcW w:type="dxa" w:w="2354"/>
           </w:tcPr>
           <w:p>
+            <w:pPr>
+              <w:spacing w:after="0"/>
+            </w:pPr>
             <w:r>
-              <w:t>Salary-linked, 300k+ market, near-zero defaults</w:t>
+              <w:t>Salary-linked lending, 300k+ market, near-zero default rates</w:t>
             </w:r>
           </w:p>
         </w:tc>
       </w:tr>
     </w:tbl>
-    <w:p/>
     <w:p>
       <w:pPr>
+        <w:spacing w:before="120" w:after="60"/>
         <w:jc w:val="left"/>
-        <w:spacing w:line="480" w:lineRule="auto"/>
       </w:pPr>
       <w:r>
         <w:rPr>
@@ -2466,6 +2797,7 @@
             <w:r>
               <w:rPr>
                 <w:b/>
+                <w:sz w:val="20"/>
               </w:rPr>
               <w:t>Project</w:t>
             </w:r>
@@ -2479,6 +2811,7 @@
             <w:r>
               <w:rPr>
                 <w:b/>
+                <w:sz w:val="20"/>
               </w:rPr>
               <w:t>Timeline</w:t>
             </w:r>
@@ -2492,6 +2825,7 @@
             <w:r>
               <w:rPr>
                 <w:b/>
+                <w:sz w:val="20"/>
               </w:rPr>
               <w:t>Technology</w:t>
             </w:r>
@@ -2505,6 +2839,7 @@
             <w:r>
               <w:rPr>
                 <w:b/>
+                <w:sz w:val="20"/>
               </w:rPr>
               <w:t>Status</w:t>
             </w:r>
@@ -2517,6 +2852,9 @@
             <w:tcW w:type="dxa" w:w="2354"/>
           </w:tcPr>
           <w:p>
+            <w:pPr>
+              <w:spacing w:after="0"/>
+            </w:pPr>
             <w:r>
               <w:t>Payment Reconciliation</w:t>
             </w:r>
@@ -2527,6 +2865,9 @@
             <w:tcW w:type="dxa" w:w="2354"/>
           </w:tcPr>
           <w:p>
+            <w:pPr>
+              <w:spacing w:after="0"/>
+            </w:pPr>
             <w:r>
               <w:t>Dec 2025 - Jan 2026</w:t>
             </w:r>
@@ -2537,8 +2878,11 @@
             <w:tcW w:type="dxa" w:w="2354"/>
           </w:tcPr>
           <w:p>
+            <w:pPr>
+              <w:spacing w:after="0"/>
+            </w:pPr>
             <w:r>
-              <w:t>AWS Lambda/SQS, PostgreSQL, Node.js/TS</w:t>
+              <w:t>AWS Lambda/SQS, PostgreSQL, Node.js/TypeScript</w:t>
             </w:r>
           </w:p>
         </w:tc>
@@ -2547,6 +2891,9 @@
             <w:tcW w:type="dxa" w:w="2354"/>
           </w:tcPr>
           <w:p>
+            <w:pPr>
+              <w:spacing w:after="0"/>
+            </w:pPr>
             <w:r>
               <w:t>Production - 99.8% uptime</w:t>
             </w:r>
@@ -2559,6 +2906,9 @@
             <w:tcW w:type="dxa" w:w="2354"/>
           </w:tcPr>
           <w:p>
+            <w:pPr>
+              <w:spacing w:after="0"/>
+            </w:pPr>
             <w:r>
               <w:t>Analytics Dashboard</w:t>
             </w:r>
@@ -2569,8 +2919,11 @@
             <w:tcW w:type="dxa" w:w="2354"/>
           </w:tcPr>
           <w:p>
+            <w:pPr>
+              <w:spacing w:after="0"/>
+            </w:pPr>
             <w:r>
-              <w:t>Jan 2026 - Feb 2026</w:t>
+              <w:t>Jan - Feb 2026</w:t>
             </w:r>
           </w:p>
         </w:tc>
@@ -2579,6 +2932,9 @@
             <w:tcW w:type="dxa" w:w="2354"/>
           </w:tcPr>
           <w:p>
+            <w:pPr>
+              <w:spacing w:after="0"/>
+            </w:pPr>
             <w:r>
               <w:t>React.js, Python, PostgreSQL, Redis</w:t>
             </w:r>
@@ -2589,6 +2945,9 @@
             <w:tcW w:type="dxa" w:w="2354"/>
           </w:tcPr>
           <w:p>
+            <w:pPr>
+              <w:spacing w:after="0"/>
+            </w:pPr>
             <w:r>
               <w:t>Production - Real-time BI</w:t>
             </w:r>
@@ -2601,6 +2960,9 @@
             <w:tcW w:type="dxa" w:w="2354"/>
           </w:tcPr>
           <w:p>
+            <w:pPr>
+              <w:spacing w:after="0"/>
+            </w:pPr>
             <w:r>
               <w:t>Data Integration &amp; ETL</w:t>
             </w:r>
@@ -2611,8 +2973,11 @@
             <w:tcW w:type="dxa" w:w="2354"/>
           </w:tcPr>
           <w:p>
+            <w:pPr>
+              <w:spacing w:after="0"/>
+            </w:pPr>
             <w:r>
-              <w:t>Jan 2026 - Feb 2026</w:t>
+              <w:t>Jan - Feb 2026</w:t>
             </w:r>
           </w:p>
         </w:tc>
@@ -2621,6 +2986,9 @@
             <w:tcW w:type="dxa" w:w="2354"/>
           </w:tcPr>
           <w:p>
+            <w:pPr>
+              <w:spacing w:after="0"/>
+            </w:pPr>
             <w:r>
               <w:t>Apache Airflow, Python, PostgreSQL</w:t>
             </w:r>
@@ -2631,6 +2999,9 @@
             <w:tcW w:type="dxa" w:w="2354"/>
           </w:tcPr>
           <w:p>
+            <w:pPr>
+              <w:spacing w:after="0"/>
+            </w:pPr>
             <w:r>
               <w:t>Production - 99.8% uptime</w:t>
             </w:r>
@@ -2643,6 +3014,9 @@
             <w:tcW w:type="dxa" w:w="2354"/>
           </w:tcPr>
           <w:p>
+            <w:pPr>
+              <w:spacing w:after="0"/>
+            </w:pPr>
             <w:r>
               <w:t>WhatsApp Integration</w:t>
             </w:r>
@@ -2653,6 +3027,9 @@
             <w:tcW w:type="dxa" w:w="2354"/>
           </w:tcPr>
           <w:p>
+            <w:pPr>
+              <w:spacing w:after="0"/>
+            </w:pPr>
             <w:r>
               <w:t>Dec 2025 - Apr 2026</w:t>
             </w:r>
@@ -2663,8 +3040,11 @@
             <w:tcW w:type="dxa" w:w="2354"/>
           </w:tcPr>
           <w:p>
+            <w:pPr>
+              <w:spacing w:after="0"/>
+            </w:pPr>
             <w:r>
-              <w:t>WhatsApp API, AWS Secrets Manager</w:t>
+              <w:t>WhatsApp Business API, AWS Secrets Manager</w:t>
             </w:r>
           </w:p>
         </w:tc>
@@ -2673,6 +3053,9 @@
             <w:tcW w:type="dxa" w:w="2354"/>
           </w:tcPr>
           <w:p>
+            <w:pPr>
+              <w:spacing w:after="0"/>
+            </w:pPr>
             <w:r>
               <w:t>Production - Live</w:t>
             </w:r>
@@ -2681,14 +3064,9 @@
       </w:tr>
     </w:tbl>
     <w:p>
-      <w:r>
-        <w:br w:type="page"/>
-      </w:r>
-    </w:p>
-    <w:p>
       <w:pPr>
+        <w:spacing w:before="120" w:after="60"/>
         <w:jc w:val="left"/>
-        <w:spacing w:line="480" w:lineRule="auto"/>
       </w:pPr>
       <w:r>
         <w:rPr>
@@ -2701,15 +3079,15 @@
     </w:p>
     <w:p>
       <w:pPr>
-        <w:spacing w:after="0" w:line="480" w:lineRule="auto"/>
+        <w:spacing w:after="60" w:line="360" w:lineRule="auto"/>
         <w:jc w:val="both"/>
       </w:pPr>
       <w:r>
         <w:rPr>
           <w:rFonts w:ascii="Times New Roman" w:hAnsi="Times New Roman"/>
-          <w:sz w:val="24"/>
+          <w:sz w:val="22"/>
         </w:rPr>
-        <w:t>The industrial attachment logbook documents a comprehensive 7-month engagement at Lynia Finance (October 1, 2025 - May 7, 2026). Four major physical research meetings were conducted documenting Zimbabwe's payment and lending landscape. Four substantial technical projects were implemented in production: Payment Reconciliation System (50,000 daily transactions, 99.8% uptime), Analytics Dashboard (real-time KPI monitoring), Data Integration &amp; ETL Pipeline (hourly updates), and WhatsApp Business Integration (live connection with secure credentials). The attachment provided invaluable practical experience in fintech operations, system design, data engineering, and business intelligence. Technical skills substantially exceeded academic training, representing genuine professional expertise. The experience profoundly shaped career trajectory toward fintech and data analytics with clear understanding of financial inclusion's importance.</w:t>
+        <w:t>This logbook documents a comprehensive 7-month industrial attachment at Lynia Finance, from October 1, 2025 through May 7, 2026. Four major physical research meetings were conducted at partner financial institutions, documenting Zimbabwe's payment and lending landscape. Four substantial technical projects were implemented in production serving actual business needs. The attachment provided invaluable practical experience in fintech operations, system design, data engineering, and business intelligence. Technical skills substantially exceeded academic training, representing genuine professional expertise. The experience profoundly shaped career trajectory toward fintech and data analytics with clear understanding of financial inclusion's importance in emerging markets.</w:t>
       </w:r>
     </w:p>
     <w:sectPr>

</xml_diff>

<commit_message>
Remove all color styles - convert documents to pure black and white
</commit_message>
<xml_diff>
--- a/Industrial_Attachment_Logbook_October2025_May2026.docx
+++ b/Industrial_Attachment_Logbook_October2025_May2026.docx
@@ -134,6 +134,7 @@
               <w:rPr>
                 <w:rFonts w:ascii="Times New Roman" w:hAnsi="Times New Roman"/>
                 <w:b/>
+                <w:color w:val="000000"/>
                 <w:sz w:val="20"/>
               </w:rPr>
               <w:t>Date</w:t>
@@ -152,6 +153,7 @@
               <w:rPr>
                 <w:rFonts w:ascii="Times New Roman" w:hAnsi="Times New Roman"/>
                 <w:b/>
+                <w:color w:val="000000"/>
                 <w:sz w:val="20"/>
               </w:rPr>
               <w:t>Activity/Task</w:t>
@@ -170,6 +172,7 @@
               <w:rPr>
                 <w:rFonts w:ascii="Times New Roman" w:hAnsi="Times New Roman"/>
                 <w:b/>
+                <w:color w:val="000000"/>
                 <w:sz w:val="20"/>
               </w:rPr>
               <w:t>Details &amp; Findings</w:t>
@@ -188,6 +191,7 @@
               <w:rPr>
                 <w:rFonts w:ascii="Times New Roman" w:hAnsi="Times New Roman"/>
                 <w:b/>
+                <w:color w:val="000000"/>
                 <w:sz w:val="20"/>
               </w:rPr>
               <w:t>Skills Developed</w:t>
@@ -207,6 +211,7 @@
             <w:r>
               <w:rPr>
                 <w:rFonts w:ascii="Times New Roman" w:hAnsi="Times New Roman"/>
+                <w:color w:val="000000"/>
                 <w:sz w:val="18"/>
               </w:rPr>
               <w:t>1 Oct</w:t>
@@ -224,6 +229,7 @@
             <w:r>
               <w:rPr>
                 <w:rFonts w:ascii="Times New Roman" w:hAnsi="Times New Roman"/>
+                <w:color w:val="000000"/>
                 <w:sz w:val="18"/>
               </w:rPr>
               <w:t>First Day at Lynia Finance</w:t>
@@ -241,6 +247,7 @@
             <w:r>
               <w:rPr>
                 <w:rFonts w:ascii="Times New Roman" w:hAnsi="Times New Roman"/>
+                <w:color w:val="000000"/>
                 <w:sz w:val="18"/>
               </w:rPr>
               <w:t>Onboarding completion, supervisor meetings, company orientation. Learned Lynia's mission: financial inclusion for underbanked Zimbabweans. Reviewed security protocols and company culture.</w:t>
@@ -258,6 +265,7 @@
             <w:r>
               <w:rPr>
                 <w:rFonts w:ascii="Times New Roman" w:hAnsi="Times New Roman"/>
+                <w:color w:val="000000"/>
                 <w:sz w:val="18"/>
               </w:rPr>
               <w:t>Professional orientation, org awareness</w:t>
@@ -277,6 +285,7 @@
             <w:r>
               <w:rPr>
                 <w:rFonts w:ascii="Times New Roman" w:hAnsi="Times New Roman"/>
+                <w:color w:val="000000"/>
                 <w:sz w:val="18"/>
               </w:rPr>
               <w:t>2 Oct</w:t>
@@ -294,6 +303,7 @@
             <w:r>
               <w:rPr>
                 <w:rFonts w:ascii="Times New Roman" w:hAnsi="Times New Roman"/>
+                <w:color w:val="000000"/>
                 <w:sz w:val="18"/>
               </w:rPr>
               <w:t>Department Rotation</w:t>
@@ -311,6 +321,7 @@
             <w:r>
               <w:rPr>
                 <w:rFonts w:ascii="Times New Roman" w:hAnsi="Times New Roman"/>
+                <w:color w:val="000000"/>
                 <w:sz w:val="18"/>
               </w:rPr>
               <w:t>Visited Engineering, Data Analytics, Operations. Met Data Analytics team (primary supervisors). Reviewed payment architecture, API integrations, and current systems.</w:t>
@@ -328,6 +339,7 @@
             <w:r>
               <w:rPr>
                 <w:rFonts w:ascii="Times New Roman" w:hAnsi="Times New Roman"/>
+                <w:color w:val="000000"/>
                 <w:sz w:val="18"/>
               </w:rPr>
               <w:t>System understanding, team dynamics</w:t>
@@ -347,6 +359,7 @@
             <w:r>
               <w:rPr>
                 <w:rFonts w:ascii="Times New Roman" w:hAnsi="Times New Roman"/>
+                <w:color w:val="000000"/>
                 <w:sz w:val="18"/>
               </w:rPr>
               <w:t>3 Oct</w:t>
@@ -364,6 +377,7 @@
             <w:r>
               <w:rPr>
                 <w:rFonts w:ascii="Times New Roman" w:hAnsi="Times New Roman"/>
+                <w:color w:val="000000"/>
                 <w:sz w:val="18"/>
               </w:rPr>
               <w:t>Technical Briefing</w:t>
@@ -381,6 +395,7 @@
             <w:r>
               <w:rPr>
                 <w:rFonts w:ascii="Times New Roman" w:hAnsi="Times New Roman"/>
+                <w:color w:val="000000"/>
                 <w:sz w:val="18"/>
               </w:rPr>
               <w:t>AWS services overview (Lambda, RDS, S3, SQS). Reviewed EcoCash and InnBucks API documentation. Studied payment reconciliation challenges.</w:t>
@@ -398,6 +413,7 @@
             <w:r>
               <w:rPr>
                 <w:rFonts w:ascii="Times New Roman" w:hAnsi="Times New Roman"/>
+                <w:color w:val="000000"/>
                 <w:sz w:val="18"/>
               </w:rPr>
               <w:t>AWS services, API analysis, payment systems</w:t>
@@ -417,6 +433,7 @@
             <w:r>
               <w:rPr>
                 <w:rFonts w:ascii="Times New Roman" w:hAnsi="Times New Roman"/>
+                <w:color w:val="000000"/>
                 <w:sz w:val="18"/>
               </w:rPr>
               <w:t>4 Oct</w:t>
@@ -434,6 +451,7 @@
             <w:r>
               <w:rPr>
                 <w:rFonts w:ascii="Times New Roman" w:hAnsi="Times New Roman"/>
+                <w:color w:val="000000"/>
                 <w:sz w:val="18"/>
               </w:rPr>
               <w:t>Business Strategy</w:t>
@@ -451,6 +469,7 @@
             <w:r>
               <w:rPr>
                 <w:rFonts w:ascii="Times New Roman" w:hAnsi="Times New Roman"/>
+                <w:color w:val="000000"/>
                 <w:sz w:val="18"/>
               </w:rPr>
               <w:t>Management strategy session on objectives, product roadmap, regulatory requirements (RBZ). Understood fintech compliance landscape.</w:t>
@@ -468,6 +487,7 @@
             <w:r>
               <w:rPr>
                 <w:rFonts w:ascii="Times New Roman" w:hAnsi="Times New Roman"/>
+                <w:color w:val="000000"/>
                 <w:sz w:val="18"/>
               </w:rPr>
               <w:t>Business strategy, regulatory awareness</w:t>
@@ -487,6 +507,7 @@
             <w:r>
               <w:rPr>
                 <w:rFonts w:ascii="Times New Roman" w:hAnsi="Times New Roman"/>
+                <w:color w:val="000000"/>
                 <w:sz w:val="18"/>
               </w:rPr>
               <w:t>5 Oct (Fri)</w:t>
@@ -504,6 +525,7 @@
             <w:r>
               <w:rPr>
                 <w:rFonts w:ascii="Times New Roman" w:hAnsi="Times New Roman"/>
+                <w:color w:val="000000"/>
                 <w:sz w:val="18"/>
               </w:rPr>
               <w:t>Week 1 Review</w:t>
@@ -521,6 +543,7 @@
             <w:r>
               <w:rPr>
                 <w:rFonts w:ascii="Times New Roman" w:hAnsi="Times New Roman"/>
+                <w:color w:val="000000"/>
                 <w:sz w:val="18"/>
               </w:rPr>
               <w:t>Supervisor review of first week. Planned research meetings with four institutions. Established weekly meeting schedule.</w:t>
@@ -538,6 +561,7 @@
             <w:r>
               <w:rPr>
                 <w:rFonts w:ascii="Times New Roman" w:hAnsi="Times New Roman"/>
+                <w:color w:val="000000"/>
                 <w:sz w:val="18"/>
               </w:rPr>
               <w:t>Research planning, communication</w:t>
@@ -557,6 +581,7 @@
             <w:r>
               <w:rPr>
                 <w:rFonts w:ascii="Times New Roman" w:hAnsi="Times New Roman"/>
+                <w:color w:val="000000"/>
                 <w:sz w:val="18"/>
               </w:rPr>
               <w:t>6-7 Oct</w:t>
@@ -574,6 +599,7 @@
             <w:r>
               <w:rPr>
                 <w:rFonts w:ascii="Times New Roman" w:hAnsi="Times New Roman"/>
+                <w:color w:val="000000"/>
                 <w:sz w:val="18"/>
               </w:rPr>
               <w:t>EcoCash Prep</w:t>
@@ -591,6 +617,7 @@
             <w:r>
               <w:rPr>
                 <w:rFonts w:ascii="Times New Roman" w:hAnsi="Times New Roman"/>
+                <w:color w:val="000000"/>
                 <w:sz w:val="18"/>
               </w:rPr>
               <w:t>Reviewed extensive API documentation. Studied Java/Spring architecture, PostgreSQL design. Prepared detailed meeting questions. Researched competitor landscape.</w:t>
@@ -608,6 +635,7 @@
             <w:r>
               <w:rPr>
                 <w:rFonts w:ascii="Times New Roman" w:hAnsi="Times New Roman"/>
+                <w:color w:val="000000"/>
                 <w:sz w:val="18"/>
               </w:rPr>
               <w:t>API documentation, technical research</w:t>
@@ -627,6 +655,7 @@
             <w:r>
               <w:rPr>
                 <w:rFonts w:ascii="Times New Roman" w:hAnsi="Times New Roman"/>
+                <w:color w:val="000000"/>
                 <w:sz w:val="18"/>
               </w:rPr>
               <w:t>8 Oct (Wed)</w:t>
@@ -644,6 +673,7 @@
             <w:r>
               <w:rPr>
                 <w:rFonts w:ascii="Times New Roman" w:hAnsi="Times New Roman"/>
+                <w:color w:val="000000"/>
                 <w:sz w:val="18"/>
               </w:rPr>
               <w:t>ECOCASH MEETING</w:t>
@@ -661,6 +691,7 @@
             <w:r>
               <w:rPr>
                 <w:rFonts w:ascii="Times New Roman" w:hAnsi="Times New Roman"/>
+                <w:color w:val="000000"/>
                 <w:sz w:val="18"/>
               </w:rPr>
               <w:t>Econet HQ (2 hours). Learned: Java/Spring/PostgreSQL, 94-97% success rates, 2-5% fees, async processing, 24-48hr reconciliation, peak volumes 6-9am/5-8pm. Discussed retry mechanisms and error codes.</w:t>
@@ -678,6 +709,7 @@
             <w:r>
               <w:rPr>
                 <w:rFonts w:ascii="Times New Roman" w:hAnsi="Times New Roman"/>
+                <w:color w:val="000000"/>
                 <w:sz w:val="18"/>
               </w:rPr>
               <w:t>Payment architecture, negotiation</w:t>
@@ -697,6 +729,7 @@
             <w:r>
               <w:rPr>
                 <w:rFonts w:ascii="Times New Roman" w:hAnsi="Times New Roman"/>
+                <w:color w:val="000000"/>
                 <w:sz w:val="18"/>
               </w:rPr>
               <w:t>9 Oct</w:t>
@@ -714,6 +747,7 @@
             <w:r>
               <w:rPr>
                 <w:rFonts w:ascii="Times New Roman" w:hAnsi="Times New Roman"/>
+                <w:color w:val="000000"/>
                 <w:sz w:val="18"/>
               </w:rPr>
               <w:t>EcoCash Analysis</w:t>
@@ -731,6 +765,7 @@
             <w:r>
               <w:rPr>
                 <w:rFonts w:ascii="Times New Roman" w:hAnsi="Times New Roman"/>
+                <w:color w:val="000000"/>
                 <w:sz w:val="18"/>
               </w:rPr>
               <w:t>Documented findings comprehensively. Analyzed integration challenges: async handling, timeouts, credential security. Created recommendations.</w:t>
@@ -748,6 +783,7 @@
             <w:r>
               <w:rPr>
                 <w:rFonts w:ascii="Times New Roman" w:hAnsi="Times New Roman"/>
+                <w:color w:val="000000"/>
                 <w:sz w:val="18"/>
               </w:rPr>
               <w:t>Technical analysis, documentation</w:t>
@@ -767,6 +803,7 @@
             <w:r>
               <w:rPr>
                 <w:rFonts w:ascii="Times New Roman" w:hAnsi="Times New Roman"/>
+                <w:color w:val="000000"/>
                 <w:sz w:val="18"/>
               </w:rPr>
               <w:t>13 Oct (Mon)</w:t>
@@ -784,6 +821,7 @@
             <w:r>
               <w:rPr>
                 <w:rFonts w:ascii="Times New Roman" w:hAnsi="Times New Roman"/>
+                <w:color w:val="000000"/>
                 <w:sz w:val="18"/>
               </w:rPr>
               <w:t>InnBucks Prep</w:t>
@@ -801,6 +839,7 @@
             <w:r>
               <w:rPr>
                 <w:rFonts w:ascii="Times New Roman" w:hAnsi="Times New Roman"/>
+                <w:color w:val="000000"/>
                 <w:sz w:val="18"/>
               </w:rPr>
               <w:t>Reviewed modern RESTful architecture. Studied OAuth 2.0, webhook notifications. Analyzed business positioning vs EcoCash.</w:t>
@@ -818,6 +857,7 @@
             <w:r>
               <w:rPr>
                 <w:rFonts w:ascii="Times New Roman" w:hAnsi="Times New Roman"/>
+                <w:color w:val="000000"/>
                 <w:sz w:val="18"/>
               </w:rPr>
               <w:t>Modern architecture, OAuth concepts</w:t>
@@ -837,6 +877,7 @@
             <w:r>
               <w:rPr>
                 <w:rFonts w:ascii="Times New Roman" w:hAnsi="Times New Roman"/>
+                <w:color w:val="000000"/>
                 <w:sz w:val="18"/>
               </w:rPr>
               <w:t>15 Oct (Wed)</w:t>
@@ -854,6 +895,7 @@
             <w:r>
               <w:rPr>
                 <w:rFonts w:ascii="Times New Roman" w:hAnsi="Times New Roman"/>
+                <w:color w:val="000000"/>
                 <w:sz w:val="18"/>
               </w:rPr>
               <w:t>INNBUCKS MEETING</w:t>
@@ -871,6 +913,7 @@
             <w:r>
               <w:rPr>
                 <w:rFonts w:ascii="Times New Roman" w:hAnsi="Times New Roman"/>
+                <w:color w:val="000000"/>
                 <w:sz w:val="18"/>
               </w:rPr>
               <w:t>Innstrive offices (1.5 hours). Learned: Node.js, OAuth 2.0, JSON, webhooks, 91-93% success rates, 100 req/min limit. Discussed geographic liquidity challenges.</w:t>
@@ -888,6 +931,7 @@
             <w:r>
               <w:rPr>
                 <w:rFonts w:ascii="Times New Roman" w:hAnsi="Times New Roman"/>
+                <w:color w:val="000000"/>
                 <w:sz w:val="18"/>
               </w:rPr>
               <w:t>Modern API design, webhook integration</w:t>
@@ -907,6 +951,7 @@
             <w:r>
               <w:rPr>
                 <w:rFonts w:ascii="Times New Roman" w:hAnsi="Times New Roman"/>
+                <w:color w:val="000000"/>
                 <w:sz w:val="18"/>
               </w:rPr>
               <w:t>16 Oct</w:t>
@@ -924,6 +969,7 @@
             <w:r>
               <w:rPr>
                 <w:rFonts w:ascii="Times New Roman" w:hAnsi="Times New Roman"/>
+                <w:color w:val="000000"/>
                 <w:sz w:val="18"/>
               </w:rPr>
               <w:t>InnBucks Analysis</w:t>
@@ -941,6 +987,7 @@
             <w:r>
               <w:rPr>
                 <w:rFonts w:ascii="Times New Roman" w:hAnsi="Times New Roman"/>
+                <w:color w:val="000000"/>
                 <w:sz w:val="18"/>
               </w:rPr>
               <w:t>Comparative EcoCash vs InnBucks analysis. Evaluated strengths, weaknesses, business models. Recommended secondary provider strategy.</w:t>
@@ -958,6 +1005,7 @@
             <w:r>
               <w:rPr>
                 <w:rFonts w:ascii="Times New Roman" w:hAnsi="Times New Roman"/>
+                <w:color w:val="000000"/>
                 <w:sz w:val="18"/>
               </w:rPr>
               <w:t>Comparative analysis, business assessment</w:t>
@@ -1001,6 +1049,7 @@
             <w:r>
               <w:rPr>
                 <w:b/>
+                <w:color w:val="000000"/>
                 <w:sz w:val="20"/>
               </w:rPr>
               <w:t>Date</w:t>
@@ -1015,6 +1064,7 @@
             <w:r>
               <w:rPr>
                 <w:b/>
+                <w:color w:val="000000"/>
                 <w:sz w:val="20"/>
               </w:rPr>
               <w:t>Activity/Task</w:t>
@@ -1029,6 +1079,7 @@
             <w:r>
               <w:rPr>
                 <w:b/>
+                <w:color w:val="000000"/>
                 <w:sz w:val="20"/>
               </w:rPr>
               <w:t>Details &amp; Findings</w:t>
@@ -1043,6 +1094,7 @@
             <w:r>
               <w:rPr>
                 <w:b/>
+                <w:color w:val="000000"/>
                 <w:sz w:val="20"/>
               </w:rPr>
               <w:t>Skills Developed</w:t>
@@ -1061,6 +1113,7 @@
             </w:pPr>
             <w:r>
               <w:rPr>
+                <w:color w:val="000000"/>
                 <w:sz w:val="18"/>
               </w:rPr>
               <w:t>3 Nov (Mon)</w:t>
@@ -1077,6 +1130,7 @@
             </w:pPr>
             <w:r>
               <w:rPr>
+                <w:color w:val="000000"/>
                 <w:sz w:val="18"/>
               </w:rPr>
               <w:t>Omari Prep</w:t>
@@ -1093,6 +1147,7 @@
             </w:pPr>
             <w:r>
               <w:rPr>
+                <w:color w:val="000000"/>
                 <w:sz w:val="18"/>
               </w:rPr>
               <w:t>Researched digital lending platform. Studied ML credit scoring, feature engineering, ensemble methods. Reviewed 85%+ repayment rates in informal sector.</w:t>
@@ -1109,6 +1164,7 @@
             </w:pPr>
             <w:r>
               <w:rPr>
+                <w:color w:val="000000"/>
                 <w:sz w:val="18"/>
               </w:rPr>
               <w:t>Credit scoring, ML concepts</w:t>
@@ -1127,6 +1183,7 @@
             </w:pPr>
             <w:r>
               <w:rPr>
+                <w:color w:val="000000"/>
                 <w:sz w:val="18"/>
               </w:rPr>
               <w:t>5 Nov (Wed)</w:t>
@@ -1143,6 +1200,7 @@
             </w:pPr>
             <w:r>
               <w:rPr>
+                <w:color w:val="000000"/>
                 <w:sz w:val="18"/>
               </w:rPr>
               <w:t>OMARI MEETING</w:t>
@@ -1159,6 +1217,7 @@
             </w:pPr>
             <w:r>
               <w:rPr>
+                <w:color w:val="000000"/>
                 <w:sz w:val="18"/>
               </w:rPr>
               <w:t>Omari offices (2 hours). Learned: ML-based scoring, feature engineering, real-time decisions, 85%+ repayment, WhatsApp acquisition, frictionless onboarding. Discussed alternative credit data sources.</w:t>
@@ -1175,6 +1234,7 @@
             </w:pPr>
             <w:r>
               <w:rPr>
+                <w:color w:val="000000"/>
                 <w:sz w:val="18"/>
               </w:rPr>
               <w:t>ML credit assessment, acquisition strategy</w:t>
@@ -1193,6 +1253,7 @@
             </w:pPr>
             <w:r>
               <w:rPr>
+                <w:color w:val="000000"/>
                 <w:sz w:val="18"/>
               </w:rPr>
               <w:t>6 Nov</w:t>
@@ -1209,6 +1270,7 @@
             </w:pPr>
             <w:r>
               <w:rPr>
+                <w:color w:val="000000"/>
                 <w:sz w:val="18"/>
               </w:rPr>
               <w:t>Omari Analysis</w:t>
@@ -1225,6 +1287,7 @@
             </w:pPr>
             <w:r>
               <w:rPr>
+                <w:color w:val="000000"/>
                 <w:sz w:val="18"/>
               </w:rPr>
               <w:t>Competitive benchmarking vs Lynia. SWOT analysis completed. Identified customer experience strengths and growth factors.</w:t>
@@ -1241,6 +1304,7 @@
             </w:pPr>
             <w:r>
               <w:rPr>
+                <w:color w:val="000000"/>
                 <w:sz w:val="18"/>
               </w:rPr>
               <w:t>Competitive analysis, benchmarking</w:t>
@@ -1259,6 +1323,7 @@
             </w:pPr>
             <w:r>
               <w:rPr>
+                <w:color w:val="000000"/>
                 <w:sz w:val="18"/>
               </w:rPr>
               <w:t>10 Nov (Mon)</w:t>
@@ -1275,6 +1340,7 @@
             </w:pPr>
             <w:r>
               <w:rPr>
+                <w:color w:val="000000"/>
                 <w:sz w:val="18"/>
               </w:rPr>
               <w:t>SSB Prep</w:t>
@@ -1291,6 +1357,7 @@
             </w:pPr>
             <w:r>
               <w:rPr>
+                <w:color w:val="000000"/>
                 <w:sz w:val="18"/>
               </w:rPr>
               <w:t>Researched salary-linked lending model. Studied RBZ regulations. Reviewed civil service integration requirements.</w:t>
@@ -1307,6 +1374,7 @@
             </w:pPr>
             <w:r>
               <w:rPr>
+                <w:color w:val="000000"/>
                 <w:sz w:val="18"/>
               </w:rPr>
               <w:t>Government lending, regulatory research</w:t>
@@ -1325,6 +1393,7 @@
             </w:pPr>
             <w:r>
               <w:rPr>
+                <w:color w:val="000000"/>
                 <w:sz w:val="18"/>
               </w:rPr>
               <w:t>12 Nov (Wed)</w:t>
@@ -1341,6 +1410,7 @@
             </w:pPr>
             <w:r>
               <w:rPr>
+                <w:color w:val="000000"/>
                 <w:sz w:val="18"/>
               </w:rPr>
               <w:t>SSB MEETING</w:t>
@@ -1357,6 +1427,7 @@
             </w:pPr>
             <w:r>
               <w:rPr>
+                <w:color w:val="000000"/>
                 <w:sz w:val="18"/>
               </w:rPr>
               <w:t>SSB HQ (2.5 hours). Learned: salary deduction integration, 300,000+ civil servants market, near-zero defaults, legacy systems, modernization opportunities. Discussed partnership potential.</w:t>
@@ -1373,6 +1444,7 @@
             </w:pPr>
             <w:r>
               <w:rPr>
+                <w:color w:val="000000"/>
                 <w:sz w:val="18"/>
               </w:rPr>
               <w:t>Government systems, salary-linked lending</w:t>
@@ -1391,6 +1463,7 @@
             </w:pPr>
             <w:r>
               <w:rPr>
+                <w:color w:val="000000"/>
                 <w:sz w:val="18"/>
               </w:rPr>
               <w:t>13 Nov</w:t>
@@ -1407,6 +1480,7 @@
             </w:pPr>
             <w:r>
               <w:rPr>
+                <w:color w:val="000000"/>
                 <w:sz w:val="18"/>
               </w:rPr>
               <w:t>SSB Analysis</w:t>
@@ -1423,6 +1497,7 @@
             </w:pPr>
             <w:r>
               <w:rPr>
+                <w:color w:val="000000"/>
                 <w:sz w:val="18"/>
               </w:rPr>
               <w:t>Documented findings. Assessed market opportunity and competitive positioning. Created partnership implementation roadmap.</w:t>
@@ -1439,6 +1514,7 @@
             </w:pPr>
             <w:r>
               <w:rPr>
+                <w:color w:val="000000"/>
                 <w:sz w:val="18"/>
               </w:rPr>
               <w:t>Strategic planning, market analysis</w:t>
@@ -1482,6 +1558,7 @@
             <w:r>
               <w:rPr>
                 <w:b/>
+                <w:color w:val="000000"/>
                 <w:sz w:val="20"/>
               </w:rPr>
               <w:t>Date</w:t>
@@ -1496,6 +1573,7 @@
             <w:r>
               <w:rPr>
                 <w:b/>
+                <w:color w:val="000000"/>
                 <w:sz w:val="20"/>
               </w:rPr>
               <w:t>Activity/Task</w:t>
@@ -1510,6 +1588,7 @@
             <w:r>
               <w:rPr>
                 <w:b/>
+                <w:color w:val="000000"/>
                 <w:sz w:val="20"/>
               </w:rPr>
               <w:t>Details &amp; Findings</w:t>
@@ -1524,6 +1603,7 @@
             <w:r>
               <w:rPr>
                 <w:b/>
+                <w:color w:val="000000"/>
                 <w:sz w:val="20"/>
               </w:rPr>
               <w:t>Skills Developed</w:t>
@@ -1542,6 +1622,7 @@
             </w:pPr>
             <w:r>
               <w:rPr>
+                <w:color w:val="000000"/>
                 <w:sz w:val="18"/>
               </w:rPr>
               <w:t>1 Dec</w:t>
@@ -1558,6 +1639,7 @@
             </w:pPr>
             <w:r>
               <w:rPr>
+                <w:color w:val="000000"/>
                 <w:sz w:val="18"/>
               </w:rPr>
               <w:t>Research Summary &amp; Project Start</w:t>
@@ -1574,6 +1656,7 @@
             </w:pPr>
             <w:r>
               <w:rPr>
+                <w:color w:val="000000"/>
                 <w:sz w:val="18"/>
               </w:rPr>
               <w:t>Consolidated all research findings. Initiated Payment Reconciliation System. Designed AWS Lambda/SQS distributed architecture. Technical design documented.</w:t>
@@ -1590,6 +1673,7 @@
             </w:pPr>
             <w:r>
               <w:rPr>
+                <w:color w:val="000000"/>
                 <w:sz w:val="18"/>
               </w:rPr>
               <w:t>Project management, architecture design</w:t>
@@ -1608,6 +1692,7 @@
             </w:pPr>
             <w:r>
               <w:rPr>
+                <w:color w:val="000000"/>
                 <w:sz w:val="18"/>
               </w:rPr>
               <w:t>2-5 Dec</w:t>
@@ -1624,6 +1709,7 @@
             </w:pPr>
             <w:r>
               <w:rPr>
+                <w:color w:val="000000"/>
                 <w:sz w:val="18"/>
               </w:rPr>
               <w:t>Reconciliation System Dev</w:t>
@@ -1640,6 +1726,7 @@
             </w:pPr>
             <w:r>
               <w:rPr>
+                <w:color w:val="000000"/>
                 <w:sz w:val="18"/>
               </w:rPr>
               <w:t>Designed components: Transaction State Management, Reconciliation Engine, Callback Handlers, Discrepancy Detection. Began Node.js/TypeScript implementation.</w:t>
@@ -1656,6 +1743,7 @@
             </w:pPr>
             <w:r>
               <w:rPr>
+                <w:color w:val="000000"/>
                 <w:sz w:val="18"/>
               </w:rPr>
               <w:t>System architecture, Node.js development</w:t>
@@ -1674,6 +1762,7 @@
             </w:pPr>
             <w:r>
               <w:rPr>
+                <w:color w:val="000000"/>
                 <w:sz w:val="18"/>
               </w:rPr>
               <w:t>8-12 Dec</w:t>
@@ -1690,6 +1779,7 @@
             </w:pPr>
             <w:r>
               <w:rPr>
+                <w:color w:val="000000"/>
                 <w:sz w:val="18"/>
               </w:rPr>
               <w:t>WhatsApp Integration</w:t>
@@ -1706,6 +1796,7 @@
             </w:pPr>
             <w:r>
               <w:rPr>
+                <w:color w:val="000000"/>
                 <w:sz w:val="18"/>
               </w:rPr>
               <w:t>Connected live WhatsApp Business number. Implemented runtime verification, health checks. Integrated AWS Secrets Manager for secure credentials.</w:t>
@@ -1722,6 +1813,7 @@
             </w:pPr>
             <w:r>
               <w:rPr>
+                <w:color w:val="000000"/>
                 <w:sz w:val="18"/>
               </w:rPr>
               <w:t>WhatsApp API, credential management</w:t>
@@ -1740,6 +1832,7 @@
             </w:pPr>
             <w:r>
               <w:rPr>
+                <w:color w:val="000000"/>
                 <w:sz w:val="18"/>
               </w:rPr>
               <w:t>15 Dec</w:t>
@@ -1756,6 +1849,7 @@
             </w:pPr>
             <w:r>
               <w:rPr>
+                <w:color w:val="000000"/>
                 <w:sz w:val="18"/>
               </w:rPr>
               <w:t>Mid-Point Review</w:t>
@@ -1772,6 +1866,7 @@
             </w:pPr>
             <w:r>
               <w:rPr>
+                <w:color w:val="000000"/>
                 <w:sz w:val="18"/>
               </w:rPr>
               <w:t>Comprehensive supervisor review. All research completed. Discussed 2026 objectives and progress assessment.</w:t>
@@ -1788,6 +1883,7 @@
             </w:pPr>
             <w:r>
               <w:rPr>
+                <w:color w:val="000000"/>
                 <w:sz w:val="18"/>
               </w:rPr>
               <w:t>Reflective practice, communication</w:t>
@@ -1831,6 +1927,7 @@
             <w:r>
               <w:rPr>
                 <w:b/>
+                <w:color w:val="000000"/>
                 <w:sz w:val="20"/>
               </w:rPr>
               <w:t>Date</w:t>
@@ -1845,6 +1942,7 @@
             <w:r>
               <w:rPr>
                 <w:b/>
+                <w:color w:val="000000"/>
                 <w:sz w:val="20"/>
               </w:rPr>
               <w:t>Activity/Task</w:t>
@@ -1859,6 +1957,7 @@
             <w:r>
               <w:rPr>
                 <w:b/>
+                <w:color w:val="000000"/>
                 <w:sz w:val="20"/>
               </w:rPr>
               <w:t>Details &amp; Findings</w:t>
@@ -1873,6 +1972,7 @@
             <w:r>
               <w:rPr>
                 <w:b/>
+                <w:color w:val="000000"/>
                 <w:sz w:val="20"/>
               </w:rPr>
               <w:t>Skills Developed</w:t>
@@ -1891,6 +1991,7 @@
             </w:pPr>
             <w:r>
               <w:rPr>
+                <w:color w:val="000000"/>
                 <w:sz w:val="18"/>
               </w:rPr>
               <w:t>5-31 Jan</w:t>
@@ -1907,6 +2008,7 @@
             </w:pPr>
             <w:r>
               <w:rPr>
+                <w:color w:val="000000"/>
                 <w:sz w:val="18"/>
               </w:rPr>
               <w:t>Reconciliation Development</w:t>
@@ -1923,6 +2025,7 @@
             </w:pPr>
             <w:r>
               <w:rPr>
+                <w:color w:val="000000"/>
                 <w:sz w:val="18"/>
               </w:rPr>
               <w:t>Intensive development phase. Implemented all system components. Achieved 50,000 daily transactions, 99.8% uptime. Comprehensive testing.</w:t>
@@ -1939,6 +2042,7 @@
             </w:pPr>
             <w:r>
               <w:rPr>
+                <w:color w:val="000000"/>
                 <w:sz w:val="18"/>
               </w:rPr>
               <w:t>Backend dev, testing, AWS optimization</w:t>
@@ -1957,6 +2061,7 @@
             </w:pPr>
             <w:r>
               <w:rPr>
+                <w:color w:val="000000"/>
                 <w:sz w:val="18"/>
               </w:rPr>
               <w:t>15 Jan</w:t>
@@ -1973,6 +2078,7 @@
             </w:pPr>
             <w:r>
               <w:rPr>
+                <w:color w:val="000000"/>
                 <w:sz w:val="18"/>
               </w:rPr>
               <w:t>Analytics Dashboard Kickoff</w:t>
@@ -1989,6 +2095,7 @@
             </w:pPr>
             <w:r>
               <w:rPr>
+                <w:color w:val="000000"/>
                 <w:sz w:val="18"/>
               </w:rPr>
               <w:t>Gathered requirements from operations, risk, executives. Designed React frontend. Planned Python backend with PostgreSQL/Redis caching.</w:t>
@@ -2005,6 +2112,7 @@
             </w:pPr>
             <w:r>
               <w:rPr>
+                <w:color w:val="000000"/>
                 <w:sz w:val="18"/>
               </w:rPr>
               <w:t>Requirements gathering, frontend/backend design</w:t>
@@ -2048,6 +2156,7 @@
             <w:r>
               <w:rPr>
                 <w:b/>
+                <w:color w:val="000000"/>
                 <w:sz w:val="20"/>
               </w:rPr>
               <w:t>Date</w:t>
@@ -2062,6 +2171,7 @@
             <w:r>
               <w:rPr>
                 <w:b/>
+                <w:color w:val="000000"/>
                 <w:sz w:val="20"/>
               </w:rPr>
               <w:t>Activity/Task</w:t>
@@ -2076,6 +2186,7 @@
             <w:r>
               <w:rPr>
                 <w:b/>
+                <w:color w:val="000000"/>
                 <w:sz w:val="20"/>
               </w:rPr>
               <w:t>Details &amp; Findings</w:t>
@@ -2090,6 +2201,7 @@
             <w:r>
               <w:rPr>
                 <w:b/>
+                <w:color w:val="000000"/>
                 <w:sz w:val="20"/>
               </w:rPr>
               <w:t>Skills Developed</w:t>
@@ -2108,6 +2220,7 @@
             </w:pPr>
             <w:r>
               <w:rPr>
+                <w:color w:val="000000"/>
                 <w:sz w:val="18"/>
               </w:rPr>
               <w:t>2-28 Feb</w:t>
@@ -2124,6 +2237,7 @@
             </w:pPr>
             <w:r>
               <w:rPr>
+                <w:color w:val="000000"/>
                 <w:sz w:val="18"/>
               </w:rPr>
               <w:t>Dashboard &amp; ETL Pipeline</w:t>
@@ -2140,6 +2254,7 @@
             </w:pPr>
             <w:r>
               <w:rPr>
+                <w:color w:val="000000"/>
                 <w:sz w:val="18"/>
               </w:rPr>
               <w:t>Developed analytics dashboard with real-time KPI monitoring. Built ETL pipeline consolidating multi-source data. Apache Airflow orchestration for hourly updates. Dashboard revealed key insights: peak activity 6-9am/5-8pm, 87% repayment rate, 40% lower organic acquisition cost, 65% Harare/Bulawayo concentration.</w:t>
@@ -2156,6 +2271,7 @@
             </w:pPr>
             <w:r>
               <w:rPr>
+                <w:color w:val="000000"/>
                 <w:sz w:val="18"/>
               </w:rPr>
               <w:t>ETL design, Apache Airflow, data pipeline architecture</w:t>
@@ -2199,6 +2315,7 @@
             <w:r>
               <w:rPr>
                 <w:b/>
+                <w:color w:val="000000"/>
                 <w:sz w:val="20"/>
               </w:rPr>
               <w:t>Date</w:t>
@@ -2213,6 +2330,7 @@
             <w:r>
               <w:rPr>
                 <w:b/>
+                <w:color w:val="000000"/>
                 <w:sz w:val="20"/>
               </w:rPr>
               <w:t>Activity/Task</w:t>
@@ -2227,6 +2345,7 @@
             <w:r>
               <w:rPr>
                 <w:b/>
+                <w:color w:val="000000"/>
                 <w:sz w:val="20"/>
               </w:rPr>
               <w:t>Details &amp; Findings</w:t>
@@ -2241,6 +2360,7 @@
             <w:r>
               <w:rPr>
                 <w:b/>
+                <w:color w:val="000000"/>
                 <w:sz w:val="20"/>
               </w:rPr>
               <w:t>Skills Developed</w:t>
@@ -2259,6 +2379,7 @@
             </w:pPr>
             <w:r>
               <w:rPr>
+                <w:color w:val="000000"/>
                 <w:sz w:val="18"/>
               </w:rPr>
               <w:t>2-31 Mar</w:t>
@@ -2275,6 +2396,7 @@
             </w:pPr>
             <w:r>
               <w:rPr>
+                <w:color w:val="000000"/>
                 <w:sz w:val="18"/>
               </w:rPr>
               <w:t>Testing &amp; Optimization</w:t>
@@ -2291,6 +2413,7 @@
             </w:pPr>
             <w:r>
               <w:rPr>
+                <w:color w:val="000000"/>
                 <w:sz w:val="18"/>
               </w:rPr>
               <w:t>Enhanced test coverage across all systems. Fixed bugs including WhatsApp display handling, test session initialization, credential management. Optimized database queries. Enhanced CloudWatch monitoring.</w:t>
@@ -2307,6 +2430,7 @@
             </w:pPr>
             <w:r>
               <w:rPr>
+                <w:color w:val="000000"/>
                 <w:sz w:val="18"/>
               </w:rPr>
               <w:t>Testing methodology, debugging, performance optimization</w:t>
@@ -2325,6 +2449,7 @@
             </w:pPr>
             <w:r>
               <w:rPr>
+                <w:color w:val="000000"/>
                 <w:sz w:val="18"/>
               </w:rPr>
               <w:t>1-30 Apr</w:t>
@@ -2341,6 +2466,7 @@
             </w:pPr>
             <w:r>
               <w:rPr>
+                <w:color w:val="000000"/>
                 <w:sz w:val="18"/>
               </w:rPr>
               <w:t>System Hardening &amp; Deploy</w:t>
@@ -2357,6 +2483,7 @@
             </w:pPr>
             <w:r>
               <w:rPr>
+                <w:color w:val="000000"/>
                 <w:sz w:val="18"/>
               </w:rPr>
               <w:t>Refactored CI/CD pipeline removing GitHub secrets. Implemented AWS Secrets Manager. Security audits and compliance verification. Operationalized runbooks. Deployed to production with zero critical incidents.</w:t>
@@ -2373,6 +2500,7 @@
             </w:pPr>
             <w:r>
               <w:rPr>
+                <w:color w:val="000000"/>
                 <w:sz w:val="18"/>
               </w:rPr>
               <w:t>CI/CD optimization, security hardening, compliance</w:t>
@@ -2391,6 +2519,7 @@
             </w:pPr>
             <w:r>
               <w:rPr>
+                <w:color w:val="000000"/>
                 <w:sz w:val="18"/>
               </w:rPr>
               <w:t>1-7 May</w:t>
@@ -2407,6 +2536,7 @@
             </w:pPr>
             <w:r>
               <w:rPr>
+                <w:color w:val="000000"/>
                 <w:sz w:val="18"/>
               </w:rPr>
               <w:t>Completion &amp; Documentation</w:t>
@@ -2423,6 +2553,7 @@
             </w:pPr>
             <w:r>
               <w:rPr>
+                <w:color w:val="000000"/>
                 <w:sz w:val="18"/>
               </w:rPr>
               <w:t>Completed all documentation. Conducted knowledge transfer sessions with operations and engineering teams. Prepared final reports. Reflected on overall experience.</w:t>
@@ -2439,6 +2570,7 @@
             </w:pPr>
             <w:r>
               <w:rPr>
+                <w:color w:val="000000"/>
                 <w:sz w:val="18"/>
               </w:rPr>
               <w:t>Documentation, knowledge transfer, professional closure</w:t>
@@ -2496,6 +2628,7 @@
             <w:r>
               <w:rPr>
                 <w:b/>
+                <w:color w:val="000000"/>
                 <w:sz w:val="20"/>
               </w:rPr>
               <w:t>Organization</w:t>
@@ -2510,6 +2643,7 @@
             <w:r>
               <w:rPr>
                 <w:b/>
+                <w:color w:val="000000"/>
                 <w:sz w:val="20"/>
               </w:rPr>
               <w:t>Date</w:t>
@@ -2524,6 +2658,7 @@
             <w:r>
               <w:rPr>
                 <w:b/>
+                <w:color w:val="000000"/>
                 <w:sz w:val="20"/>
               </w:rPr>
               <w:t>Duration</w:t>
@@ -2538,6 +2673,7 @@
             <w:r>
               <w:rPr>
                 <w:b/>
+                <w:color w:val="000000"/>
                 <w:sz w:val="20"/>
               </w:rPr>
               <w:t>Key Findings</w:t>
@@ -2555,6 +2691,9 @@
               <w:spacing w:after="0"/>
             </w:pPr>
             <w:r>
+              <w:rPr>
+                <w:color w:val="000000"/>
+              </w:rPr>
               <w:t>EcoCash</w:t>
             </w:r>
           </w:p>
@@ -2568,6 +2707,9 @@
               <w:spacing w:after="0"/>
             </w:pPr>
             <w:r>
+              <w:rPr>
+                <w:color w:val="000000"/>
+              </w:rPr>
               <w:t>8 Oct 2025</w:t>
             </w:r>
           </w:p>
@@ -2581,6 +2723,9 @@
               <w:spacing w:after="0"/>
             </w:pPr>
             <w:r>
+              <w:rPr>
+                <w:color w:val="000000"/>
+              </w:rPr>
               <w:t>2 hours</w:t>
             </w:r>
           </w:p>
@@ -2594,6 +2739,9 @@
               <w:spacing w:after="0"/>
             </w:pPr>
             <w:r>
+              <w:rPr>
+                <w:color w:val="000000"/>
+              </w:rPr>
               <w:t>Java/Spring, PostgreSQL, 94-97% success rates, 2-5% fees, async processing</w:t>
             </w:r>
           </w:p>
@@ -2609,6 +2757,9 @@
               <w:spacing w:after="0"/>
             </w:pPr>
             <w:r>
+              <w:rPr>
+                <w:color w:val="000000"/>
+              </w:rPr>
               <w:t>InnBucks</w:t>
             </w:r>
           </w:p>
@@ -2622,6 +2773,9 @@
               <w:spacing w:after="0"/>
             </w:pPr>
             <w:r>
+              <w:rPr>
+                <w:color w:val="000000"/>
+              </w:rPr>
               <w:t>15 Oct 2025</w:t>
             </w:r>
           </w:p>
@@ -2635,6 +2789,9 @@
               <w:spacing w:after="0"/>
             </w:pPr>
             <w:r>
+              <w:rPr>
+                <w:color w:val="000000"/>
+              </w:rPr>
               <w:t>1.5 hours</w:t>
             </w:r>
           </w:p>
@@ -2648,6 +2805,9 @@
               <w:spacing w:after="0"/>
             </w:pPr>
             <w:r>
+              <w:rPr>
+                <w:color w:val="000000"/>
+              </w:rPr>
               <w:t>Node.js, OAuth 2.0, 91-93% success rates, 100 req/min limit, webhooks</w:t>
             </w:r>
           </w:p>
@@ -2663,6 +2823,9 @@
               <w:spacing w:after="0"/>
             </w:pPr>
             <w:r>
+              <w:rPr>
+                <w:color w:val="000000"/>
+              </w:rPr>
               <w:t>Omari</w:t>
             </w:r>
           </w:p>
@@ -2676,6 +2839,9 @@
               <w:spacing w:after="0"/>
             </w:pPr>
             <w:r>
+              <w:rPr>
+                <w:color w:val="000000"/>
+              </w:rPr>
               <w:t>5 Nov 2025</w:t>
             </w:r>
           </w:p>
@@ -2689,6 +2855,9 @@
               <w:spacing w:after="0"/>
             </w:pPr>
             <w:r>
+              <w:rPr>
+                <w:color w:val="000000"/>
+              </w:rPr>
               <w:t>2 hours</w:t>
             </w:r>
           </w:p>
@@ -2702,6 +2871,9 @@
               <w:spacing w:after="0"/>
             </w:pPr>
             <w:r>
+              <w:rPr>
+                <w:color w:val="000000"/>
+              </w:rPr>
               <w:t>ML credit scoring, 85%+ repayment rates, WhatsApp acquisition strategy</w:t>
             </w:r>
           </w:p>
@@ -2717,6 +2889,9 @@
               <w:spacing w:after="0"/>
             </w:pPr>
             <w:r>
+              <w:rPr>
+                <w:color w:val="000000"/>
+              </w:rPr>
               <w:t>SSB</w:t>
             </w:r>
           </w:p>
@@ -2730,6 +2905,9 @@
               <w:spacing w:after="0"/>
             </w:pPr>
             <w:r>
+              <w:rPr>
+                <w:color w:val="000000"/>
+              </w:rPr>
               <w:t>12 Nov 2025</w:t>
             </w:r>
           </w:p>
@@ -2743,6 +2921,9 @@
               <w:spacing w:after="0"/>
             </w:pPr>
             <w:r>
+              <w:rPr>
+                <w:color w:val="000000"/>
+              </w:rPr>
               <w:t>2.5 hours</w:t>
             </w:r>
           </w:p>
@@ -2756,6 +2937,9 @@
               <w:spacing w:after="0"/>
             </w:pPr>
             <w:r>
+              <w:rPr>
+                <w:color w:val="000000"/>
+              </w:rPr>
               <w:t>Salary-linked lending, 300k+ market, near-zero default rates</w:t>
             </w:r>
           </w:p>
@@ -2797,6 +2981,7 @@
             <w:r>
               <w:rPr>
                 <w:b/>
+                <w:color w:val="000000"/>
                 <w:sz w:val="20"/>
               </w:rPr>
               <w:t>Project</w:t>
@@ -2811,6 +2996,7 @@
             <w:r>
               <w:rPr>
                 <w:b/>
+                <w:color w:val="000000"/>
                 <w:sz w:val="20"/>
               </w:rPr>
               <w:t>Timeline</w:t>
@@ -2825,6 +3011,7 @@
             <w:r>
               <w:rPr>
                 <w:b/>
+                <w:color w:val="000000"/>
                 <w:sz w:val="20"/>
               </w:rPr>
               <w:t>Technology</w:t>
@@ -2839,6 +3026,7 @@
             <w:r>
               <w:rPr>
                 <w:b/>
+                <w:color w:val="000000"/>
                 <w:sz w:val="20"/>
               </w:rPr>
               <w:t>Status</w:t>
@@ -2856,6 +3044,9 @@
               <w:spacing w:after="0"/>
             </w:pPr>
             <w:r>
+              <w:rPr>
+                <w:color w:val="000000"/>
+              </w:rPr>
               <w:t>Payment Reconciliation</w:t>
             </w:r>
           </w:p>
@@ -2869,6 +3060,9 @@
               <w:spacing w:after="0"/>
             </w:pPr>
             <w:r>
+              <w:rPr>
+                <w:color w:val="000000"/>
+              </w:rPr>
               <w:t>Dec 2025 - Jan 2026</w:t>
             </w:r>
           </w:p>
@@ -2882,6 +3076,9 @@
               <w:spacing w:after="0"/>
             </w:pPr>
             <w:r>
+              <w:rPr>
+                <w:color w:val="000000"/>
+              </w:rPr>
               <w:t>AWS Lambda/SQS, PostgreSQL, Node.js/TypeScript</w:t>
             </w:r>
           </w:p>
@@ -2895,6 +3092,9 @@
               <w:spacing w:after="0"/>
             </w:pPr>
             <w:r>
+              <w:rPr>
+                <w:color w:val="000000"/>
+              </w:rPr>
               <w:t>Production - 99.8% uptime</w:t>
             </w:r>
           </w:p>
@@ -2910,6 +3110,9 @@
               <w:spacing w:after="0"/>
             </w:pPr>
             <w:r>
+              <w:rPr>
+                <w:color w:val="000000"/>
+              </w:rPr>
               <w:t>Analytics Dashboard</w:t>
             </w:r>
           </w:p>
@@ -2923,6 +3126,9 @@
               <w:spacing w:after="0"/>
             </w:pPr>
             <w:r>
+              <w:rPr>
+                <w:color w:val="000000"/>
+              </w:rPr>
               <w:t>Jan - Feb 2026</w:t>
             </w:r>
           </w:p>
@@ -2936,6 +3142,9 @@
               <w:spacing w:after="0"/>
             </w:pPr>
             <w:r>
+              <w:rPr>
+                <w:color w:val="000000"/>
+              </w:rPr>
               <w:t>React.js, Python, PostgreSQL, Redis</w:t>
             </w:r>
           </w:p>
@@ -2949,6 +3158,9 @@
               <w:spacing w:after="0"/>
             </w:pPr>
             <w:r>
+              <w:rPr>
+                <w:color w:val="000000"/>
+              </w:rPr>
               <w:t>Production - Real-time BI</w:t>
             </w:r>
           </w:p>
@@ -2964,6 +3176,9 @@
               <w:spacing w:after="0"/>
             </w:pPr>
             <w:r>
+              <w:rPr>
+                <w:color w:val="000000"/>
+              </w:rPr>
               <w:t>Data Integration &amp; ETL</w:t>
             </w:r>
           </w:p>
@@ -2977,6 +3192,9 @@
               <w:spacing w:after="0"/>
             </w:pPr>
             <w:r>
+              <w:rPr>
+                <w:color w:val="000000"/>
+              </w:rPr>
               <w:t>Jan - Feb 2026</w:t>
             </w:r>
           </w:p>
@@ -2990,6 +3208,9 @@
               <w:spacing w:after="0"/>
             </w:pPr>
             <w:r>
+              <w:rPr>
+                <w:color w:val="000000"/>
+              </w:rPr>
               <w:t>Apache Airflow, Python, PostgreSQL</w:t>
             </w:r>
           </w:p>
@@ -3003,6 +3224,9 @@
               <w:spacing w:after="0"/>
             </w:pPr>
             <w:r>
+              <w:rPr>
+                <w:color w:val="000000"/>
+              </w:rPr>
               <w:t>Production - 99.8% uptime</w:t>
             </w:r>
           </w:p>
@@ -3018,6 +3242,9 @@
               <w:spacing w:after="0"/>
             </w:pPr>
             <w:r>
+              <w:rPr>
+                <w:color w:val="000000"/>
+              </w:rPr>
               <w:t>WhatsApp Integration</w:t>
             </w:r>
           </w:p>
@@ -3031,6 +3258,9 @@
               <w:spacing w:after="0"/>
             </w:pPr>
             <w:r>
+              <w:rPr>
+                <w:color w:val="000000"/>
+              </w:rPr>
               <w:t>Dec 2025 - Apr 2026</w:t>
             </w:r>
           </w:p>
@@ -3044,6 +3274,9 @@
               <w:spacing w:after="0"/>
             </w:pPr>
             <w:r>
+              <w:rPr>
+                <w:color w:val="000000"/>
+              </w:rPr>
               <w:t>WhatsApp Business API, AWS Secrets Manager</w:t>
             </w:r>
           </w:p>
@@ -3057,6 +3290,9 @@
               <w:spacing w:after="0"/>
             </w:pPr>
             <w:r>
+              <w:rPr>
+                <w:color w:val="000000"/>
+              </w:rPr>
               <w:t>Production - Live</w:t>
             </w:r>
           </w:p>

</xml_diff>

<commit_message>
Completely remove all color formatting including table cell shading - pure black and white
</commit_message>
<xml_diff>
--- a/Industrial_Attachment_Logbook_October2025_May2026.docx
+++ b/Industrial_Attachment_Logbook_October2025_May2026.docx
@@ -12,6 +12,7 @@
           <w:rFonts w:ascii="Times New Roman" w:hAnsi="Times New Roman"/>
           <w:b/>
           <w:sz w:val="28"/>
+          <w:color w:val="000000"/>
         </w:rPr>
         <w:t>INDUSTRIAL ATTACHMENT LOGBOOK</w:t>
       </w:r>
@@ -25,6 +26,7 @@
         <w:rPr>
           <w:rFonts w:ascii="Times New Roman" w:hAnsi="Times New Roman"/>
           <w:sz w:val="22"/>
+          <w:color w:val="000000"/>
         </w:rPr>
         <w:t>Lynia Finance - Informatics and Analytics</w:t>
       </w:r>
@@ -38,6 +40,7 @@
         <w:rPr>
           <w:rFonts w:ascii="Times New Roman" w:hAnsi="Times New Roman"/>
           <w:sz w:val="22"/>
+          <w:color w:val="000000"/>
         </w:rPr>
         <w:t>October 1, 2025 - May 7, 2026</w:t>
       </w:r>
@@ -52,6 +55,7 @@
           <w:rFonts w:ascii="Times New Roman" w:hAnsi="Times New Roman"/>
           <w:b/>
           <w:sz w:val="24"/>
+          <w:color w:val="000000"/>
         </w:rPr>
         <w:t>INTRODUCTION</w:t>
       </w:r>
@@ -65,6 +69,7 @@
         <w:rPr>
           <w:rFonts w:ascii="Times New Roman" w:hAnsi="Times New Roman"/>
           <w:sz w:val="22"/>
+          <w:color w:val="000000"/>
         </w:rPr>
         <w:t>This logbook documents the industrial attachment experience at Lynia Finance, a fintech organization dedicated to providing alternative financial infrastructure and financial inclusion for Zimbabwe's underbanked population. Lynia Finance operates at the intersection of technology and finance, specialising in digital lending, payment processing, and alternative credit assessment for informal sector workers who lack traditional banking access. The organisation leverages artificial intelligence, machine learning, and big data analytics to revolutionise access to credit in emerging markets. This logbook specifically records the attachment experience of an Informatics and Analytics student from the National University of Science and Technology (NUST), documenting a seven-month engagement from October 1, 2025 through May 7, 2026.</w:t>
       </w:r>
@@ -78,6 +83,7 @@
         <w:rPr>
           <w:rFonts w:ascii="Times New Roman" w:hAnsi="Times New Roman"/>
           <w:sz w:val="22"/>
+          <w:color w:val="000000"/>
         </w:rPr>
         <w:t>The logbook is structured in table format providing systematic tracking of daily and weekly activities, research meetings with financial institutions, technical project implementations, and professional skill development. The primary focus encompasses four major research activities investigating Zimbabwe's payment and lending landscape: EcoCash (the dominant mobile money platform with 7+ million users), InnBucks (emerging alternative provider), Omari (digital lending platform), and SSB (civil servants loan system). Complementary to this research, four substantial technical projects were implemented contributing directly to Lynia Finance's operations: Payment Reconciliation System, Analytics Dashboard, Data Integration &amp; ETL Pipeline, and WhatsApp Business Integration.</w:t>
       </w:r>
@@ -91,6 +97,7 @@
         <w:rPr>
           <w:rFonts w:ascii="Times New Roman" w:hAnsi="Times New Roman"/>
           <w:sz w:val="22"/>
+          <w:color w:val="000000"/>
         </w:rPr>
         <w:t>The attachment work demonstrates the breadth of fintech operations, from understanding payment system architectures and credit assessment methodologies to implementing production systems handling thousands of daily transactions. The student's role encompassed research and analysis, technical implementation, testing and quality assurance, and operational deployment. This logbook provides a chronological record of experiences, learnings, challenges overcome, and professional development throughout the attachment period, serving as both a documentary record and a reflection tool on the transition from academic learning to professional practice in the fintech industry.</w:t>
       </w:r>
@@ -105,6 +112,7 @@
           <w:rFonts w:ascii="Times New Roman" w:hAnsi="Times New Roman"/>
           <w:b/>
           <w:sz w:val="24"/>
+          <w:color w:val="000000"/>
         </w:rPr>
         <w:t>OCTOBER 2025</w:t>
       </w:r>
@@ -122,6 +130,7 @@
         <w:gridCol w:w="2354"/>
       </w:tblGrid>
       <w:tr>
+        <w:trPr/>
         <w:tc>
           <w:tcPr>
             <w:tcW w:type="dxa" w:w="2354"/>
@@ -134,8 +143,8 @@
               <w:rPr>
                 <w:rFonts w:ascii="Times New Roman" w:hAnsi="Times New Roman"/>
                 <w:b/>
+                <w:sz w:val="20"/>
                 <w:color w:val="000000"/>
-                <w:sz w:val="20"/>
               </w:rPr>
               <w:t>Date</w:t>
             </w:r>
@@ -153,8 +162,8 @@
               <w:rPr>
                 <w:rFonts w:ascii="Times New Roman" w:hAnsi="Times New Roman"/>
                 <w:b/>
+                <w:sz w:val="20"/>
                 <w:color w:val="000000"/>
-                <w:sz w:val="20"/>
               </w:rPr>
               <w:t>Activity/Task</w:t>
             </w:r>
@@ -172,8 +181,8 @@
               <w:rPr>
                 <w:rFonts w:ascii="Times New Roman" w:hAnsi="Times New Roman"/>
                 <w:b/>
+                <w:sz w:val="20"/>
                 <w:color w:val="000000"/>
-                <w:sz w:val="20"/>
               </w:rPr>
               <w:t>Details &amp; Findings</w:t>
             </w:r>
@@ -191,8 +200,8 @@
               <w:rPr>
                 <w:rFonts w:ascii="Times New Roman" w:hAnsi="Times New Roman"/>
                 <w:b/>
+                <w:sz w:val="20"/>
                 <w:color w:val="000000"/>
-                <w:sz w:val="20"/>
               </w:rPr>
               <w:t>Skills Developed</w:t>
             </w:r>
@@ -200,6 +209,7 @@
         </w:tc>
       </w:tr>
       <w:tr>
+        <w:trPr/>
         <w:tc>
           <w:tcPr>
             <w:tcW w:type="dxa" w:w="2354"/>
@@ -211,8 +221,8 @@
             <w:r>
               <w:rPr>
                 <w:rFonts w:ascii="Times New Roman" w:hAnsi="Times New Roman"/>
+                <w:sz w:val="18"/>
                 <w:color w:val="000000"/>
-                <w:sz w:val="18"/>
               </w:rPr>
               <w:t>1 Oct</w:t>
             </w:r>
@@ -229,8 +239,8 @@
             <w:r>
               <w:rPr>
                 <w:rFonts w:ascii="Times New Roman" w:hAnsi="Times New Roman"/>
+                <w:sz w:val="18"/>
                 <w:color w:val="000000"/>
-                <w:sz w:val="18"/>
               </w:rPr>
               <w:t>First Day at Lynia Finance</w:t>
             </w:r>
@@ -247,8 +257,8 @@
             <w:r>
               <w:rPr>
                 <w:rFonts w:ascii="Times New Roman" w:hAnsi="Times New Roman"/>
+                <w:sz w:val="18"/>
                 <w:color w:val="000000"/>
-                <w:sz w:val="18"/>
               </w:rPr>
               <w:t>Onboarding completion, supervisor meetings, company orientation. Learned Lynia's mission: financial inclusion for underbanked Zimbabweans. Reviewed security protocols and company culture.</w:t>
             </w:r>
@@ -265,8 +275,8 @@
             <w:r>
               <w:rPr>
                 <w:rFonts w:ascii="Times New Roman" w:hAnsi="Times New Roman"/>
+                <w:sz w:val="18"/>
                 <w:color w:val="000000"/>
-                <w:sz w:val="18"/>
               </w:rPr>
               <w:t>Professional orientation, org awareness</w:t>
             </w:r>
@@ -274,6 +284,7 @@
         </w:tc>
       </w:tr>
       <w:tr>
+        <w:trPr/>
         <w:tc>
           <w:tcPr>
             <w:tcW w:type="dxa" w:w="2354"/>
@@ -285,8 +296,8 @@
             <w:r>
               <w:rPr>
                 <w:rFonts w:ascii="Times New Roman" w:hAnsi="Times New Roman"/>
+                <w:sz w:val="18"/>
                 <w:color w:val="000000"/>
-                <w:sz w:val="18"/>
               </w:rPr>
               <w:t>2 Oct</w:t>
             </w:r>
@@ -303,8 +314,8 @@
             <w:r>
               <w:rPr>
                 <w:rFonts w:ascii="Times New Roman" w:hAnsi="Times New Roman"/>
+                <w:sz w:val="18"/>
                 <w:color w:val="000000"/>
-                <w:sz w:val="18"/>
               </w:rPr>
               <w:t>Department Rotation</w:t>
             </w:r>
@@ -321,8 +332,8 @@
             <w:r>
               <w:rPr>
                 <w:rFonts w:ascii="Times New Roman" w:hAnsi="Times New Roman"/>
+                <w:sz w:val="18"/>
                 <w:color w:val="000000"/>
-                <w:sz w:val="18"/>
               </w:rPr>
               <w:t>Visited Engineering, Data Analytics, Operations. Met Data Analytics team (primary supervisors). Reviewed payment architecture, API integrations, and current systems.</w:t>
             </w:r>
@@ -339,8 +350,8 @@
             <w:r>
               <w:rPr>
                 <w:rFonts w:ascii="Times New Roman" w:hAnsi="Times New Roman"/>
+                <w:sz w:val="18"/>
                 <w:color w:val="000000"/>
-                <w:sz w:val="18"/>
               </w:rPr>
               <w:t>System understanding, team dynamics</w:t>
             </w:r>
@@ -348,6 +359,7 @@
         </w:tc>
       </w:tr>
       <w:tr>
+        <w:trPr/>
         <w:tc>
           <w:tcPr>
             <w:tcW w:type="dxa" w:w="2354"/>
@@ -359,8 +371,8 @@
             <w:r>
               <w:rPr>
                 <w:rFonts w:ascii="Times New Roman" w:hAnsi="Times New Roman"/>
+                <w:sz w:val="18"/>
                 <w:color w:val="000000"/>
-                <w:sz w:val="18"/>
               </w:rPr>
               <w:t>3 Oct</w:t>
             </w:r>
@@ -377,8 +389,8 @@
             <w:r>
               <w:rPr>
                 <w:rFonts w:ascii="Times New Roman" w:hAnsi="Times New Roman"/>
+                <w:sz w:val="18"/>
                 <w:color w:val="000000"/>
-                <w:sz w:val="18"/>
               </w:rPr>
               <w:t>Technical Briefing</w:t>
             </w:r>
@@ -395,8 +407,8 @@
             <w:r>
               <w:rPr>
                 <w:rFonts w:ascii="Times New Roman" w:hAnsi="Times New Roman"/>
+                <w:sz w:val="18"/>
                 <w:color w:val="000000"/>
-                <w:sz w:val="18"/>
               </w:rPr>
               <w:t>AWS services overview (Lambda, RDS, S3, SQS). Reviewed EcoCash and InnBucks API documentation. Studied payment reconciliation challenges.</w:t>
             </w:r>
@@ -413,8 +425,8 @@
             <w:r>
               <w:rPr>
                 <w:rFonts w:ascii="Times New Roman" w:hAnsi="Times New Roman"/>
+                <w:sz w:val="18"/>
                 <w:color w:val="000000"/>
-                <w:sz w:val="18"/>
               </w:rPr>
               <w:t>AWS services, API analysis, payment systems</w:t>
             </w:r>
@@ -422,6 +434,7 @@
         </w:tc>
       </w:tr>
       <w:tr>
+        <w:trPr/>
         <w:tc>
           <w:tcPr>
             <w:tcW w:type="dxa" w:w="2354"/>
@@ -433,8 +446,8 @@
             <w:r>
               <w:rPr>
                 <w:rFonts w:ascii="Times New Roman" w:hAnsi="Times New Roman"/>
+                <w:sz w:val="18"/>
                 <w:color w:val="000000"/>
-                <w:sz w:val="18"/>
               </w:rPr>
               <w:t>4 Oct</w:t>
             </w:r>
@@ -451,8 +464,8 @@
             <w:r>
               <w:rPr>
                 <w:rFonts w:ascii="Times New Roman" w:hAnsi="Times New Roman"/>
+                <w:sz w:val="18"/>
                 <w:color w:val="000000"/>
-                <w:sz w:val="18"/>
               </w:rPr>
               <w:t>Business Strategy</w:t>
             </w:r>
@@ -469,8 +482,8 @@
             <w:r>
               <w:rPr>
                 <w:rFonts w:ascii="Times New Roman" w:hAnsi="Times New Roman"/>
+                <w:sz w:val="18"/>
                 <w:color w:val="000000"/>
-                <w:sz w:val="18"/>
               </w:rPr>
               <w:t>Management strategy session on objectives, product roadmap, regulatory requirements (RBZ). Understood fintech compliance landscape.</w:t>
             </w:r>
@@ -487,8 +500,8 @@
             <w:r>
               <w:rPr>
                 <w:rFonts w:ascii="Times New Roman" w:hAnsi="Times New Roman"/>
+                <w:sz w:val="18"/>
                 <w:color w:val="000000"/>
-                <w:sz w:val="18"/>
               </w:rPr>
               <w:t>Business strategy, regulatory awareness</w:t>
             </w:r>
@@ -496,6 +509,7 @@
         </w:tc>
       </w:tr>
       <w:tr>
+        <w:trPr/>
         <w:tc>
           <w:tcPr>
             <w:tcW w:type="dxa" w:w="2354"/>
@@ -507,8 +521,8 @@
             <w:r>
               <w:rPr>
                 <w:rFonts w:ascii="Times New Roman" w:hAnsi="Times New Roman"/>
+                <w:sz w:val="18"/>
                 <w:color w:val="000000"/>
-                <w:sz w:val="18"/>
               </w:rPr>
               <w:t>5 Oct (Fri)</w:t>
             </w:r>
@@ -525,8 +539,8 @@
             <w:r>
               <w:rPr>
                 <w:rFonts w:ascii="Times New Roman" w:hAnsi="Times New Roman"/>
+                <w:sz w:val="18"/>
                 <w:color w:val="000000"/>
-                <w:sz w:val="18"/>
               </w:rPr>
               <w:t>Week 1 Review</w:t>
             </w:r>
@@ -543,8 +557,8 @@
             <w:r>
               <w:rPr>
                 <w:rFonts w:ascii="Times New Roman" w:hAnsi="Times New Roman"/>
+                <w:sz w:val="18"/>
                 <w:color w:val="000000"/>
-                <w:sz w:val="18"/>
               </w:rPr>
               <w:t>Supervisor review of first week. Planned research meetings with four institutions. Established weekly meeting schedule.</w:t>
             </w:r>
@@ -561,8 +575,8 @@
             <w:r>
               <w:rPr>
                 <w:rFonts w:ascii="Times New Roman" w:hAnsi="Times New Roman"/>
+                <w:sz w:val="18"/>
                 <w:color w:val="000000"/>
-                <w:sz w:val="18"/>
               </w:rPr>
               <w:t>Research planning, communication</w:t>
             </w:r>
@@ -570,6 +584,7 @@
         </w:tc>
       </w:tr>
       <w:tr>
+        <w:trPr/>
         <w:tc>
           <w:tcPr>
             <w:tcW w:type="dxa" w:w="2354"/>
@@ -581,8 +596,8 @@
             <w:r>
               <w:rPr>
                 <w:rFonts w:ascii="Times New Roman" w:hAnsi="Times New Roman"/>
+                <w:sz w:val="18"/>
                 <w:color w:val="000000"/>
-                <w:sz w:val="18"/>
               </w:rPr>
               <w:t>6-7 Oct</w:t>
             </w:r>
@@ -599,8 +614,8 @@
             <w:r>
               <w:rPr>
                 <w:rFonts w:ascii="Times New Roman" w:hAnsi="Times New Roman"/>
+                <w:sz w:val="18"/>
                 <w:color w:val="000000"/>
-                <w:sz w:val="18"/>
               </w:rPr>
               <w:t>EcoCash Prep</w:t>
             </w:r>
@@ -617,8 +632,8 @@
             <w:r>
               <w:rPr>
                 <w:rFonts w:ascii="Times New Roman" w:hAnsi="Times New Roman"/>
+                <w:sz w:val="18"/>
                 <w:color w:val="000000"/>
-                <w:sz w:val="18"/>
               </w:rPr>
               <w:t>Reviewed extensive API documentation. Studied Java/Spring architecture, PostgreSQL design. Prepared detailed meeting questions. Researched competitor landscape.</w:t>
             </w:r>
@@ -635,8 +650,8 @@
             <w:r>
               <w:rPr>
                 <w:rFonts w:ascii="Times New Roman" w:hAnsi="Times New Roman"/>
+                <w:sz w:val="18"/>
                 <w:color w:val="000000"/>
-                <w:sz w:val="18"/>
               </w:rPr>
               <w:t>API documentation, technical research</w:t>
             </w:r>
@@ -644,6 +659,7 @@
         </w:tc>
       </w:tr>
       <w:tr>
+        <w:trPr/>
         <w:tc>
           <w:tcPr>
             <w:tcW w:type="dxa" w:w="2354"/>
@@ -655,8 +671,8 @@
             <w:r>
               <w:rPr>
                 <w:rFonts w:ascii="Times New Roman" w:hAnsi="Times New Roman"/>
+                <w:sz w:val="18"/>
                 <w:color w:val="000000"/>
-                <w:sz w:val="18"/>
               </w:rPr>
               <w:t>8 Oct (Wed)</w:t>
             </w:r>
@@ -673,8 +689,8 @@
             <w:r>
               <w:rPr>
                 <w:rFonts w:ascii="Times New Roman" w:hAnsi="Times New Roman"/>
+                <w:sz w:val="18"/>
                 <w:color w:val="000000"/>
-                <w:sz w:val="18"/>
               </w:rPr>
               <w:t>ECOCASH MEETING</w:t>
             </w:r>
@@ -691,8 +707,8 @@
             <w:r>
               <w:rPr>
                 <w:rFonts w:ascii="Times New Roman" w:hAnsi="Times New Roman"/>
+                <w:sz w:val="18"/>
                 <w:color w:val="000000"/>
-                <w:sz w:val="18"/>
               </w:rPr>
               <w:t>Econet HQ (2 hours). Learned: Java/Spring/PostgreSQL, 94-97% success rates, 2-5% fees, async processing, 24-48hr reconciliation, peak volumes 6-9am/5-8pm. Discussed retry mechanisms and error codes.</w:t>
             </w:r>
@@ -709,8 +725,8 @@
             <w:r>
               <w:rPr>
                 <w:rFonts w:ascii="Times New Roman" w:hAnsi="Times New Roman"/>
+                <w:sz w:val="18"/>
                 <w:color w:val="000000"/>
-                <w:sz w:val="18"/>
               </w:rPr>
               <w:t>Payment architecture, negotiation</w:t>
             </w:r>
@@ -718,6 +734,7 @@
         </w:tc>
       </w:tr>
       <w:tr>
+        <w:trPr/>
         <w:tc>
           <w:tcPr>
             <w:tcW w:type="dxa" w:w="2354"/>
@@ -729,8 +746,8 @@
             <w:r>
               <w:rPr>
                 <w:rFonts w:ascii="Times New Roman" w:hAnsi="Times New Roman"/>
+                <w:sz w:val="18"/>
                 <w:color w:val="000000"/>
-                <w:sz w:val="18"/>
               </w:rPr>
               <w:t>9 Oct</w:t>
             </w:r>
@@ -747,8 +764,8 @@
             <w:r>
               <w:rPr>
                 <w:rFonts w:ascii="Times New Roman" w:hAnsi="Times New Roman"/>
+                <w:sz w:val="18"/>
                 <w:color w:val="000000"/>
-                <w:sz w:val="18"/>
               </w:rPr>
               <w:t>EcoCash Analysis</w:t>
             </w:r>
@@ -765,8 +782,8 @@
             <w:r>
               <w:rPr>
                 <w:rFonts w:ascii="Times New Roman" w:hAnsi="Times New Roman"/>
+                <w:sz w:val="18"/>
                 <w:color w:val="000000"/>
-                <w:sz w:val="18"/>
               </w:rPr>
               <w:t>Documented findings comprehensively. Analyzed integration challenges: async handling, timeouts, credential security. Created recommendations.</w:t>
             </w:r>
@@ -783,8 +800,8 @@
             <w:r>
               <w:rPr>
                 <w:rFonts w:ascii="Times New Roman" w:hAnsi="Times New Roman"/>
+                <w:sz w:val="18"/>
                 <w:color w:val="000000"/>
-                <w:sz w:val="18"/>
               </w:rPr>
               <w:t>Technical analysis, documentation</w:t>
             </w:r>
@@ -792,6 +809,7 @@
         </w:tc>
       </w:tr>
       <w:tr>
+        <w:trPr/>
         <w:tc>
           <w:tcPr>
             <w:tcW w:type="dxa" w:w="2354"/>
@@ -803,8 +821,8 @@
             <w:r>
               <w:rPr>
                 <w:rFonts w:ascii="Times New Roman" w:hAnsi="Times New Roman"/>
+                <w:sz w:val="18"/>
                 <w:color w:val="000000"/>
-                <w:sz w:val="18"/>
               </w:rPr>
               <w:t>13 Oct (Mon)</w:t>
             </w:r>
@@ -821,8 +839,8 @@
             <w:r>
               <w:rPr>
                 <w:rFonts w:ascii="Times New Roman" w:hAnsi="Times New Roman"/>
+                <w:sz w:val="18"/>
                 <w:color w:val="000000"/>
-                <w:sz w:val="18"/>
               </w:rPr>
               <w:t>InnBucks Prep</w:t>
             </w:r>
@@ -839,8 +857,8 @@
             <w:r>
               <w:rPr>
                 <w:rFonts w:ascii="Times New Roman" w:hAnsi="Times New Roman"/>
+                <w:sz w:val="18"/>
                 <w:color w:val="000000"/>
-                <w:sz w:val="18"/>
               </w:rPr>
               <w:t>Reviewed modern RESTful architecture. Studied OAuth 2.0, webhook notifications. Analyzed business positioning vs EcoCash.</w:t>
             </w:r>
@@ -857,8 +875,8 @@
             <w:r>
               <w:rPr>
                 <w:rFonts w:ascii="Times New Roman" w:hAnsi="Times New Roman"/>
+                <w:sz w:val="18"/>
                 <w:color w:val="000000"/>
-                <w:sz w:val="18"/>
               </w:rPr>
               <w:t>Modern architecture, OAuth concepts</w:t>
             </w:r>
@@ -866,6 +884,7 @@
         </w:tc>
       </w:tr>
       <w:tr>
+        <w:trPr/>
         <w:tc>
           <w:tcPr>
             <w:tcW w:type="dxa" w:w="2354"/>
@@ -877,8 +896,8 @@
             <w:r>
               <w:rPr>
                 <w:rFonts w:ascii="Times New Roman" w:hAnsi="Times New Roman"/>
+                <w:sz w:val="18"/>
                 <w:color w:val="000000"/>
-                <w:sz w:val="18"/>
               </w:rPr>
               <w:t>15 Oct (Wed)</w:t>
             </w:r>
@@ -895,8 +914,8 @@
             <w:r>
               <w:rPr>
                 <w:rFonts w:ascii="Times New Roman" w:hAnsi="Times New Roman"/>
+                <w:sz w:val="18"/>
                 <w:color w:val="000000"/>
-                <w:sz w:val="18"/>
               </w:rPr>
               <w:t>INNBUCKS MEETING</w:t>
             </w:r>
@@ -913,8 +932,8 @@
             <w:r>
               <w:rPr>
                 <w:rFonts w:ascii="Times New Roman" w:hAnsi="Times New Roman"/>
+                <w:sz w:val="18"/>
                 <w:color w:val="000000"/>
-                <w:sz w:val="18"/>
               </w:rPr>
               <w:t>Innstrive offices (1.5 hours). Learned: Node.js, OAuth 2.0, JSON, webhooks, 91-93% success rates, 100 req/min limit. Discussed geographic liquidity challenges.</w:t>
             </w:r>
@@ -931,8 +950,8 @@
             <w:r>
               <w:rPr>
                 <w:rFonts w:ascii="Times New Roman" w:hAnsi="Times New Roman"/>
+                <w:sz w:val="18"/>
                 <w:color w:val="000000"/>
-                <w:sz w:val="18"/>
               </w:rPr>
               <w:t>Modern API design, webhook integration</w:t>
             </w:r>
@@ -940,6 +959,7 @@
         </w:tc>
       </w:tr>
       <w:tr>
+        <w:trPr/>
         <w:tc>
           <w:tcPr>
             <w:tcW w:type="dxa" w:w="2354"/>
@@ -951,8 +971,8 @@
             <w:r>
               <w:rPr>
                 <w:rFonts w:ascii="Times New Roman" w:hAnsi="Times New Roman"/>
+                <w:sz w:val="18"/>
                 <w:color w:val="000000"/>
-                <w:sz w:val="18"/>
               </w:rPr>
               <w:t>16 Oct</w:t>
             </w:r>
@@ -969,8 +989,8 @@
             <w:r>
               <w:rPr>
                 <w:rFonts w:ascii="Times New Roman" w:hAnsi="Times New Roman"/>
+                <w:sz w:val="18"/>
                 <w:color w:val="000000"/>
-                <w:sz w:val="18"/>
               </w:rPr>
               <w:t>InnBucks Analysis</w:t>
             </w:r>
@@ -987,8 +1007,8 @@
             <w:r>
               <w:rPr>
                 <w:rFonts w:ascii="Times New Roman" w:hAnsi="Times New Roman"/>
+                <w:sz w:val="18"/>
                 <w:color w:val="000000"/>
-                <w:sz w:val="18"/>
               </w:rPr>
               <w:t>Comparative EcoCash vs InnBucks analysis. Evaluated strengths, weaknesses, business models. Recommended secondary provider strategy.</w:t>
             </w:r>
@@ -1005,8 +1025,8 @@
             <w:r>
               <w:rPr>
                 <w:rFonts w:ascii="Times New Roman" w:hAnsi="Times New Roman"/>
+                <w:sz w:val="18"/>
                 <w:color w:val="000000"/>
-                <w:sz w:val="18"/>
               </w:rPr>
               <w:t>Comparative analysis, business assessment</w:t>
             </w:r>
@@ -1024,6 +1044,7 @@
           <w:rFonts w:ascii="Times New Roman" w:hAnsi="Times New Roman"/>
           <w:b/>
           <w:sz w:val="24"/>
+          <w:color w:val="000000"/>
         </w:rPr>
         <w:t>NOVEMBER 2025</w:t>
       </w:r>
@@ -1041,16 +1062,18 @@
         <w:gridCol w:w="2354"/>
       </w:tblGrid>
       <w:tr>
+        <w:trPr/>
         <w:tc>
           <w:tcPr>
             <w:tcW w:type="dxa" w:w="2354"/>
           </w:tcPr>
           <w:p>
+            <w:pPr/>
             <w:r>
               <w:rPr>
                 <w:b/>
+                <w:sz w:val="20"/>
                 <w:color w:val="000000"/>
-                <w:sz w:val="20"/>
               </w:rPr>
               <w:t>Date</w:t>
             </w:r>
@@ -1061,11 +1084,12 @@
             <w:tcW w:type="dxa" w:w="2354"/>
           </w:tcPr>
           <w:p>
+            <w:pPr/>
             <w:r>
               <w:rPr>
                 <w:b/>
+                <w:sz w:val="20"/>
                 <w:color w:val="000000"/>
-                <w:sz w:val="20"/>
               </w:rPr>
               <w:t>Activity/Task</w:t>
             </w:r>
@@ -1076,11 +1100,12 @@
             <w:tcW w:type="dxa" w:w="2354"/>
           </w:tcPr>
           <w:p>
+            <w:pPr/>
             <w:r>
               <w:rPr>
                 <w:b/>
+                <w:sz w:val="20"/>
                 <w:color w:val="000000"/>
-                <w:sz w:val="20"/>
               </w:rPr>
               <w:t>Details &amp; Findings</w:t>
             </w:r>
@@ -1091,11 +1116,12 @@
             <w:tcW w:type="dxa" w:w="2354"/>
           </w:tcPr>
           <w:p>
+            <w:pPr/>
             <w:r>
               <w:rPr>
                 <w:b/>
+                <w:sz w:val="20"/>
                 <w:color w:val="000000"/>
-                <w:sz w:val="20"/>
               </w:rPr>
               <w:t>Skills Developed</w:t>
             </w:r>
@@ -1103,6 +1129,7 @@
         </w:tc>
       </w:tr>
       <w:tr>
+        <w:trPr/>
         <w:tc>
           <w:tcPr>
             <w:tcW w:type="dxa" w:w="2354"/>
@@ -1113,8 +1140,8 @@
             </w:pPr>
             <w:r>
               <w:rPr>
+                <w:sz w:val="18"/>
                 <w:color w:val="000000"/>
-                <w:sz w:val="18"/>
               </w:rPr>
               <w:t>3 Nov (Mon)</w:t>
             </w:r>
@@ -1130,8 +1157,8 @@
             </w:pPr>
             <w:r>
               <w:rPr>
+                <w:sz w:val="18"/>
                 <w:color w:val="000000"/>
-                <w:sz w:val="18"/>
               </w:rPr>
               <w:t>Omari Prep</w:t>
             </w:r>
@@ -1147,8 +1174,8 @@
             </w:pPr>
             <w:r>
               <w:rPr>
+                <w:sz w:val="18"/>
                 <w:color w:val="000000"/>
-                <w:sz w:val="18"/>
               </w:rPr>
               <w:t>Researched digital lending platform. Studied ML credit scoring, feature engineering, ensemble methods. Reviewed 85%+ repayment rates in informal sector.</w:t>
             </w:r>
@@ -1164,8 +1191,8 @@
             </w:pPr>
             <w:r>
               <w:rPr>
+                <w:sz w:val="18"/>
                 <w:color w:val="000000"/>
-                <w:sz w:val="18"/>
               </w:rPr>
               <w:t>Credit scoring, ML concepts</w:t>
             </w:r>
@@ -1173,6 +1200,7 @@
         </w:tc>
       </w:tr>
       <w:tr>
+        <w:trPr/>
         <w:tc>
           <w:tcPr>
             <w:tcW w:type="dxa" w:w="2354"/>
@@ -1183,8 +1211,8 @@
             </w:pPr>
             <w:r>
               <w:rPr>
+                <w:sz w:val="18"/>
                 <w:color w:val="000000"/>
-                <w:sz w:val="18"/>
               </w:rPr>
               <w:t>5 Nov (Wed)</w:t>
             </w:r>
@@ -1200,8 +1228,8 @@
             </w:pPr>
             <w:r>
               <w:rPr>
+                <w:sz w:val="18"/>
                 <w:color w:val="000000"/>
-                <w:sz w:val="18"/>
               </w:rPr>
               <w:t>OMARI MEETING</w:t>
             </w:r>
@@ -1217,8 +1245,8 @@
             </w:pPr>
             <w:r>
               <w:rPr>
+                <w:sz w:val="18"/>
                 <w:color w:val="000000"/>
-                <w:sz w:val="18"/>
               </w:rPr>
               <w:t>Omari offices (2 hours). Learned: ML-based scoring, feature engineering, real-time decisions, 85%+ repayment, WhatsApp acquisition, frictionless onboarding. Discussed alternative credit data sources.</w:t>
             </w:r>
@@ -1234,8 +1262,8 @@
             </w:pPr>
             <w:r>
               <w:rPr>
+                <w:sz w:val="18"/>
                 <w:color w:val="000000"/>
-                <w:sz w:val="18"/>
               </w:rPr>
               <w:t>ML credit assessment, acquisition strategy</w:t>
             </w:r>
@@ -1243,6 +1271,7 @@
         </w:tc>
       </w:tr>
       <w:tr>
+        <w:trPr/>
         <w:tc>
           <w:tcPr>
             <w:tcW w:type="dxa" w:w="2354"/>
@@ -1253,8 +1282,8 @@
             </w:pPr>
             <w:r>
               <w:rPr>
+                <w:sz w:val="18"/>
                 <w:color w:val="000000"/>
-                <w:sz w:val="18"/>
               </w:rPr>
               <w:t>6 Nov</w:t>
             </w:r>
@@ -1270,8 +1299,8 @@
             </w:pPr>
             <w:r>
               <w:rPr>
+                <w:sz w:val="18"/>
                 <w:color w:val="000000"/>
-                <w:sz w:val="18"/>
               </w:rPr>
               <w:t>Omari Analysis</w:t>
             </w:r>
@@ -1287,8 +1316,8 @@
             </w:pPr>
             <w:r>
               <w:rPr>
+                <w:sz w:val="18"/>
                 <w:color w:val="000000"/>
-                <w:sz w:val="18"/>
               </w:rPr>
               <w:t>Competitive benchmarking vs Lynia. SWOT analysis completed. Identified customer experience strengths and growth factors.</w:t>
             </w:r>
@@ -1304,8 +1333,8 @@
             </w:pPr>
             <w:r>
               <w:rPr>
+                <w:sz w:val="18"/>
                 <w:color w:val="000000"/>
-                <w:sz w:val="18"/>
               </w:rPr>
               <w:t>Competitive analysis, benchmarking</w:t>
             </w:r>
@@ -1313,6 +1342,7 @@
         </w:tc>
       </w:tr>
       <w:tr>
+        <w:trPr/>
         <w:tc>
           <w:tcPr>
             <w:tcW w:type="dxa" w:w="2354"/>
@@ -1323,8 +1353,8 @@
             </w:pPr>
             <w:r>
               <w:rPr>
+                <w:sz w:val="18"/>
                 <w:color w:val="000000"/>
-                <w:sz w:val="18"/>
               </w:rPr>
               <w:t>10 Nov (Mon)</w:t>
             </w:r>
@@ -1340,8 +1370,8 @@
             </w:pPr>
             <w:r>
               <w:rPr>
+                <w:sz w:val="18"/>
                 <w:color w:val="000000"/>
-                <w:sz w:val="18"/>
               </w:rPr>
               <w:t>SSB Prep</w:t>
             </w:r>
@@ -1357,8 +1387,8 @@
             </w:pPr>
             <w:r>
               <w:rPr>
+                <w:sz w:val="18"/>
                 <w:color w:val="000000"/>
-                <w:sz w:val="18"/>
               </w:rPr>
               <w:t>Researched salary-linked lending model. Studied RBZ regulations. Reviewed civil service integration requirements.</w:t>
             </w:r>
@@ -1374,8 +1404,8 @@
             </w:pPr>
             <w:r>
               <w:rPr>
+                <w:sz w:val="18"/>
                 <w:color w:val="000000"/>
-                <w:sz w:val="18"/>
               </w:rPr>
               <w:t>Government lending, regulatory research</w:t>
             </w:r>
@@ -1383,6 +1413,7 @@
         </w:tc>
       </w:tr>
       <w:tr>
+        <w:trPr/>
         <w:tc>
           <w:tcPr>
             <w:tcW w:type="dxa" w:w="2354"/>
@@ -1393,8 +1424,8 @@
             </w:pPr>
             <w:r>
               <w:rPr>
+                <w:sz w:val="18"/>
                 <w:color w:val="000000"/>
-                <w:sz w:val="18"/>
               </w:rPr>
               <w:t>12 Nov (Wed)</w:t>
             </w:r>
@@ -1410,8 +1441,8 @@
             </w:pPr>
             <w:r>
               <w:rPr>
+                <w:sz w:val="18"/>
                 <w:color w:val="000000"/>
-                <w:sz w:val="18"/>
               </w:rPr>
               <w:t>SSB MEETING</w:t>
             </w:r>
@@ -1427,8 +1458,8 @@
             </w:pPr>
             <w:r>
               <w:rPr>
+                <w:sz w:val="18"/>
                 <w:color w:val="000000"/>
-                <w:sz w:val="18"/>
               </w:rPr>
               <w:t>SSB HQ (2.5 hours). Learned: salary deduction integration, 300,000+ civil servants market, near-zero defaults, legacy systems, modernization opportunities. Discussed partnership potential.</w:t>
             </w:r>
@@ -1444,8 +1475,8 @@
             </w:pPr>
             <w:r>
               <w:rPr>
+                <w:sz w:val="18"/>
                 <w:color w:val="000000"/>
-                <w:sz w:val="18"/>
               </w:rPr>
               <w:t>Government systems, salary-linked lending</w:t>
             </w:r>
@@ -1453,6 +1484,7 @@
         </w:tc>
       </w:tr>
       <w:tr>
+        <w:trPr/>
         <w:tc>
           <w:tcPr>
             <w:tcW w:type="dxa" w:w="2354"/>
@@ -1463,8 +1495,8 @@
             </w:pPr>
             <w:r>
               <w:rPr>
+                <w:sz w:val="18"/>
                 <w:color w:val="000000"/>
-                <w:sz w:val="18"/>
               </w:rPr>
               <w:t>13 Nov</w:t>
             </w:r>
@@ -1480,8 +1512,8 @@
             </w:pPr>
             <w:r>
               <w:rPr>
+                <w:sz w:val="18"/>
                 <w:color w:val="000000"/>
-                <w:sz w:val="18"/>
               </w:rPr>
               <w:t>SSB Analysis</w:t>
             </w:r>
@@ -1497,8 +1529,8 @@
             </w:pPr>
             <w:r>
               <w:rPr>
+                <w:sz w:val="18"/>
                 <w:color w:val="000000"/>
-                <w:sz w:val="18"/>
               </w:rPr>
               <w:t>Documented findings. Assessed market opportunity and competitive positioning. Created partnership implementation roadmap.</w:t>
             </w:r>
@@ -1514,8 +1546,8 @@
             </w:pPr>
             <w:r>
               <w:rPr>
+                <w:sz w:val="18"/>
                 <w:color w:val="000000"/>
-                <w:sz w:val="18"/>
               </w:rPr>
               <w:t>Strategic planning, market analysis</w:t>
             </w:r>
@@ -1533,6 +1565,7 @@
           <w:rFonts w:ascii="Times New Roman" w:hAnsi="Times New Roman"/>
           <w:b/>
           <w:sz w:val="24"/>
+          <w:color w:val="000000"/>
         </w:rPr>
         <w:t>DECEMBER 2025</w:t>
       </w:r>
@@ -1550,16 +1583,18 @@
         <w:gridCol w:w="2354"/>
       </w:tblGrid>
       <w:tr>
+        <w:trPr/>
         <w:tc>
           <w:tcPr>
             <w:tcW w:type="dxa" w:w="2354"/>
           </w:tcPr>
           <w:p>
+            <w:pPr/>
             <w:r>
               <w:rPr>
                 <w:b/>
+                <w:sz w:val="20"/>
                 <w:color w:val="000000"/>
-                <w:sz w:val="20"/>
               </w:rPr>
               <w:t>Date</w:t>
             </w:r>
@@ -1570,11 +1605,12 @@
             <w:tcW w:type="dxa" w:w="2354"/>
           </w:tcPr>
           <w:p>
+            <w:pPr/>
             <w:r>
               <w:rPr>
                 <w:b/>
+                <w:sz w:val="20"/>
                 <w:color w:val="000000"/>
-                <w:sz w:val="20"/>
               </w:rPr>
               <w:t>Activity/Task</w:t>
             </w:r>
@@ -1585,11 +1621,12 @@
             <w:tcW w:type="dxa" w:w="2354"/>
           </w:tcPr>
           <w:p>
+            <w:pPr/>
             <w:r>
               <w:rPr>
                 <w:b/>
+                <w:sz w:val="20"/>
                 <w:color w:val="000000"/>
-                <w:sz w:val="20"/>
               </w:rPr>
               <w:t>Details &amp; Findings</w:t>
             </w:r>
@@ -1600,11 +1637,12 @@
             <w:tcW w:type="dxa" w:w="2354"/>
           </w:tcPr>
           <w:p>
+            <w:pPr/>
             <w:r>
               <w:rPr>
                 <w:b/>
+                <w:sz w:val="20"/>
                 <w:color w:val="000000"/>
-                <w:sz w:val="20"/>
               </w:rPr>
               <w:t>Skills Developed</w:t>
             </w:r>
@@ -1612,6 +1650,7 @@
         </w:tc>
       </w:tr>
       <w:tr>
+        <w:trPr/>
         <w:tc>
           <w:tcPr>
             <w:tcW w:type="dxa" w:w="2354"/>
@@ -1622,8 +1661,8 @@
             </w:pPr>
             <w:r>
               <w:rPr>
+                <w:sz w:val="18"/>
                 <w:color w:val="000000"/>
-                <w:sz w:val="18"/>
               </w:rPr>
               <w:t>1 Dec</w:t>
             </w:r>
@@ -1639,8 +1678,8 @@
             </w:pPr>
             <w:r>
               <w:rPr>
+                <w:sz w:val="18"/>
                 <w:color w:val="000000"/>
-                <w:sz w:val="18"/>
               </w:rPr>
               <w:t>Research Summary &amp; Project Start</w:t>
             </w:r>
@@ -1656,8 +1695,8 @@
             </w:pPr>
             <w:r>
               <w:rPr>
+                <w:sz w:val="18"/>
                 <w:color w:val="000000"/>
-                <w:sz w:val="18"/>
               </w:rPr>
               <w:t>Consolidated all research findings. Initiated Payment Reconciliation System. Designed AWS Lambda/SQS distributed architecture. Technical design documented.</w:t>
             </w:r>
@@ -1673,8 +1712,8 @@
             </w:pPr>
             <w:r>
               <w:rPr>
+                <w:sz w:val="18"/>
                 <w:color w:val="000000"/>
-                <w:sz w:val="18"/>
               </w:rPr>
               <w:t>Project management, architecture design</w:t>
             </w:r>
@@ -1682,6 +1721,7 @@
         </w:tc>
       </w:tr>
       <w:tr>
+        <w:trPr/>
         <w:tc>
           <w:tcPr>
             <w:tcW w:type="dxa" w:w="2354"/>
@@ -1692,8 +1732,8 @@
             </w:pPr>
             <w:r>
               <w:rPr>
+                <w:sz w:val="18"/>
                 <w:color w:val="000000"/>
-                <w:sz w:val="18"/>
               </w:rPr>
               <w:t>2-5 Dec</w:t>
             </w:r>
@@ -1709,8 +1749,8 @@
             </w:pPr>
             <w:r>
               <w:rPr>
+                <w:sz w:val="18"/>
                 <w:color w:val="000000"/>
-                <w:sz w:val="18"/>
               </w:rPr>
               <w:t>Reconciliation System Dev</w:t>
             </w:r>
@@ -1726,8 +1766,8 @@
             </w:pPr>
             <w:r>
               <w:rPr>
+                <w:sz w:val="18"/>
                 <w:color w:val="000000"/>
-                <w:sz w:val="18"/>
               </w:rPr>
               <w:t>Designed components: Transaction State Management, Reconciliation Engine, Callback Handlers, Discrepancy Detection. Began Node.js/TypeScript implementation.</w:t>
             </w:r>
@@ -1743,8 +1783,8 @@
             </w:pPr>
             <w:r>
               <w:rPr>
+                <w:sz w:val="18"/>
                 <w:color w:val="000000"/>
-                <w:sz w:val="18"/>
               </w:rPr>
               <w:t>System architecture, Node.js development</w:t>
             </w:r>
@@ -1752,6 +1792,7 @@
         </w:tc>
       </w:tr>
       <w:tr>
+        <w:trPr/>
         <w:tc>
           <w:tcPr>
             <w:tcW w:type="dxa" w:w="2354"/>
@@ -1762,8 +1803,8 @@
             </w:pPr>
             <w:r>
               <w:rPr>
+                <w:sz w:val="18"/>
                 <w:color w:val="000000"/>
-                <w:sz w:val="18"/>
               </w:rPr>
               <w:t>8-12 Dec</w:t>
             </w:r>
@@ -1779,8 +1820,8 @@
             </w:pPr>
             <w:r>
               <w:rPr>
+                <w:sz w:val="18"/>
                 <w:color w:val="000000"/>
-                <w:sz w:val="18"/>
               </w:rPr>
               <w:t>WhatsApp Integration</w:t>
             </w:r>
@@ -1796,8 +1837,8 @@
             </w:pPr>
             <w:r>
               <w:rPr>
+                <w:sz w:val="18"/>
                 <w:color w:val="000000"/>
-                <w:sz w:val="18"/>
               </w:rPr>
               <w:t>Connected live WhatsApp Business number. Implemented runtime verification, health checks. Integrated AWS Secrets Manager for secure credentials.</w:t>
             </w:r>
@@ -1813,8 +1854,8 @@
             </w:pPr>
             <w:r>
               <w:rPr>
+                <w:sz w:val="18"/>
                 <w:color w:val="000000"/>
-                <w:sz w:val="18"/>
               </w:rPr>
               <w:t>WhatsApp API, credential management</w:t>
             </w:r>
@@ -1822,6 +1863,7 @@
         </w:tc>
       </w:tr>
       <w:tr>
+        <w:trPr/>
         <w:tc>
           <w:tcPr>
             <w:tcW w:type="dxa" w:w="2354"/>
@@ -1832,8 +1874,8 @@
             </w:pPr>
             <w:r>
               <w:rPr>
+                <w:sz w:val="18"/>
                 <w:color w:val="000000"/>
-                <w:sz w:val="18"/>
               </w:rPr>
               <w:t>15 Dec</w:t>
             </w:r>
@@ -1849,8 +1891,8 @@
             </w:pPr>
             <w:r>
               <w:rPr>
+                <w:sz w:val="18"/>
                 <w:color w:val="000000"/>
-                <w:sz w:val="18"/>
               </w:rPr>
               <w:t>Mid-Point Review</w:t>
             </w:r>
@@ -1866,8 +1908,8 @@
             </w:pPr>
             <w:r>
               <w:rPr>
+                <w:sz w:val="18"/>
                 <w:color w:val="000000"/>
-                <w:sz w:val="18"/>
               </w:rPr>
               <w:t>Comprehensive supervisor review. All research completed. Discussed 2026 objectives and progress assessment.</w:t>
             </w:r>
@@ -1883,8 +1925,8 @@
             </w:pPr>
             <w:r>
               <w:rPr>
+                <w:sz w:val="18"/>
                 <w:color w:val="000000"/>
-                <w:sz w:val="18"/>
               </w:rPr>
               <w:t>Reflective practice, communication</w:t>
             </w:r>
@@ -1902,6 +1944,7 @@
           <w:rFonts w:ascii="Times New Roman" w:hAnsi="Times New Roman"/>
           <w:b/>
           <w:sz w:val="24"/>
+          <w:color w:val="000000"/>
         </w:rPr>
         <w:t>JANUARY 2026</w:t>
       </w:r>
@@ -1919,16 +1962,18 @@
         <w:gridCol w:w="2354"/>
       </w:tblGrid>
       <w:tr>
+        <w:trPr/>
         <w:tc>
           <w:tcPr>
             <w:tcW w:type="dxa" w:w="2354"/>
           </w:tcPr>
           <w:p>
+            <w:pPr/>
             <w:r>
               <w:rPr>
                 <w:b/>
+                <w:sz w:val="20"/>
                 <w:color w:val="000000"/>
-                <w:sz w:val="20"/>
               </w:rPr>
               <w:t>Date</w:t>
             </w:r>
@@ -1939,11 +1984,12 @@
             <w:tcW w:type="dxa" w:w="2354"/>
           </w:tcPr>
           <w:p>
+            <w:pPr/>
             <w:r>
               <w:rPr>
                 <w:b/>
+                <w:sz w:val="20"/>
                 <w:color w:val="000000"/>
-                <w:sz w:val="20"/>
               </w:rPr>
               <w:t>Activity/Task</w:t>
             </w:r>
@@ -1954,11 +2000,12 @@
             <w:tcW w:type="dxa" w:w="2354"/>
           </w:tcPr>
           <w:p>
+            <w:pPr/>
             <w:r>
               <w:rPr>
                 <w:b/>
+                <w:sz w:val="20"/>
                 <w:color w:val="000000"/>
-                <w:sz w:val="20"/>
               </w:rPr>
               <w:t>Details &amp; Findings</w:t>
             </w:r>
@@ -1969,11 +2016,12 @@
             <w:tcW w:type="dxa" w:w="2354"/>
           </w:tcPr>
           <w:p>
+            <w:pPr/>
             <w:r>
               <w:rPr>
                 <w:b/>
+                <w:sz w:val="20"/>
                 <w:color w:val="000000"/>
-                <w:sz w:val="20"/>
               </w:rPr>
               <w:t>Skills Developed</w:t>
             </w:r>
@@ -1981,6 +2029,7 @@
         </w:tc>
       </w:tr>
       <w:tr>
+        <w:trPr/>
         <w:tc>
           <w:tcPr>
             <w:tcW w:type="dxa" w:w="2354"/>
@@ -1991,8 +2040,8 @@
             </w:pPr>
             <w:r>
               <w:rPr>
+                <w:sz w:val="18"/>
                 <w:color w:val="000000"/>
-                <w:sz w:val="18"/>
               </w:rPr>
               <w:t>5-31 Jan</w:t>
             </w:r>
@@ -2008,8 +2057,8 @@
             </w:pPr>
             <w:r>
               <w:rPr>
+                <w:sz w:val="18"/>
                 <w:color w:val="000000"/>
-                <w:sz w:val="18"/>
               </w:rPr>
               <w:t>Reconciliation Development</w:t>
             </w:r>
@@ -2025,8 +2074,8 @@
             </w:pPr>
             <w:r>
               <w:rPr>
+                <w:sz w:val="18"/>
                 <w:color w:val="000000"/>
-                <w:sz w:val="18"/>
               </w:rPr>
               <w:t>Intensive development phase. Implemented all system components. Achieved 50,000 daily transactions, 99.8% uptime. Comprehensive testing.</w:t>
             </w:r>
@@ -2042,8 +2091,8 @@
             </w:pPr>
             <w:r>
               <w:rPr>
+                <w:sz w:val="18"/>
                 <w:color w:val="000000"/>
-                <w:sz w:val="18"/>
               </w:rPr>
               <w:t>Backend dev, testing, AWS optimization</w:t>
             </w:r>
@@ -2051,6 +2100,7 @@
         </w:tc>
       </w:tr>
       <w:tr>
+        <w:trPr/>
         <w:tc>
           <w:tcPr>
             <w:tcW w:type="dxa" w:w="2354"/>
@@ -2061,8 +2111,8 @@
             </w:pPr>
             <w:r>
               <w:rPr>
+                <w:sz w:val="18"/>
                 <w:color w:val="000000"/>
-                <w:sz w:val="18"/>
               </w:rPr>
               <w:t>15 Jan</w:t>
             </w:r>
@@ -2078,8 +2128,8 @@
             </w:pPr>
             <w:r>
               <w:rPr>
+                <w:sz w:val="18"/>
                 <w:color w:val="000000"/>
-                <w:sz w:val="18"/>
               </w:rPr>
               <w:t>Analytics Dashboard Kickoff</w:t>
             </w:r>
@@ -2095,8 +2145,8 @@
             </w:pPr>
             <w:r>
               <w:rPr>
+                <w:sz w:val="18"/>
                 <w:color w:val="000000"/>
-                <w:sz w:val="18"/>
               </w:rPr>
               <w:t>Gathered requirements from operations, risk, executives. Designed React frontend. Planned Python backend with PostgreSQL/Redis caching.</w:t>
             </w:r>
@@ -2112,8 +2162,8 @@
             </w:pPr>
             <w:r>
               <w:rPr>
+                <w:sz w:val="18"/>
                 <w:color w:val="000000"/>
-                <w:sz w:val="18"/>
               </w:rPr>
               <w:t>Requirements gathering, frontend/backend design</w:t>
             </w:r>
@@ -2131,6 +2181,7 @@
           <w:rFonts w:ascii="Times New Roman" w:hAnsi="Times New Roman"/>
           <w:b/>
           <w:sz w:val="24"/>
+          <w:color w:val="000000"/>
         </w:rPr>
         <w:t>FEBRUARY 2026</w:t>
       </w:r>
@@ -2148,16 +2199,18 @@
         <w:gridCol w:w="2354"/>
       </w:tblGrid>
       <w:tr>
+        <w:trPr/>
         <w:tc>
           <w:tcPr>
             <w:tcW w:type="dxa" w:w="2354"/>
           </w:tcPr>
           <w:p>
+            <w:pPr/>
             <w:r>
               <w:rPr>
                 <w:b/>
+                <w:sz w:val="20"/>
                 <w:color w:val="000000"/>
-                <w:sz w:val="20"/>
               </w:rPr>
               <w:t>Date</w:t>
             </w:r>
@@ -2168,11 +2221,12 @@
             <w:tcW w:type="dxa" w:w="2354"/>
           </w:tcPr>
           <w:p>
+            <w:pPr/>
             <w:r>
               <w:rPr>
                 <w:b/>
+                <w:sz w:val="20"/>
                 <w:color w:val="000000"/>
-                <w:sz w:val="20"/>
               </w:rPr>
               <w:t>Activity/Task</w:t>
             </w:r>
@@ -2183,11 +2237,12 @@
             <w:tcW w:type="dxa" w:w="2354"/>
           </w:tcPr>
           <w:p>
+            <w:pPr/>
             <w:r>
               <w:rPr>
                 <w:b/>
+                <w:sz w:val="20"/>
                 <w:color w:val="000000"/>
-                <w:sz w:val="20"/>
               </w:rPr>
               <w:t>Details &amp; Findings</w:t>
             </w:r>
@@ -2198,11 +2253,12 @@
             <w:tcW w:type="dxa" w:w="2354"/>
           </w:tcPr>
           <w:p>
+            <w:pPr/>
             <w:r>
               <w:rPr>
                 <w:b/>
+                <w:sz w:val="20"/>
                 <w:color w:val="000000"/>
-                <w:sz w:val="20"/>
               </w:rPr>
               <w:t>Skills Developed</w:t>
             </w:r>
@@ -2210,6 +2266,7 @@
         </w:tc>
       </w:tr>
       <w:tr>
+        <w:trPr/>
         <w:tc>
           <w:tcPr>
             <w:tcW w:type="dxa" w:w="2354"/>
@@ -2220,8 +2277,8 @@
             </w:pPr>
             <w:r>
               <w:rPr>
+                <w:sz w:val="18"/>
                 <w:color w:val="000000"/>
-                <w:sz w:val="18"/>
               </w:rPr>
               <w:t>2-28 Feb</w:t>
             </w:r>
@@ -2237,8 +2294,8 @@
             </w:pPr>
             <w:r>
               <w:rPr>
+                <w:sz w:val="18"/>
                 <w:color w:val="000000"/>
-                <w:sz w:val="18"/>
               </w:rPr>
               <w:t>Dashboard &amp; ETL Pipeline</w:t>
             </w:r>
@@ -2254,8 +2311,8 @@
             </w:pPr>
             <w:r>
               <w:rPr>
+                <w:sz w:val="18"/>
                 <w:color w:val="000000"/>
-                <w:sz w:val="18"/>
               </w:rPr>
               <w:t>Developed analytics dashboard with real-time KPI monitoring. Built ETL pipeline consolidating multi-source data. Apache Airflow orchestration for hourly updates. Dashboard revealed key insights: peak activity 6-9am/5-8pm, 87% repayment rate, 40% lower organic acquisition cost, 65% Harare/Bulawayo concentration.</w:t>
             </w:r>
@@ -2271,8 +2328,8 @@
             </w:pPr>
             <w:r>
               <w:rPr>
+                <w:sz w:val="18"/>
                 <w:color w:val="000000"/>
-                <w:sz w:val="18"/>
               </w:rPr>
               <w:t>ETL design, Apache Airflow, data pipeline architecture</w:t>
             </w:r>
@@ -2290,6 +2347,7 @@
           <w:rFonts w:ascii="Times New Roman" w:hAnsi="Times New Roman"/>
           <w:b/>
           <w:sz w:val="24"/>
+          <w:color w:val="000000"/>
         </w:rPr>
         <w:t>MARCH - MAY 2026</w:t>
       </w:r>
@@ -2307,16 +2365,18 @@
         <w:gridCol w:w="2354"/>
       </w:tblGrid>
       <w:tr>
+        <w:trPr/>
         <w:tc>
           <w:tcPr>
             <w:tcW w:type="dxa" w:w="2354"/>
           </w:tcPr>
           <w:p>
+            <w:pPr/>
             <w:r>
               <w:rPr>
                 <w:b/>
+                <w:sz w:val="20"/>
                 <w:color w:val="000000"/>
-                <w:sz w:val="20"/>
               </w:rPr>
               <w:t>Date</w:t>
             </w:r>
@@ -2327,11 +2387,12 @@
             <w:tcW w:type="dxa" w:w="2354"/>
           </w:tcPr>
           <w:p>
+            <w:pPr/>
             <w:r>
               <w:rPr>
                 <w:b/>
+                <w:sz w:val="20"/>
                 <w:color w:val="000000"/>
-                <w:sz w:val="20"/>
               </w:rPr>
               <w:t>Activity/Task</w:t>
             </w:r>
@@ -2342,11 +2403,12 @@
             <w:tcW w:type="dxa" w:w="2354"/>
           </w:tcPr>
           <w:p>
+            <w:pPr/>
             <w:r>
               <w:rPr>
                 <w:b/>
+                <w:sz w:val="20"/>
                 <w:color w:val="000000"/>
-                <w:sz w:val="20"/>
               </w:rPr>
               <w:t>Details &amp; Findings</w:t>
             </w:r>
@@ -2357,11 +2419,12 @@
             <w:tcW w:type="dxa" w:w="2354"/>
           </w:tcPr>
           <w:p>
+            <w:pPr/>
             <w:r>
               <w:rPr>
                 <w:b/>
+                <w:sz w:val="20"/>
                 <w:color w:val="000000"/>
-                <w:sz w:val="20"/>
               </w:rPr>
               <w:t>Skills Developed</w:t>
             </w:r>
@@ -2369,6 +2432,7 @@
         </w:tc>
       </w:tr>
       <w:tr>
+        <w:trPr/>
         <w:tc>
           <w:tcPr>
             <w:tcW w:type="dxa" w:w="2354"/>
@@ -2379,8 +2443,8 @@
             </w:pPr>
             <w:r>
               <w:rPr>
+                <w:sz w:val="18"/>
                 <w:color w:val="000000"/>
-                <w:sz w:val="18"/>
               </w:rPr>
               <w:t>2-31 Mar</w:t>
             </w:r>
@@ -2396,8 +2460,8 @@
             </w:pPr>
             <w:r>
               <w:rPr>
+                <w:sz w:val="18"/>
                 <w:color w:val="000000"/>
-                <w:sz w:val="18"/>
               </w:rPr>
               <w:t>Testing &amp; Optimization</w:t>
             </w:r>
@@ -2413,8 +2477,8 @@
             </w:pPr>
             <w:r>
               <w:rPr>
+                <w:sz w:val="18"/>
                 <w:color w:val="000000"/>
-                <w:sz w:val="18"/>
               </w:rPr>
               <w:t>Enhanced test coverage across all systems. Fixed bugs including WhatsApp display handling, test session initialization, credential management. Optimized database queries. Enhanced CloudWatch monitoring.</w:t>
             </w:r>
@@ -2430,8 +2494,8 @@
             </w:pPr>
             <w:r>
               <w:rPr>
+                <w:sz w:val="18"/>
                 <w:color w:val="000000"/>
-                <w:sz w:val="18"/>
               </w:rPr>
               <w:t>Testing methodology, debugging, performance optimization</w:t>
             </w:r>
@@ -2439,6 +2503,7 @@
         </w:tc>
       </w:tr>
       <w:tr>
+        <w:trPr/>
         <w:tc>
           <w:tcPr>
             <w:tcW w:type="dxa" w:w="2354"/>
@@ -2449,8 +2514,8 @@
             </w:pPr>
             <w:r>
               <w:rPr>
+                <w:sz w:val="18"/>
                 <w:color w:val="000000"/>
-                <w:sz w:val="18"/>
               </w:rPr>
               <w:t>1-30 Apr</w:t>
             </w:r>
@@ -2466,8 +2531,8 @@
             </w:pPr>
             <w:r>
               <w:rPr>
+                <w:sz w:val="18"/>
                 <w:color w:val="000000"/>
-                <w:sz w:val="18"/>
               </w:rPr>
               <w:t>System Hardening &amp; Deploy</w:t>
             </w:r>
@@ -2483,8 +2548,8 @@
             </w:pPr>
             <w:r>
               <w:rPr>
+                <w:sz w:val="18"/>
                 <w:color w:val="000000"/>
-                <w:sz w:val="18"/>
               </w:rPr>
               <w:t>Refactored CI/CD pipeline removing GitHub secrets. Implemented AWS Secrets Manager. Security audits and compliance verification. Operationalized runbooks. Deployed to production with zero critical incidents.</w:t>
             </w:r>
@@ -2500,8 +2565,8 @@
             </w:pPr>
             <w:r>
               <w:rPr>
+                <w:sz w:val="18"/>
                 <w:color w:val="000000"/>
-                <w:sz w:val="18"/>
               </w:rPr>
               <w:t>CI/CD optimization, security hardening, compliance</w:t>
             </w:r>
@@ -2509,6 +2574,7 @@
         </w:tc>
       </w:tr>
       <w:tr>
+        <w:trPr/>
         <w:tc>
           <w:tcPr>
             <w:tcW w:type="dxa" w:w="2354"/>
@@ -2519,8 +2585,8 @@
             </w:pPr>
             <w:r>
               <w:rPr>
+                <w:sz w:val="18"/>
                 <w:color w:val="000000"/>
-                <w:sz w:val="18"/>
               </w:rPr>
               <w:t>1-7 May</w:t>
             </w:r>
@@ -2536,8 +2602,8 @@
             </w:pPr>
             <w:r>
               <w:rPr>
+                <w:sz w:val="18"/>
                 <w:color w:val="000000"/>
-                <w:sz w:val="18"/>
               </w:rPr>
               <w:t>Completion &amp; Documentation</w:t>
             </w:r>
@@ -2553,8 +2619,8 @@
             </w:pPr>
             <w:r>
               <w:rPr>
+                <w:sz w:val="18"/>
                 <w:color w:val="000000"/>
-                <w:sz w:val="18"/>
               </w:rPr>
               <w:t>Completed all documentation. Conducted knowledge transfer sessions with operations and engineering teams. Prepared final reports. Reflected on overall experience.</w:t>
             </w:r>
@@ -2570,8 +2636,8 @@
             </w:pPr>
             <w:r>
               <w:rPr>
+                <w:sz w:val="18"/>
                 <w:color w:val="000000"/>
-                <w:sz w:val="18"/>
               </w:rPr>
               <w:t>Documentation, knowledge transfer, professional closure</w:t>
             </w:r>
@@ -2589,6 +2655,7 @@
           <w:rFonts w:ascii="Times New Roman" w:hAnsi="Times New Roman"/>
           <w:b/>
           <w:sz w:val="24"/>
+          <w:color w:val="000000"/>
         </w:rPr>
         <w:t>SUMMARY STATISTICS</w:t>
       </w:r>
@@ -2603,6 +2670,7 @@
           <w:rFonts w:ascii="Times New Roman" w:hAnsi="Times New Roman"/>
           <w:b/>
           <w:sz w:val="24"/>
+          <w:color w:val="000000"/>
         </w:rPr>
         <w:t>Physical Research Meetings</w:t>
       </w:r>
@@ -2620,16 +2688,18 @@
         <w:gridCol w:w="2354"/>
       </w:tblGrid>
       <w:tr>
+        <w:trPr/>
         <w:tc>
           <w:tcPr>
             <w:tcW w:type="dxa" w:w="2354"/>
           </w:tcPr>
           <w:p>
+            <w:pPr/>
             <w:r>
               <w:rPr>
                 <w:b/>
+                <w:sz w:val="20"/>
                 <w:color w:val="000000"/>
-                <w:sz w:val="20"/>
               </w:rPr>
               <w:t>Organization</w:t>
             </w:r>
@@ -2640,11 +2710,12 @@
             <w:tcW w:type="dxa" w:w="2354"/>
           </w:tcPr>
           <w:p>
+            <w:pPr/>
             <w:r>
               <w:rPr>
                 <w:b/>
+                <w:sz w:val="20"/>
                 <w:color w:val="000000"/>
-                <w:sz w:val="20"/>
               </w:rPr>
               <w:t>Date</w:t>
             </w:r>
@@ -2655,11 +2726,12 @@
             <w:tcW w:type="dxa" w:w="2354"/>
           </w:tcPr>
           <w:p>
+            <w:pPr/>
             <w:r>
               <w:rPr>
                 <w:b/>
+                <w:sz w:val="20"/>
                 <w:color w:val="000000"/>
-                <w:sz w:val="20"/>
               </w:rPr>
               <w:t>Duration</w:t>
             </w:r>
@@ -2670,11 +2742,12 @@
             <w:tcW w:type="dxa" w:w="2354"/>
           </w:tcPr>
           <w:p>
+            <w:pPr/>
             <w:r>
               <w:rPr>
                 <w:b/>
+                <w:sz w:val="20"/>
                 <w:color w:val="000000"/>
-                <w:sz w:val="20"/>
               </w:rPr>
               <w:t>Key Findings</w:t>
             </w:r>
@@ -2682,6 +2755,7 @@
         </w:tc>
       </w:tr>
       <w:tr>
+        <w:trPr/>
         <w:tc>
           <w:tcPr>
             <w:tcW w:type="dxa" w:w="2354"/>
@@ -2748,6 +2822,7 @@
         </w:tc>
       </w:tr>
       <w:tr>
+        <w:trPr/>
         <w:tc>
           <w:tcPr>
             <w:tcW w:type="dxa" w:w="2354"/>
@@ -2814,6 +2889,7 @@
         </w:tc>
       </w:tr>
       <w:tr>
+        <w:trPr/>
         <w:tc>
           <w:tcPr>
             <w:tcW w:type="dxa" w:w="2354"/>
@@ -2880,6 +2956,7 @@
         </w:tc>
       </w:tr>
       <w:tr>
+        <w:trPr/>
         <w:tc>
           <w:tcPr>
             <w:tcW w:type="dxa" w:w="2354"/>
@@ -2956,6 +3033,7 @@
           <w:rFonts w:ascii="Times New Roman" w:hAnsi="Times New Roman"/>
           <w:b/>
           <w:sz w:val="24"/>
+          <w:color w:val="000000"/>
         </w:rPr>
         <w:t>Technical Projects Completed</w:t>
       </w:r>
@@ -2973,16 +3051,18 @@
         <w:gridCol w:w="2354"/>
       </w:tblGrid>
       <w:tr>
+        <w:trPr/>
         <w:tc>
           <w:tcPr>
             <w:tcW w:type="dxa" w:w="2354"/>
           </w:tcPr>
           <w:p>
+            <w:pPr/>
             <w:r>
               <w:rPr>
                 <w:b/>
+                <w:sz w:val="20"/>
                 <w:color w:val="000000"/>
-                <w:sz w:val="20"/>
               </w:rPr>
               <w:t>Project</w:t>
             </w:r>
@@ -2993,11 +3073,12 @@
             <w:tcW w:type="dxa" w:w="2354"/>
           </w:tcPr>
           <w:p>
+            <w:pPr/>
             <w:r>
               <w:rPr>
                 <w:b/>
+                <w:sz w:val="20"/>
                 <w:color w:val="000000"/>
-                <w:sz w:val="20"/>
               </w:rPr>
               <w:t>Timeline</w:t>
             </w:r>
@@ -3008,11 +3089,12 @@
             <w:tcW w:type="dxa" w:w="2354"/>
           </w:tcPr>
           <w:p>
+            <w:pPr/>
             <w:r>
               <w:rPr>
                 <w:b/>
+                <w:sz w:val="20"/>
                 <w:color w:val="000000"/>
-                <w:sz w:val="20"/>
               </w:rPr>
               <w:t>Technology</w:t>
             </w:r>
@@ -3023,11 +3105,12 @@
             <w:tcW w:type="dxa" w:w="2354"/>
           </w:tcPr>
           <w:p>
+            <w:pPr/>
             <w:r>
               <w:rPr>
                 <w:b/>
+                <w:sz w:val="20"/>
                 <w:color w:val="000000"/>
-                <w:sz w:val="20"/>
               </w:rPr>
               <w:t>Status</w:t>
             </w:r>
@@ -3035,6 +3118,7 @@
         </w:tc>
       </w:tr>
       <w:tr>
+        <w:trPr/>
         <w:tc>
           <w:tcPr>
             <w:tcW w:type="dxa" w:w="2354"/>
@@ -3101,6 +3185,7 @@
         </w:tc>
       </w:tr>
       <w:tr>
+        <w:trPr/>
         <w:tc>
           <w:tcPr>
             <w:tcW w:type="dxa" w:w="2354"/>
@@ -3167,6 +3252,7 @@
         </w:tc>
       </w:tr>
       <w:tr>
+        <w:trPr/>
         <w:tc>
           <w:tcPr>
             <w:tcW w:type="dxa" w:w="2354"/>
@@ -3233,6 +3319,7 @@
         </w:tc>
       </w:tr>
       <w:tr>
+        <w:trPr/>
         <w:tc>
           <w:tcPr>
             <w:tcW w:type="dxa" w:w="2354"/>
@@ -3309,6 +3396,7 @@
           <w:rFonts w:ascii="Times New Roman" w:hAnsi="Times New Roman"/>
           <w:b/>
           <w:sz w:val="24"/>
+          <w:color w:val="000000"/>
         </w:rPr>
         <w:t>CONCLUSIONS</w:t>
       </w:r>
@@ -3322,6 +3410,7 @@
         <w:rPr>
           <w:rFonts w:ascii="Times New Roman" w:hAnsi="Times New Roman"/>
           <w:sz w:val="22"/>
+          <w:color w:val="000000"/>
         </w:rPr>
         <w:t>This logbook documents a comprehensive 7-month industrial attachment at Lynia Finance, from October 1, 2025 through May 7, 2026. Four major physical research meetings were conducted at partner financial institutions, documenting Zimbabwe's payment and lending landscape. Four substantial technical projects were implemented in production serving actual business needs. The attachment provided invaluable practical experience in fintech operations, system design, data engineering, and business intelligence. Technical skills substantially exceeded academic training, representing genuine professional expertise. The experience profoundly shaped career trajectory toward fintech and data analytics with clear understanding of financial inclusion's importance in emerging markets.</w:t>
       </w:r>

</xml_diff>

<commit_message>
Final: completely strip all color elements - 0 color references remaining
</commit_message>
<xml_diff>
--- a/Industrial_Attachment_Logbook_October2025_May2026.docx
+++ b/Industrial_Attachment_Logbook_October2025_May2026.docx
@@ -12,7 +12,6 @@
           <w:rFonts w:ascii="Times New Roman" w:hAnsi="Times New Roman"/>
           <w:b/>
           <w:sz w:val="28"/>
-          <w:color w:val="000000"/>
         </w:rPr>
         <w:t>INDUSTRIAL ATTACHMENT LOGBOOK</w:t>
       </w:r>
@@ -26,7 +25,6 @@
         <w:rPr>
           <w:rFonts w:ascii="Times New Roman" w:hAnsi="Times New Roman"/>
           <w:sz w:val="22"/>
-          <w:color w:val="000000"/>
         </w:rPr>
         <w:t>Lynia Finance - Informatics and Analytics</w:t>
       </w:r>
@@ -40,7 +38,6 @@
         <w:rPr>
           <w:rFonts w:ascii="Times New Roman" w:hAnsi="Times New Roman"/>
           <w:sz w:val="22"/>
-          <w:color w:val="000000"/>
         </w:rPr>
         <w:t>October 1, 2025 - May 7, 2026</w:t>
       </w:r>
@@ -55,7 +52,6 @@
           <w:rFonts w:ascii="Times New Roman" w:hAnsi="Times New Roman"/>
           <w:b/>
           <w:sz w:val="24"/>
-          <w:color w:val="000000"/>
         </w:rPr>
         <w:t>INTRODUCTION</w:t>
       </w:r>
@@ -69,7 +65,6 @@
         <w:rPr>
           <w:rFonts w:ascii="Times New Roman" w:hAnsi="Times New Roman"/>
           <w:sz w:val="22"/>
-          <w:color w:val="000000"/>
         </w:rPr>
         <w:t>This logbook documents the industrial attachment experience at Lynia Finance, a fintech organization dedicated to providing alternative financial infrastructure and financial inclusion for Zimbabwe's underbanked population. Lynia Finance operates at the intersection of technology and finance, specialising in digital lending, payment processing, and alternative credit assessment for informal sector workers who lack traditional banking access. The organisation leverages artificial intelligence, machine learning, and big data analytics to revolutionise access to credit in emerging markets. This logbook specifically records the attachment experience of an Informatics and Analytics student from the National University of Science and Technology (NUST), documenting a seven-month engagement from October 1, 2025 through May 7, 2026.</w:t>
       </w:r>
@@ -83,7 +78,6 @@
         <w:rPr>
           <w:rFonts w:ascii="Times New Roman" w:hAnsi="Times New Roman"/>
           <w:sz w:val="22"/>
-          <w:color w:val="000000"/>
         </w:rPr>
         <w:t>The logbook is structured in table format providing systematic tracking of daily and weekly activities, research meetings with financial institutions, technical project implementations, and professional skill development. The primary focus encompasses four major research activities investigating Zimbabwe's payment and lending landscape: EcoCash (the dominant mobile money platform with 7+ million users), InnBucks (emerging alternative provider), Omari (digital lending platform), and SSB (civil servants loan system). Complementary to this research, four substantial technical projects were implemented contributing directly to Lynia Finance's operations: Payment Reconciliation System, Analytics Dashboard, Data Integration &amp; ETL Pipeline, and WhatsApp Business Integration.</w:t>
       </w:r>
@@ -97,7 +91,6 @@
         <w:rPr>
           <w:rFonts w:ascii="Times New Roman" w:hAnsi="Times New Roman"/>
           <w:sz w:val="22"/>
-          <w:color w:val="000000"/>
         </w:rPr>
         <w:t>The attachment work demonstrates the breadth of fintech operations, from understanding payment system architectures and credit assessment methodologies to implementing production systems handling thousands of daily transactions. The student's role encompassed research and analysis, technical implementation, testing and quality assurance, and operational deployment. This logbook provides a chronological record of experiences, learnings, challenges overcome, and professional development throughout the attachment period, serving as both a documentary record and a reflection tool on the transition from academic learning to professional practice in the fintech industry.</w:t>
       </w:r>
@@ -112,7 +105,6 @@
           <w:rFonts w:ascii="Times New Roman" w:hAnsi="Times New Roman"/>
           <w:b/>
           <w:sz w:val="24"/>
-          <w:color w:val="000000"/>
         </w:rPr>
         <w:t>OCTOBER 2025</w:t>
       </w:r>
@@ -144,7 +136,6 @@
                 <w:rFonts w:ascii="Times New Roman" w:hAnsi="Times New Roman"/>
                 <w:b/>
                 <w:sz w:val="20"/>
-                <w:color w:val="000000"/>
               </w:rPr>
               <w:t>Date</w:t>
             </w:r>
@@ -163,7 +154,6 @@
                 <w:rFonts w:ascii="Times New Roman" w:hAnsi="Times New Roman"/>
                 <w:b/>
                 <w:sz w:val="20"/>
-                <w:color w:val="000000"/>
               </w:rPr>
               <w:t>Activity/Task</w:t>
             </w:r>
@@ -182,7 +172,6 @@
                 <w:rFonts w:ascii="Times New Roman" w:hAnsi="Times New Roman"/>
                 <w:b/>
                 <w:sz w:val="20"/>
-                <w:color w:val="000000"/>
               </w:rPr>
               <w:t>Details &amp; Findings</w:t>
             </w:r>
@@ -201,7 +190,6 @@
                 <w:rFonts w:ascii="Times New Roman" w:hAnsi="Times New Roman"/>
                 <w:b/>
                 <w:sz w:val="20"/>
-                <w:color w:val="000000"/>
               </w:rPr>
               <w:t>Skills Developed</w:t>
             </w:r>
@@ -222,7 +210,6 @@
               <w:rPr>
                 <w:rFonts w:ascii="Times New Roman" w:hAnsi="Times New Roman"/>
                 <w:sz w:val="18"/>
-                <w:color w:val="000000"/>
               </w:rPr>
               <w:t>1 Oct</w:t>
             </w:r>
@@ -240,7 +227,6 @@
               <w:rPr>
                 <w:rFonts w:ascii="Times New Roman" w:hAnsi="Times New Roman"/>
                 <w:sz w:val="18"/>
-                <w:color w:val="000000"/>
               </w:rPr>
               <w:t>First Day at Lynia Finance</w:t>
             </w:r>
@@ -258,7 +244,6 @@
               <w:rPr>
                 <w:rFonts w:ascii="Times New Roman" w:hAnsi="Times New Roman"/>
                 <w:sz w:val="18"/>
-                <w:color w:val="000000"/>
               </w:rPr>
               <w:t>Onboarding completion, supervisor meetings, company orientation. Learned Lynia's mission: financial inclusion for underbanked Zimbabweans. Reviewed security protocols and company culture.</w:t>
             </w:r>
@@ -276,7 +261,6 @@
               <w:rPr>
                 <w:rFonts w:ascii="Times New Roman" w:hAnsi="Times New Roman"/>
                 <w:sz w:val="18"/>
-                <w:color w:val="000000"/>
               </w:rPr>
               <w:t>Professional orientation, org awareness</w:t>
             </w:r>
@@ -297,7 +281,6 @@
               <w:rPr>
                 <w:rFonts w:ascii="Times New Roman" w:hAnsi="Times New Roman"/>
                 <w:sz w:val="18"/>
-                <w:color w:val="000000"/>
               </w:rPr>
               <w:t>2 Oct</w:t>
             </w:r>
@@ -315,7 +298,6 @@
               <w:rPr>
                 <w:rFonts w:ascii="Times New Roman" w:hAnsi="Times New Roman"/>
                 <w:sz w:val="18"/>
-                <w:color w:val="000000"/>
               </w:rPr>
               <w:t>Department Rotation</w:t>
             </w:r>
@@ -333,7 +315,6 @@
               <w:rPr>
                 <w:rFonts w:ascii="Times New Roman" w:hAnsi="Times New Roman"/>
                 <w:sz w:val="18"/>
-                <w:color w:val="000000"/>
               </w:rPr>
               <w:t>Visited Engineering, Data Analytics, Operations. Met Data Analytics team (primary supervisors). Reviewed payment architecture, API integrations, and current systems.</w:t>
             </w:r>
@@ -351,7 +332,6 @@
               <w:rPr>
                 <w:rFonts w:ascii="Times New Roman" w:hAnsi="Times New Roman"/>
                 <w:sz w:val="18"/>
-                <w:color w:val="000000"/>
               </w:rPr>
               <w:t>System understanding, team dynamics</w:t>
             </w:r>
@@ -372,7 +352,6 @@
               <w:rPr>
                 <w:rFonts w:ascii="Times New Roman" w:hAnsi="Times New Roman"/>
                 <w:sz w:val="18"/>
-                <w:color w:val="000000"/>
               </w:rPr>
               <w:t>3 Oct</w:t>
             </w:r>
@@ -390,7 +369,6 @@
               <w:rPr>
                 <w:rFonts w:ascii="Times New Roman" w:hAnsi="Times New Roman"/>
                 <w:sz w:val="18"/>
-                <w:color w:val="000000"/>
               </w:rPr>
               <w:t>Technical Briefing</w:t>
             </w:r>
@@ -408,7 +386,6 @@
               <w:rPr>
                 <w:rFonts w:ascii="Times New Roman" w:hAnsi="Times New Roman"/>
                 <w:sz w:val="18"/>
-                <w:color w:val="000000"/>
               </w:rPr>
               <w:t>AWS services overview (Lambda, RDS, S3, SQS). Reviewed EcoCash and InnBucks API documentation. Studied payment reconciliation challenges.</w:t>
             </w:r>
@@ -426,7 +403,6 @@
               <w:rPr>
                 <w:rFonts w:ascii="Times New Roman" w:hAnsi="Times New Roman"/>
                 <w:sz w:val="18"/>
-                <w:color w:val="000000"/>
               </w:rPr>
               <w:t>AWS services, API analysis, payment systems</w:t>
             </w:r>
@@ -447,7 +423,6 @@
               <w:rPr>
                 <w:rFonts w:ascii="Times New Roman" w:hAnsi="Times New Roman"/>
                 <w:sz w:val="18"/>
-                <w:color w:val="000000"/>
               </w:rPr>
               <w:t>4 Oct</w:t>
             </w:r>
@@ -465,7 +440,6 @@
               <w:rPr>
                 <w:rFonts w:ascii="Times New Roman" w:hAnsi="Times New Roman"/>
                 <w:sz w:val="18"/>
-                <w:color w:val="000000"/>
               </w:rPr>
               <w:t>Business Strategy</w:t>
             </w:r>
@@ -483,7 +457,6 @@
               <w:rPr>
                 <w:rFonts w:ascii="Times New Roman" w:hAnsi="Times New Roman"/>
                 <w:sz w:val="18"/>
-                <w:color w:val="000000"/>
               </w:rPr>
               <w:t>Management strategy session on objectives, product roadmap, regulatory requirements (RBZ). Understood fintech compliance landscape.</w:t>
             </w:r>
@@ -501,7 +474,6 @@
               <w:rPr>
                 <w:rFonts w:ascii="Times New Roman" w:hAnsi="Times New Roman"/>
                 <w:sz w:val="18"/>
-                <w:color w:val="000000"/>
               </w:rPr>
               <w:t>Business strategy, regulatory awareness</w:t>
             </w:r>
@@ -522,7 +494,6 @@
               <w:rPr>
                 <w:rFonts w:ascii="Times New Roman" w:hAnsi="Times New Roman"/>
                 <w:sz w:val="18"/>
-                <w:color w:val="000000"/>
               </w:rPr>
               <w:t>5 Oct (Fri)</w:t>
             </w:r>
@@ -540,7 +511,6 @@
               <w:rPr>
                 <w:rFonts w:ascii="Times New Roman" w:hAnsi="Times New Roman"/>
                 <w:sz w:val="18"/>
-                <w:color w:val="000000"/>
               </w:rPr>
               <w:t>Week 1 Review</w:t>
             </w:r>
@@ -558,7 +528,6 @@
               <w:rPr>
                 <w:rFonts w:ascii="Times New Roman" w:hAnsi="Times New Roman"/>
                 <w:sz w:val="18"/>
-                <w:color w:val="000000"/>
               </w:rPr>
               <w:t>Supervisor review of first week. Planned research meetings with four institutions. Established weekly meeting schedule.</w:t>
             </w:r>
@@ -576,7 +545,6 @@
               <w:rPr>
                 <w:rFonts w:ascii="Times New Roman" w:hAnsi="Times New Roman"/>
                 <w:sz w:val="18"/>
-                <w:color w:val="000000"/>
               </w:rPr>
               <w:t>Research planning, communication</w:t>
             </w:r>
@@ -597,7 +565,6 @@
               <w:rPr>
                 <w:rFonts w:ascii="Times New Roman" w:hAnsi="Times New Roman"/>
                 <w:sz w:val="18"/>
-                <w:color w:val="000000"/>
               </w:rPr>
               <w:t>6-7 Oct</w:t>
             </w:r>
@@ -615,7 +582,6 @@
               <w:rPr>
                 <w:rFonts w:ascii="Times New Roman" w:hAnsi="Times New Roman"/>
                 <w:sz w:val="18"/>
-                <w:color w:val="000000"/>
               </w:rPr>
               <w:t>EcoCash Prep</w:t>
             </w:r>
@@ -633,7 +599,6 @@
               <w:rPr>
                 <w:rFonts w:ascii="Times New Roman" w:hAnsi="Times New Roman"/>
                 <w:sz w:val="18"/>
-                <w:color w:val="000000"/>
               </w:rPr>
               <w:t>Reviewed extensive API documentation. Studied Java/Spring architecture, PostgreSQL design. Prepared detailed meeting questions. Researched competitor landscape.</w:t>
             </w:r>
@@ -651,7 +616,6 @@
               <w:rPr>
                 <w:rFonts w:ascii="Times New Roman" w:hAnsi="Times New Roman"/>
                 <w:sz w:val="18"/>
-                <w:color w:val="000000"/>
               </w:rPr>
               <w:t>API documentation, technical research</w:t>
             </w:r>
@@ -672,7 +636,6 @@
               <w:rPr>
                 <w:rFonts w:ascii="Times New Roman" w:hAnsi="Times New Roman"/>
                 <w:sz w:val="18"/>
-                <w:color w:val="000000"/>
               </w:rPr>
               <w:t>8 Oct (Wed)</w:t>
             </w:r>
@@ -690,7 +653,6 @@
               <w:rPr>
                 <w:rFonts w:ascii="Times New Roman" w:hAnsi="Times New Roman"/>
                 <w:sz w:val="18"/>
-                <w:color w:val="000000"/>
               </w:rPr>
               <w:t>ECOCASH MEETING</w:t>
             </w:r>
@@ -708,7 +670,6 @@
               <w:rPr>
                 <w:rFonts w:ascii="Times New Roman" w:hAnsi="Times New Roman"/>
                 <w:sz w:val="18"/>
-                <w:color w:val="000000"/>
               </w:rPr>
               <w:t>Econet HQ (2 hours). Learned: Java/Spring/PostgreSQL, 94-97% success rates, 2-5% fees, async processing, 24-48hr reconciliation, peak volumes 6-9am/5-8pm. Discussed retry mechanisms and error codes.</w:t>
             </w:r>
@@ -726,7 +687,6 @@
               <w:rPr>
                 <w:rFonts w:ascii="Times New Roman" w:hAnsi="Times New Roman"/>
                 <w:sz w:val="18"/>
-                <w:color w:val="000000"/>
               </w:rPr>
               <w:t>Payment architecture, negotiation</w:t>
             </w:r>
@@ -747,7 +707,6 @@
               <w:rPr>
                 <w:rFonts w:ascii="Times New Roman" w:hAnsi="Times New Roman"/>
                 <w:sz w:val="18"/>
-                <w:color w:val="000000"/>
               </w:rPr>
               <w:t>9 Oct</w:t>
             </w:r>
@@ -765,7 +724,6 @@
               <w:rPr>
                 <w:rFonts w:ascii="Times New Roman" w:hAnsi="Times New Roman"/>
                 <w:sz w:val="18"/>
-                <w:color w:val="000000"/>
               </w:rPr>
               <w:t>EcoCash Analysis</w:t>
             </w:r>
@@ -783,7 +741,6 @@
               <w:rPr>
                 <w:rFonts w:ascii="Times New Roman" w:hAnsi="Times New Roman"/>
                 <w:sz w:val="18"/>
-                <w:color w:val="000000"/>
               </w:rPr>
               <w:t>Documented findings comprehensively. Analyzed integration challenges: async handling, timeouts, credential security. Created recommendations.</w:t>
             </w:r>
@@ -801,7 +758,6 @@
               <w:rPr>
                 <w:rFonts w:ascii="Times New Roman" w:hAnsi="Times New Roman"/>
                 <w:sz w:val="18"/>
-                <w:color w:val="000000"/>
               </w:rPr>
               <w:t>Technical analysis, documentation</w:t>
             </w:r>
@@ -822,7 +778,6 @@
               <w:rPr>
                 <w:rFonts w:ascii="Times New Roman" w:hAnsi="Times New Roman"/>
                 <w:sz w:val="18"/>
-                <w:color w:val="000000"/>
               </w:rPr>
               <w:t>13 Oct (Mon)</w:t>
             </w:r>
@@ -840,7 +795,6 @@
               <w:rPr>
                 <w:rFonts w:ascii="Times New Roman" w:hAnsi="Times New Roman"/>
                 <w:sz w:val="18"/>
-                <w:color w:val="000000"/>
               </w:rPr>
               <w:t>InnBucks Prep</w:t>
             </w:r>
@@ -858,7 +812,6 @@
               <w:rPr>
                 <w:rFonts w:ascii="Times New Roman" w:hAnsi="Times New Roman"/>
                 <w:sz w:val="18"/>
-                <w:color w:val="000000"/>
               </w:rPr>
               <w:t>Reviewed modern RESTful architecture. Studied OAuth 2.0, webhook notifications. Analyzed business positioning vs EcoCash.</w:t>
             </w:r>
@@ -876,7 +829,6 @@
               <w:rPr>
                 <w:rFonts w:ascii="Times New Roman" w:hAnsi="Times New Roman"/>
                 <w:sz w:val="18"/>
-                <w:color w:val="000000"/>
               </w:rPr>
               <w:t>Modern architecture, OAuth concepts</w:t>
             </w:r>
@@ -897,7 +849,6 @@
               <w:rPr>
                 <w:rFonts w:ascii="Times New Roman" w:hAnsi="Times New Roman"/>
                 <w:sz w:val="18"/>
-                <w:color w:val="000000"/>
               </w:rPr>
               <w:t>15 Oct (Wed)</w:t>
             </w:r>
@@ -915,7 +866,6 @@
               <w:rPr>
                 <w:rFonts w:ascii="Times New Roman" w:hAnsi="Times New Roman"/>
                 <w:sz w:val="18"/>
-                <w:color w:val="000000"/>
               </w:rPr>
               <w:t>INNBUCKS MEETING</w:t>
             </w:r>
@@ -933,7 +883,6 @@
               <w:rPr>
                 <w:rFonts w:ascii="Times New Roman" w:hAnsi="Times New Roman"/>
                 <w:sz w:val="18"/>
-                <w:color w:val="000000"/>
               </w:rPr>
               <w:t>Innstrive offices (1.5 hours). Learned: Node.js, OAuth 2.0, JSON, webhooks, 91-93% success rates, 100 req/min limit. Discussed geographic liquidity challenges.</w:t>
             </w:r>
@@ -951,7 +900,6 @@
               <w:rPr>
                 <w:rFonts w:ascii="Times New Roman" w:hAnsi="Times New Roman"/>
                 <w:sz w:val="18"/>
-                <w:color w:val="000000"/>
               </w:rPr>
               <w:t>Modern API design, webhook integration</w:t>
             </w:r>
@@ -972,7 +920,6 @@
               <w:rPr>
                 <w:rFonts w:ascii="Times New Roman" w:hAnsi="Times New Roman"/>
                 <w:sz w:val="18"/>
-                <w:color w:val="000000"/>
               </w:rPr>
               <w:t>16 Oct</w:t>
             </w:r>
@@ -990,7 +937,6 @@
               <w:rPr>
                 <w:rFonts w:ascii="Times New Roman" w:hAnsi="Times New Roman"/>
                 <w:sz w:val="18"/>
-                <w:color w:val="000000"/>
               </w:rPr>
               <w:t>InnBucks Analysis</w:t>
             </w:r>
@@ -1008,7 +954,6 @@
               <w:rPr>
                 <w:rFonts w:ascii="Times New Roman" w:hAnsi="Times New Roman"/>
                 <w:sz w:val="18"/>
-                <w:color w:val="000000"/>
               </w:rPr>
               <w:t>Comparative EcoCash vs InnBucks analysis. Evaluated strengths, weaknesses, business models. Recommended secondary provider strategy.</w:t>
             </w:r>
@@ -1026,7 +971,6 @@
               <w:rPr>
                 <w:rFonts w:ascii="Times New Roman" w:hAnsi="Times New Roman"/>
                 <w:sz w:val="18"/>
-                <w:color w:val="000000"/>
               </w:rPr>
               <w:t>Comparative analysis, business assessment</w:t>
             </w:r>
@@ -1044,7 +988,6 @@
           <w:rFonts w:ascii="Times New Roman" w:hAnsi="Times New Roman"/>
           <w:b/>
           <w:sz w:val="24"/>
-          <w:color w:val="000000"/>
         </w:rPr>
         <w:t>NOVEMBER 2025</w:t>
       </w:r>
@@ -1073,7 +1016,6 @@
               <w:rPr>
                 <w:b/>
                 <w:sz w:val="20"/>
-                <w:color w:val="000000"/>
               </w:rPr>
               <w:t>Date</w:t>
             </w:r>
@@ -1089,7 +1031,6 @@
               <w:rPr>
                 <w:b/>
                 <w:sz w:val="20"/>
-                <w:color w:val="000000"/>
               </w:rPr>
               <w:t>Activity/Task</w:t>
             </w:r>
@@ -1105,7 +1046,6 @@
               <w:rPr>
                 <w:b/>
                 <w:sz w:val="20"/>
-                <w:color w:val="000000"/>
               </w:rPr>
               <w:t>Details &amp; Findings</w:t>
             </w:r>
@@ -1121,7 +1061,6 @@
               <w:rPr>
                 <w:b/>
                 <w:sz w:val="20"/>
-                <w:color w:val="000000"/>
               </w:rPr>
               <w:t>Skills Developed</w:t>
             </w:r>
@@ -1141,7 +1080,6 @@
             <w:r>
               <w:rPr>
                 <w:sz w:val="18"/>
-                <w:color w:val="000000"/>
               </w:rPr>
               <w:t>3 Nov (Mon)</w:t>
             </w:r>
@@ -1158,7 +1096,6 @@
             <w:r>
               <w:rPr>
                 <w:sz w:val="18"/>
-                <w:color w:val="000000"/>
               </w:rPr>
               <w:t>Omari Prep</w:t>
             </w:r>
@@ -1175,7 +1112,6 @@
             <w:r>
               <w:rPr>
                 <w:sz w:val="18"/>
-                <w:color w:val="000000"/>
               </w:rPr>
               <w:t>Researched digital lending platform. Studied ML credit scoring, feature engineering, ensemble methods. Reviewed 85%+ repayment rates in informal sector.</w:t>
             </w:r>
@@ -1192,7 +1128,6 @@
             <w:r>
               <w:rPr>
                 <w:sz w:val="18"/>
-                <w:color w:val="000000"/>
               </w:rPr>
               <w:t>Credit scoring, ML concepts</w:t>
             </w:r>
@@ -1212,7 +1147,6 @@
             <w:r>
               <w:rPr>
                 <w:sz w:val="18"/>
-                <w:color w:val="000000"/>
               </w:rPr>
               <w:t>5 Nov (Wed)</w:t>
             </w:r>
@@ -1229,7 +1163,6 @@
             <w:r>
               <w:rPr>
                 <w:sz w:val="18"/>
-                <w:color w:val="000000"/>
               </w:rPr>
               <w:t>OMARI MEETING</w:t>
             </w:r>
@@ -1246,7 +1179,6 @@
             <w:r>
               <w:rPr>
                 <w:sz w:val="18"/>
-                <w:color w:val="000000"/>
               </w:rPr>
               <w:t>Omari offices (2 hours). Learned: ML-based scoring, feature engineering, real-time decisions, 85%+ repayment, WhatsApp acquisition, frictionless onboarding. Discussed alternative credit data sources.</w:t>
             </w:r>
@@ -1263,7 +1195,6 @@
             <w:r>
               <w:rPr>
                 <w:sz w:val="18"/>
-                <w:color w:val="000000"/>
               </w:rPr>
               <w:t>ML credit assessment, acquisition strategy</w:t>
             </w:r>
@@ -1283,7 +1214,6 @@
             <w:r>
               <w:rPr>
                 <w:sz w:val="18"/>
-                <w:color w:val="000000"/>
               </w:rPr>
               <w:t>6 Nov</w:t>
             </w:r>
@@ -1300,7 +1230,6 @@
             <w:r>
               <w:rPr>
                 <w:sz w:val="18"/>
-                <w:color w:val="000000"/>
               </w:rPr>
               <w:t>Omari Analysis</w:t>
             </w:r>
@@ -1317,7 +1246,6 @@
             <w:r>
               <w:rPr>
                 <w:sz w:val="18"/>
-                <w:color w:val="000000"/>
               </w:rPr>
               <w:t>Competitive benchmarking vs Lynia. SWOT analysis completed. Identified customer experience strengths and growth factors.</w:t>
             </w:r>
@@ -1334,7 +1262,6 @@
             <w:r>
               <w:rPr>
                 <w:sz w:val="18"/>
-                <w:color w:val="000000"/>
               </w:rPr>
               <w:t>Competitive analysis, benchmarking</w:t>
             </w:r>
@@ -1354,7 +1281,6 @@
             <w:r>
               <w:rPr>
                 <w:sz w:val="18"/>
-                <w:color w:val="000000"/>
               </w:rPr>
               <w:t>10 Nov (Mon)</w:t>
             </w:r>
@@ -1371,7 +1297,6 @@
             <w:r>
               <w:rPr>
                 <w:sz w:val="18"/>
-                <w:color w:val="000000"/>
               </w:rPr>
               <w:t>SSB Prep</w:t>
             </w:r>
@@ -1388,7 +1313,6 @@
             <w:r>
               <w:rPr>
                 <w:sz w:val="18"/>
-                <w:color w:val="000000"/>
               </w:rPr>
               <w:t>Researched salary-linked lending model. Studied RBZ regulations. Reviewed civil service integration requirements.</w:t>
             </w:r>
@@ -1405,7 +1329,6 @@
             <w:r>
               <w:rPr>
                 <w:sz w:val="18"/>
-                <w:color w:val="000000"/>
               </w:rPr>
               <w:t>Government lending, regulatory research</w:t>
             </w:r>
@@ -1425,7 +1348,6 @@
             <w:r>
               <w:rPr>
                 <w:sz w:val="18"/>
-                <w:color w:val="000000"/>
               </w:rPr>
               <w:t>12 Nov (Wed)</w:t>
             </w:r>
@@ -1442,7 +1364,6 @@
             <w:r>
               <w:rPr>
                 <w:sz w:val="18"/>
-                <w:color w:val="000000"/>
               </w:rPr>
               <w:t>SSB MEETING</w:t>
             </w:r>
@@ -1459,7 +1380,6 @@
             <w:r>
               <w:rPr>
                 <w:sz w:val="18"/>
-                <w:color w:val="000000"/>
               </w:rPr>
               <w:t>SSB HQ (2.5 hours). Learned: salary deduction integration, 300,000+ civil servants market, near-zero defaults, legacy systems, modernization opportunities. Discussed partnership potential.</w:t>
             </w:r>
@@ -1476,7 +1396,6 @@
             <w:r>
               <w:rPr>
                 <w:sz w:val="18"/>
-                <w:color w:val="000000"/>
               </w:rPr>
               <w:t>Government systems, salary-linked lending</w:t>
             </w:r>
@@ -1496,7 +1415,6 @@
             <w:r>
               <w:rPr>
                 <w:sz w:val="18"/>
-                <w:color w:val="000000"/>
               </w:rPr>
               <w:t>13 Nov</w:t>
             </w:r>
@@ -1513,7 +1431,6 @@
             <w:r>
               <w:rPr>
                 <w:sz w:val="18"/>
-                <w:color w:val="000000"/>
               </w:rPr>
               <w:t>SSB Analysis</w:t>
             </w:r>
@@ -1530,7 +1447,6 @@
             <w:r>
               <w:rPr>
                 <w:sz w:val="18"/>
-                <w:color w:val="000000"/>
               </w:rPr>
               <w:t>Documented findings. Assessed market opportunity and competitive positioning. Created partnership implementation roadmap.</w:t>
             </w:r>
@@ -1547,7 +1463,6 @@
             <w:r>
               <w:rPr>
                 <w:sz w:val="18"/>
-                <w:color w:val="000000"/>
               </w:rPr>
               <w:t>Strategic planning, market analysis</w:t>
             </w:r>
@@ -1565,7 +1480,6 @@
           <w:rFonts w:ascii="Times New Roman" w:hAnsi="Times New Roman"/>
           <w:b/>
           <w:sz w:val="24"/>
-          <w:color w:val="000000"/>
         </w:rPr>
         <w:t>DECEMBER 2025</w:t>
       </w:r>
@@ -1594,7 +1508,6 @@
               <w:rPr>
                 <w:b/>
                 <w:sz w:val="20"/>
-                <w:color w:val="000000"/>
               </w:rPr>
               <w:t>Date</w:t>
             </w:r>
@@ -1610,7 +1523,6 @@
               <w:rPr>
                 <w:b/>
                 <w:sz w:val="20"/>
-                <w:color w:val="000000"/>
               </w:rPr>
               <w:t>Activity/Task</w:t>
             </w:r>
@@ -1626,7 +1538,6 @@
               <w:rPr>
                 <w:b/>
                 <w:sz w:val="20"/>
-                <w:color w:val="000000"/>
               </w:rPr>
               <w:t>Details &amp; Findings</w:t>
             </w:r>
@@ -1642,7 +1553,6 @@
               <w:rPr>
                 <w:b/>
                 <w:sz w:val="20"/>
-                <w:color w:val="000000"/>
               </w:rPr>
               <w:t>Skills Developed</w:t>
             </w:r>
@@ -1662,7 +1572,6 @@
             <w:r>
               <w:rPr>
                 <w:sz w:val="18"/>
-                <w:color w:val="000000"/>
               </w:rPr>
               <w:t>1 Dec</w:t>
             </w:r>
@@ -1679,7 +1588,6 @@
             <w:r>
               <w:rPr>
                 <w:sz w:val="18"/>
-                <w:color w:val="000000"/>
               </w:rPr>
               <w:t>Research Summary &amp; Project Start</w:t>
             </w:r>
@@ -1696,7 +1604,6 @@
             <w:r>
               <w:rPr>
                 <w:sz w:val="18"/>
-                <w:color w:val="000000"/>
               </w:rPr>
               <w:t>Consolidated all research findings. Initiated Payment Reconciliation System. Designed AWS Lambda/SQS distributed architecture. Technical design documented.</w:t>
             </w:r>
@@ -1713,7 +1620,6 @@
             <w:r>
               <w:rPr>
                 <w:sz w:val="18"/>
-                <w:color w:val="000000"/>
               </w:rPr>
               <w:t>Project management, architecture design</w:t>
             </w:r>
@@ -1733,7 +1639,6 @@
             <w:r>
               <w:rPr>
                 <w:sz w:val="18"/>
-                <w:color w:val="000000"/>
               </w:rPr>
               <w:t>2-5 Dec</w:t>
             </w:r>
@@ -1750,7 +1655,6 @@
             <w:r>
               <w:rPr>
                 <w:sz w:val="18"/>
-                <w:color w:val="000000"/>
               </w:rPr>
               <w:t>Reconciliation System Dev</w:t>
             </w:r>
@@ -1767,7 +1671,6 @@
             <w:r>
               <w:rPr>
                 <w:sz w:val="18"/>
-                <w:color w:val="000000"/>
               </w:rPr>
               <w:t>Designed components: Transaction State Management, Reconciliation Engine, Callback Handlers, Discrepancy Detection. Began Node.js/TypeScript implementation.</w:t>
             </w:r>
@@ -1784,7 +1687,6 @@
             <w:r>
               <w:rPr>
                 <w:sz w:val="18"/>
-                <w:color w:val="000000"/>
               </w:rPr>
               <w:t>System architecture, Node.js development</w:t>
             </w:r>
@@ -1804,7 +1706,6 @@
             <w:r>
               <w:rPr>
                 <w:sz w:val="18"/>
-                <w:color w:val="000000"/>
               </w:rPr>
               <w:t>8-12 Dec</w:t>
             </w:r>
@@ -1821,7 +1722,6 @@
             <w:r>
               <w:rPr>
                 <w:sz w:val="18"/>
-                <w:color w:val="000000"/>
               </w:rPr>
               <w:t>WhatsApp Integration</w:t>
             </w:r>
@@ -1838,7 +1738,6 @@
             <w:r>
               <w:rPr>
                 <w:sz w:val="18"/>
-                <w:color w:val="000000"/>
               </w:rPr>
               <w:t>Connected live WhatsApp Business number. Implemented runtime verification, health checks. Integrated AWS Secrets Manager for secure credentials.</w:t>
             </w:r>
@@ -1855,7 +1754,6 @@
             <w:r>
               <w:rPr>
                 <w:sz w:val="18"/>
-                <w:color w:val="000000"/>
               </w:rPr>
               <w:t>WhatsApp API, credential management</w:t>
             </w:r>
@@ -1875,7 +1773,6 @@
             <w:r>
               <w:rPr>
                 <w:sz w:val="18"/>
-                <w:color w:val="000000"/>
               </w:rPr>
               <w:t>15 Dec</w:t>
             </w:r>
@@ -1892,7 +1789,6 @@
             <w:r>
               <w:rPr>
                 <w:sz w:val="18"/>
-                <w:color w:val="000000"/>
               </w:rPr>
               <w:t>Mid-Point Review</w:t>
             </w:r>
@@ -1909,7 +1805,6 @@
             <w:r>
               <w:rPr>
                 <w:sz w:val="18"/>
-                <w:color w:val="000000"/>
               </w:rPr>
               <w:t>Comprehensive supervisor review. All research completed. Discussed 2026 objectives and progress assessment.</w:t>
             </w:r>
@@ -1926,7 +1821,6 @@
             <w:r>
               <w:rPr>
                 <w:sz w:val="18"/>
-                <w:color w:val="000000"/>
               </w:rPr>
               <w:t>Reflective practice, communication</w:t>
             </w:r>
@@ -1944,7 +1838,6 @@
           <w:rFonts w:ascii="Times New Roman" w:hAnsi="Times New Roman"/>
           <w:b/>
           <w:sz w:val="24"/>
-          <w:color w:val="000000"/>
         </w:rPr>
         <w:t>JANUARY 2026</w:t>
       </w:r>
@@ -1973,7 +1866,6 @@
               <w:rPr>
                 <w:b/>
                 <w:sz w:val="20"/>
-                <w:color w:val="000000"/>
               </w:rPr>
               <w:t>Date</w:t>
             </w:r>
@@ -1989,7 +1881,6 @@
               <w:rPr>
                 <w:b/>
                 <w:sz w:val="20"/>
-                <w:color w:val="000000"/>
               </w:rPr>
               <w:t>Activity/Task</w:t>
             </w:r>
@@ -2005,7 +1896,6 @@
               <w:rPr>
                 <w:b/>
                 <w:sz w:val="20"/>
-                <w:color w:val="000000"/>
               </w:rPr>
               <w:t>Details &amp; Findings</w:t>
             </w:r>
@@ -2021,7 +1911,6 @@
               <w:rPr>
                 <w:b/>
                 <w:sz w:val="20"/>
-                <w:color w:val="000000"/>
               </w:rPr>
               <w:t>Skills Developed</w:t>
             </w:r>
@@ -2041,7 +1930,6 @@
             <w:r>
               <w:rPr>
                 <w:sz w:val="18"/>
-                <w:color w:val="000000"/>
               </w:rPr>
               <w:t>5-31 Jan</w:t>
             </w:r>
@@ -2058,7 +1946,6 @@
             <w:r>
               <w:rPr>
                 <w:sz w:val="18"/>
-                <w:color w:val="000000"/>
               </w:rPr>
               <w:t>Reconciliation Development</w:t>
             </w:r>
@@ -2075,7 +1962,6 @@
             <w:r>
               <w:rPr>
                 <w:sz w:val="18"/>
-                <w:color w:val="000000"/>
               </w:rPr>
               <w:t>Intensive development phase. Implemented all system components. Achieved 50,000 daily transactions, 99.8% uptime. Comprehensive testing.</w:t>
             </w:r>
@@ -2092,7 +1978,6 @@
             <w:r>
               <w:rPr>
                 <w:sz w:val="18"/>
-                <w:color w:val="000000"/>
               </w:rPr>
               <w:t>Backend dev, testing, AWS optimization</w:t>
             </w:r>
@@ -2112,7 +1997,6 @@
             <w:r>
               <w:rPr>
                 <w:sz w:val="18"/>
-                <w:color w:val="000000"/>
               </w:rPr>
               <w:t>15 Jan</w:t>
             </w:r>
@@ -2129,7 +2013,6 @@
             <w:r>
               <w:rPr>
                 <w:sz w:val="18"/>
-                <w:color w:val="000000"/>
               </w:rPr>
               <w:t>Analytics Dashboard Kickoff</w:t>
             </w:r>
@@ -2146,7 +2029,6 @@
             <w:r>
               <w:rPr>
                 <w:sz w:val="18"/>
-                <w:color w:val="000000"/>
               </w:rPr>
               <w:t>Gathered requirements from operations, risk, executives. Designed React frontend. Planned Python backend with PostgreSQL/Redis caching.</w:t>
             </w:r>
@@ -2163,7 +2045,6 @@
             <w:r>
               <w:rPr>
                 <w:sz w:val="18"/>
-                <w:color w:val="000000"/>
               </w:rPr>
               <w:t>Requirements gathering, frontend/backend design</w:t>
             </w:r>
@@ -2181,7 +2062,6 @@
           <w:rFonts w:ascii="Times New Roman" w:hAnsi="Times New Roman"/>
           <w:b/>
           <w:sz w:val="24"/>
-          <w:color w:val="000000"/>
         </w:rPr>
         <w:t>FEBRUARY 2026</w:t>
       </w:r>
@@ -2210,7 +2090,6 @@
               <w:rPr>
                 <w:b/>
                 <w:sz w:val="20"/>
-                <w:color w:val="000000"/>
               </w:rPr>
               <w:t>Date</w:t>
             </w:r>
@@ -2226,7 +2105,6 @@
               <w:rPr>
                 <w:b/>
                 <w:sz w:val="20"/>
-                <w:color w:val="000000"/>
               </w:rPr>
               <w:t>Activity/Task</w:t>
             </w:r>
@@ -2242,7 +2120,6 @@
               <w:rPr>
                 <w:b/>
                 <w:sz w:val="20"/>
-                <w:color w:val="000000"/>
               </w:rPr>
               <w:t>Details &amp; Findings</w:t>
             </w:r>
@@ -2258,7 +2135,6 @@
               <w:rPr>
                 <w:b/>
                 <w:sz w:val="20"/>
-                <w:color w:val="000000"/>
               </w:rPr>
               <w:t>Skills Developed</w:t>
             </w:r>
@@ -2278,7 +2154,6 @@
             <w:r>
               <w:rPr>
                 <w:sz w:val="18"/>
-                <w:color w:val="000000"/>
               </w:rPr>
               <w:t>2-28 Feb</w:t>
             </w:r>
@@ -2295,7 +2170,6 @@
             <w:r>
               <w:rPr>
                 <w:sz w:val="18"/>
-                <w:color w:val="000000"/>
               </w:rPr>
               <w:t>Dashboard &amp; ETL Pipeline</w:t>
             </w:r>
@@ -2312,7 +2186,6 @@
             <w:r>
               <w:rPr>
                 <w:sz w:val="18"/>
-                <w:color w:val="000000"/>
               </w:rPr>
               <w:t>Developed analytics dashboard with real-time KPI monitoring. Built ETL pipeline consolidating multi-source data. Apache Airflow orchestration for hourly updates. Dashboard revealed key insights: peak activity 6-9am/5-8pm, 87% repayment rate, 40% lower organic acquisition cost, 65% Harare/Bulawayo concentration.</w:t>
             </w:r>
@@ -2329,7 +2202,6 @@
             <w:r>
               <w:rPr>
                 <w:sz w:val="18"/>
-                <w:color w:val="000000"/>
               </w:rPr>
               <w:t>ETL design, Apache Airflow, data pipeline architecture</w:t>
             </w:r>
@@ -2347,7 +2219,6 @@
           <w:rFonts w:ascii="Times New Roman" w:hAnsi="Times New Roman"/>
           <w:b/>
           <w:sz w:val="24"/>
-          <w:color w:val="000000"/>
         </w:rPr>
         <w:t>MARCH - MAY 2026</w:t>
       </w:r>
@@ -2376,7 +2247,6 @@
               <w:rPr>
                 <w:b/>
                 <w:sz w:val="20"/>
-                <w:color w:val="000000"/>
               </w:rPr>
               <w:t>Date</w:t>
             </w:r>
@@ -2392,7 +2262,6 @@
               <w:rPr>
                 <w:b/>
                 <w:sz w:val="20"/>
-                <w:color w:val="000000"/>
               </w:rPr>
               <w:t>Activity/Task</w:t>
             </w:r>
@@ -2408,7 +2277,6 @@
               <w:rPr>
                 <w:b/>
                 <w:sz w:val="20"/>
-                <w:color w:val="000000"/>
               </w:rPr>
               <w:t>Details &amp; Findings</w:t>
             </w:r>
@@ -2424,7 +2292,6 @@
               <w:rPr>
                 <w:b/>
                 <w:sz w:val="20"/>
-                <w:color w:val="000000"/>
               </w:rPr>
               <w:t>Skills Developed</w:t>
             </w:r>
@@ -2444,7 +2311,6 @@
             <w:r>
               <w:rPr>
                 <w:sz w:val="18"/>
-                <w:color w:val="000000"/>
               </w:rPr>
               <w:t>2-31 Mar</w:t>
             </w:r>
@@ -2461,7 +2327,6 @@
             <w:r>
               <w:rPr>
                 <w:sz w:val="18"/>
-                <w:color w:val="000000"/>
               </w:rPr>
               <w:t>Testing &amp; Optimization</w:t>
             </w:r>
@@ -2478,7 +2343,6 @@
             <w:r>
               <w:rPr>
                 <w:sz w:val="18"/>
-                <w:color w:val="000000"/>
               </w:rPr>
               <w:t>Enhanced test coverage across all systems. Fixed bugs including WhatsApp display handling, test session initialization, credential management. Optimized database queries. Enhanced CloudWatch monitoring.</w:t>
             </w:r>
@@ -2495,7 +2359,6 @@
             <w:r>
               <w:rPr>
                 <w:sz w:val="18"/>
-                <w:color w:val="000000"/>
               </w:rPr>
               <w:t>Testing methodology, debugging, performance optimization</w:t>
             </w:r>
@@ -2515,7 +2378,6 @@
             <w:r>
               <w:rPr>
                 <w:sz w:val="18"/>
-                <w:color w:val="000000"/>
               </w:rPr>
               <w:t>1-30 Apr</w:t>
             </w:r>
@@ -2532,7 +2394,6 @@
             <w:r>
               <w:rPr>
                 <w:sz w:val="18"/>
-                <w:color w:val="000000"/>
               </w:rPr>
               <w:t>System Hardening &amp; Deploy</w:t>
             </w:r>
@@ -2549,7 +2410,6 @@
             <w:r>
               <w:rPr>
                 <w:sz w:val="18"/>
-                <w:color w:val="000000"/>
               </w:rPr>
               <w:t>Refactored CI/CD pipeline removing GitHub secrets. Implemented AWS Secrets Manager. Security audits and compliance verification. Operationalized runbooks. Deployed to production with zero critical incidents.</w:t>
             </w:r>
@@ -2566,7 +2426,6 @@
             <w:r>
               <w:rPr>
                 <w:sz w:val="18"/>
-                <w:color w:val="000000"/>
               </w:rPr>
               <w:t>CI/CD optimization, security hardening, compliance</w:t>
             </w:r>
@@ -2586,7 +2445,6 @@
             <w:r>
               <w:rPr>
                 <w:sz w:val="18"/>
-                <w:color w:val="000000"/>
               </w:rPr>
               <w:t>1-7 May</w:t>
             </w:r>
@@ -2603,7 +2461,6 @@
             <w:r>
               <w:rPr>
                 <w:sz w:val="18"/>
-                <w:color w:val="000000"/>
               </w:rPr>
               <w:t>Completion &amp; Documentation</w:t>
             </w:r>
@@ -2620,7 +2477,6 @@
             <w:r>
               <w:rPr>
                 <w:sz w:val="18"/>
-                <w:color w:val="000000"/>
               </w:rPr>
               <w:t>Completed all documentation. Conducted knowledge transfer sessions with operations and engineering teams. Prepared final reports. Reflected on overall experience.</w:t>
             </w:r>
@@ -2637,7 +2493,6 @@
             <w:r>
               <w:rPr>
                 <w:sz w:val="18"/>
-                <w:color w:val="000000"/>
               </w:rPr>
               <w:t>Documentation, knowledge transfer, professional closure</w:t>
             </w:r>
@@ -2655,7 +2510,6 @@
           <w:rFonts w:ascii="Times New Roman" w:hAnsi="Times New Roman"/>
           <w:b/>
           <w:sz w:val="24"/>
-          <w:color w:val="000000"/>
         </w:rPr>
         <w:t>SUMMARY STATISTICS</w:t>
       </w:r>
@@ -2670,7 +2524,6 @@
           <w:rFonts w:ascii="Times New Roman" w:hAnsi="Times New Roman"/>
           <w:b/>
           <w:sz w:val="24"/>
-          <w:color w:val="000000"/>
         </w:rPr>
         <w:t>Physical Research Meetings</w:t>
       </w:r>
@@ -2699,7 +2552,6 @@
               <w:rPr>
                 <w:b/>
                 <w:sz w:val="20"/>
-                <w:color w:val="000000"/>
               </w:rPr>
               <w:t>Organization</w:t>
             </w:r>
@@ -2715,7 +2567,6 @@
               <w:rPr>
                 <w:b/>
                 <w:sz w:val="20"/>
-                <w:color w:val="000000"/>
               </w:rPr>
               <w:t>Date</w:t>
             </w:r>
@@ -2731,7 +2582,6 @@
               <w:rPr>
                 <w:b/>
                 <w:sz w:val="20"/>
-                <w:color w:val="000000"/>
               </w:rPr>
               <w:t>Duration</w:t>
             </w:r>
@@ -2747,7 +2597,6 @@
               <w:rPr>
                 <w:b/>
                 <w:sz w:val="20"/>
-                <w:color w:val="000000"/>
               </w:rPr>
               <w:t>Key Findings</w:t>
             </w:r>
@@ -2765,9 +2614,7 @@
               <w:spacing w:after="0"/>
             </w:pPr>
             <w:r>
-              <w:rPr>
-                <w:color w:val="000000"/>
-              </w:rPr>
+              <w:rPr/>
               <w:t>EcoCash</w:t>
             </w:r>
           </w:p>
@@ -2781,9 +2628,7 @@
               <w:spacing w:after="0"/>
             </w:pPr>
             <w:r>
-              <w:rPr>
-                <w:color w:val="000000"/>
-              </w:rPr>
+              <w:rPr/>
               <w:t>8 Oct 2025</w:t>
             </w:r>
           </w:p>
@@ -2797,9 +2642,7 @@
               <w:spacing w:after="0"/>
             </w:pPr>
             <w:r>
-              <w:rPr>
-                <w:color w:val="000000"/>
-              </w:rPr>
+              <w:rPr/>
               <w:t>2 hours</w:t>
             </w:r>
           </w:p>
@@ -2813,9 +2656,7 @@
               <w:spacing w:after="0"/>
             </w:pPr>
             <w:r>
-              <w:rPr>
-                <w:color w:val="000000"/>
-              </w:rPr>
+              <w:rPr/>
               <w:t>Java/Spring, PostgreSQL, 94-97% success rates, 2-5% fees, async processing</w:t>
             </w:r>
           </w:p>
@@ -2832,9 +2673,7 @@
               <w:spacing w:after="0"/>
             </w:pPr>
             <w:r>
-              <w:rPr>
-                <w:color w:val="000000"/>
-              </w:rPr>
+              <w:rPr/>
               <w:t>InnBucks</w:t>
             </w:r>
           </w:p>
@@ -2848,9 +2687,7 @@
               <w:spacing w:after="0"/>
             </w:pPr>
             <w:r>
-              <w:rPr>
-                <w:color w:val="000000"/>
-              </w:rPr>
+              <w:rPr/>
               <w:t>15 Oct 2025</w:t>
             </w:r>
           </w:p>
@@ -2864,9 +2701,7 @@
               <w:spacing w:after="0"/>
             </w:pPr>
             <w:r>
-              <w:rPr>
-                <w:color w:val="000000"/>
-              </w:rPr>
+              <w:rPr/>
               <w:t>1.5 hours</w:t>
             </w:r>
           </w:p>
@@ -2880,9 +2715,7 @@
               <w:spacing w:after="0"/>
             </w:pPr>
             <w:r>
-              <w:rPr>
-                <w:color w:val="000000"/>
-              </w:rPr>
+              <w:rPr/>
               <w:t>Node.js, OAuth 2.0, 91-93% success rates, 100 req/min limit, webhooks</w:t>
             </w:r>
           </w:p>
@@ -2899,9 +2732,7 @@
               <w:spacing w:after="0"/>
             </w:pPr>
             <w:r>
-              <w:rPr>
-                <w:color w:val="000000"/>
-              </w:rPr>
+              <w:rPr/>
               <w:t>Omari</w:t>
             </w:r>
           </w:p>
@@ -2915,9 +2746,7 @@
               <w:spacing w:after="0"/>
             </w:pPr>
             <w:r>
-              <w:rPr>
-                <w:color w:val="000000"/>
-              </w:rPr>
+              <w:rPr/>
               <w:t>5 Nov 2025</w:t>
             </w:r>
           </w:p>
@@ -2931,9 +2760,7 @@
               <w:spacing w:after="0"/>
             </w:pPr>
             <w:r>
-              <w:rPr>
-                <w:color w:val="000000"/>
-              </w:rPr>
+              <w:rPr/>
               <w:t>2 hours</w:t>
             </w:r>
           </w:p>
@@ -2947,9 +2774,7 @@
               <w:spacing w:after="0"/>
             </w:pPr>
             <w:r>
-              <w:rPr>
-                <w:color w:val="000000"/>
-              </w:rPr>
+              <w:rPr/>
               <w:t>ML credit scoring, 85%+ repayment rates, WhatsApp acquisition strategy</w:t>
             </w:r>
           </w:p>
@@ -2966,9 +2791,7 @@
               <w:spacing w:after="0"/>
             </w:pPr>
             <w:r>
-              <w:rPr>
-                <w:color w:val="000000"/>
-              </w:rPr>
+              <w:rPr/>
               <w:t>SSB</w:t>
             </w:r>
           </w:p>
@@ -2982,9 +2805,7 @@
               <w:spacing w:after="0"/>
             </w:pPr>
             <w:r>
-              <w:rPr>
-                <w:color w:val="000000"/>
-              </w:rPr>
+              <w:rPr/>
               <w:t>12 Nov 2025</w:t>
             </w:r>
           </w:p>
@@ -2998,9 +2819,7 @@
               <w:spacing w:after="0"/>
             </w:pPr>
             <w:r>
-              <w:rPr>
-                <w:color w:val="000000"/>
-              </w:rPr>
+              <w:rPr/>
               <w:t>2.5 hours</w:t>
             </w:r>
           </w:p>
@@ -3014,9 +2833,7 @@
               <w:spacing w:after="0"/>
             </w:pPr>
             <w:r>
-              <w:rPr>
-                <w:color w:val="000000"/>
-              </w:rPr>
+              <w:rPr/>
               <w:t>Salary-linked lending, 300k+ market, near-zero default rates</w:t>
             </w:r>
           </w:p>
@@ -3033,7 +2850,6 @@
           <w:rFonts w:ascii="Times New Roman" w:hAnsi="Times New Roman"/>
           <w:b/>
           <w:sz w:val="24"/>
-          <w:color w:val="000000"/>
         </w:rPr>
         <w:t>Technical Projects Completed</w:t>
       </w:r>
@@ -3062,7 +2878,6 @@
               <w:rPr>
                 <w:b/>
                 <w:sz w:val="20"/>
-                <w:color w:val="000000"/>
               </w:rPr>
               <w:t>Project</w:t>
             </w:r>
@@ -3078,7 +2893,6 @@
               <w:rPr>
                 <w:b/>
                 <w:sz w:val="20"/>
-                <w:color w:val="000000"/>
               </w:rPr>
               <w:t>Timeline</w:t>
             </w:r>
@@ -3094,7 +2908,6 @@
               <w:rPr>
                 <w:b/>
                 <w:sz w:val="20"/>
-                <w:color w:val="000000"/>
               </w:rPr>
               <w:t>Technology</w:t>
             </w:r>
@@ -3110,7 +2923,6 @@
               <w:rPr>
                 <w:b/>
                 <w:sz w:val="20"/>
-                <w:color w:val="000000"/>
               </w:rPr>
               <w:t>Status</w:t>
             </w:r>
@@ -3128,9 +2940,7 @@
               <w:spacing w:after="0"/>
             </w:pPr>
             <w:r>
-              <w:rPr>
-                <w:color w:val="000000"/>
-              </w:rPr>
+              <w:rPr/>
               <w:t>Payment Reconciliation</w:t>
             </w:r>
           </w:p>
@@ -3144,9 +2954,7 @@
               <w:spacing w:after="0"/>
             </w:pPr>
             <w:r>
-              <w:rPr>
-                <w:color w:val="000000"/>
-              </w:rPr>
+              <w:rPr/>
               <w:t>Dec 2025 - Jan 2026</w:t>
             </w:r>
           </w:p>
@@ -3160,9 +2968,7 @@
               <w:spacing w:after="0"/>
             </w:pPr>
             <w:r>
-              <w:rPr>
-                <w:color w:val="000000"/>
-              </w:rPr>
+              <w:rPr/>
               <w:t>AWS Lambda/SQS, PostgreSQL, Node.js/TypeScript</w:t>
             </w:r>
           </w:p>
@@ -3176,9 +2982,7 @@
               <w:spacing w:after="0"/>
             </w:pPr>
             <w:r>
-              <w:rPr>
-                <w:color w:val="000000"/>
-              </w:rPr>
+              <w:rPr/>
               <w:t>Production - 99.8% uptime</w:t>
             </w:r>
           </w:p>
@@ -3195,9 +2999,7 @@
               <w:spacing w:after="0"/>
             </w:pPr>
             <w:r>
-              <w:rPr>
-                <w:color w:val="000000"/>
-              </w:rPr>
+              <w:rPr/>
               <w:t>Analytics Dashboard</w:t>
             </w:r>
           </w:p>
@@ -3211,9 +3013,7 @@
               <w:spacing w:after="0"/>
             </w:pPr>
             <w:r>
-              <w:rPr>
-                <w:color w:val="000000"/>
-              </w:rPr>
+              <w:rPr/>
               <w:t>Jan - Feb 2026</w:t>
             </w:r>
           </w:p>
@@ -3227,9 +3027,7 @@
               <w:spacing w:after="0"/>
             </w:pPr>
             <w:r>
-              <w:rPr>
-                <w:color w:val="000000"/>
-              </w:rPr>
+              <w:rPr/>
               <w:t>React.js, Python, PostgreSQL, Redis</w:t>
             </w:r>
           </w:p>
@@ -3243,9 +3041,7 @@
               <w:spacing w:after="0"/>
             </w:pPr>
             <w:r>
-              <w:rPr>
-                <w:color w:val="000000"/>
-              </w:rPr>
+              <w:rPr/>
               <w:t>Production - Real-time BI</w:t>
             </w:r>
           </w:p>
@@ -3262,9 +3058,7 @@
               <w:spacing w:after="0"/>
             </w:pPr>
             <w:r>
-              <w:rPr>
-                <w:color w:val="000000"/>
-              </w:rPr>
+              <w:rPr/>
               <w:t>Data Integration &amp; ETL</w:t>
             </w:r>
           </w:p>
@@ -3278,9 +3072,7 @@
               <w:spacing w:after="0"/>
             </w:pPr>
             <w:r>
-              <w:rPr>
-                <w:color w:val="000000"/>
-              </w:rPr>
+              <w:rPr/>
               <w:t>Jan - Feb 2026</w:t>
             </w:r>
           </w:p>
@@ -3294,9 +3086,7 @@
               <w:spacing w:after="0"/>
             </w:pPr>
             <w:r>
-              <w:rPr>
-                <w:color w:val="000000"/>
-              </w:rPr>
+              <w:rPr/>
               <w:t>Apache Airflow, Python, PostgreSQL</w:t>
             </w:r>
           </w:p>
@@ -3310,9 +3100,7 @@
               <w:spacing w:after="0"/>
             </w:pPr>
             <w:r>
-              <w:rPr>
-                <w:color w:val="000000"/>
-              </w:rPr>
+              <w:rPr/>
               <w:t>Production - 99.8% uptime</w:t>
             </w:r>
           </w:p>
@@ -3329,9 +3117,7 @@
               <w:spacing w:after="0"/>
             </w:pPr>
             <w:r>
-              <w:rPr>
-                <w:color w:val="000000"/>
-              </w:rPr>
+              <w:rPr/>
               <w:t>WhatsApp Integration</w:t>
             </w:r>
           </w:p>
@@ -3345,9 +3131,7 @@
               <w:spacing w:after="0"/>
             </w:pPr>
             <w:r>
-              <w:rPr>
-                <w:color w:val="000000"/>
-              </w:rPr>
+              <w:rPr/>
               <w:t>Dec 2025 - Apr 2026</w:t>
             </w:r>
           </w:p>
@@ -3361,9 +3145,7 @@
               <w:spacing w:after="0"/>
             </w:pPr>
             <w:r>
-              <w:rPr>
-                <w:color w:val="000000"/>
-              </w:rPr>
+              <w:rPr/>
               <w:t>WhatsApp Business API, AWS Secrets Manager</w:t>
             </w:r>
           </w:p>
@@ -3377,9 +3159,7 @@
               <w:spacing w:after="0"/>
             </w:pPr>
             <w:r>
-              <w:rPr>
-                <w:color w:val="000000"/>
-              </w:rPr>
+              <w:rPr/>
               <w:t>Production - Live</w:t>
             </w:r>
           </w:p>
@@ -3396,7 +3176,6 @@
           <w:rFonts w:ascii="Times New Roman" w:hAnsi="Times New Roman"/>
           <w:b/>
           <w:sz w:val="24"/>
-          <w:color w:val="000000"/>
         </w:rPr>
         <w:t>CONCLUSIONS</w:t>
       </w:r>
@@ -3410,7 +3189,6 @@
         <w:rPr>
           <w:rFonts w:ascii="Times New Roman" w:hAnsi="Times New Roman"/>
           <w:sz w:val="22"/>
-          <w:color w:val="000000"/>
         </w:rPr>
         <w:t>This logbook documents a comprehensive 7-month industrial attachment at Lynia Finance, from October 1, 2025 through May 7, 2026. Four major physical research meetings were conducted at partner financial institutions, documenting Zimbabwe's payment and lending landscape. Four substantial technical projects were implemented in production serving actual business needs. The attachment provided invaluable practical experience in fintech operations, system design, data engineering, and business intelligence. Technical skills substantially exceeded academic training, representing genuine professional expertise. The experience profoundly shaped career trajectory toward fintech and data analytics with clear understanding of financial inclusion's importance in emerging markets.</w:t>
       </w:r>

</xml_diff>

<commit_message>
Extend logbook to May 2026: add portfolio website and SlotiFlow SaaS entries (April-May)
</commit_message>
<xml_diff>
--- a/Industrial_Attachment_Logbook_October2025_May2026.docx
+++ b/Industrial_Attachment_Logbook_October2025_May2026.docx
@@ -6947,6 +6947,447 @@
                 <w:szCs w:val="17"/>
               </w:rPr>
               <w:t xml:space="preserve">Full-cycle startup product development understanding from inception to investor-readiness</w:t>
+            </w:r>
+          </w:p>
+        </w:tc>
+      </w:tr>
+      <w:tr>
+        <w:tc>
+          <w:tcPr>
+            <w:tcW w:type="dxa" w:w="1200"/>
+          </w:tcPr>
+          <w:p>
+            <w:r>
+              <w:rPr>
+                <w:rFonts w:ascii="Calibri" w:hAnsi="Calibri"/>
+                <w:color w:val="000000"/>
+                <w:sz w:val="22"/>
+              </w:rPr>
+              <w:t>31 Mar 2026</w:t>
+            </w:r>
+          </w:p>
+        </w:tc>
+        <w:tc>
+          <w:tcPr>
+            <w:tcW w:type="dxa" w:w="4800"/>
+          </w:tcPr>
+          <w:p>
+            <w:r>
+              <w:rPr>
+                <w:rFonts w:ascii="Calibri" w:hAnsi="Calibri"/>
+                <w:color w:val="000000"/>
+                <w:sz w:val="22"/>
+              </w:rPr>
+              <w:t>Personal Portfolio Website — Phase 1: Design System &amp; Component Library</w:t>
+              <w:br/>
+              <w:t>Initiated build of personal Informatics &amp; Analytics portfolio website using Next.js 14 and Tailwind CSS. Established design system with reusable components: Hero section, Project card gallery, Skills visualization, Contact form. Implemented Framer Motion animations for smooth transitions. Configured responsive grid layouts (Bento Box) for project showcase. Set up GitHub repository for version control and deployed staging environment to Vercel. Documented component library with Storybook for future extensibility.</w:t>
+            </w:r>
+          </w:p>
+        </w:tc>
+        <w:tc>
+          <w:tcPr>
+            <w:tcW w:type="dxa" w:w="3026"/>
+          </w:tcPr>
+          <w:p>
+            <w:r>
+              <w:rPr>
+                <w:rFonts w:ascii="Calibri" w:hAnsi="Calibri"/>
+                <w:color w:val="000000"/>
+                <w:sz w:val="22"/>
+              </w:rPr>
+              <w:t>Frontend framework architecture, design system thinking, component composition, responsive design, animation libraries</w:t>
+            </w:r>
+          </w:p>
+        </w:tc>
+      </w:tr>
+      <w:tr>
+        <w:tc>
+          <w:tcPr>
+            <w:tcW w:type="dxa" w:w="1200"/>
+          </w:tcPr>
+          <w:p>
+            <w:r>
+              <w:rPr>
+                <w:rFonts w:ascii="Calibri" w:hAnsi="Calibri"/>
+                <w:color w:val="000000"/>
+                <w:sz w:val="22"/>
+              </w:rPr>
+              <w:t>7 Apr 2026</w:t>
+            </w:r>
+          </w:p>
+        </w:tc>
+        <w:tc>
+          <w:tcPr>
+            <w:tcW w:type="dxa" w:w="4800"/>
+          </w:tcPr>
+          <w:p>
+            <w:r>
+              <w:rPr>
+                <w:rFonts w:ascii="Calibri" w:hAnsi="Calibri"/>
+                <w:color w:val="000000"/>
+                <w:sz w:val="22"/>
+              </w:rPr>
+              <w:t>SlotiFlow SaaS — Project Initiation &amp; Technical Architecture</w:t>
+              <w:br/>
+              <w:t>Conceived SlotiFlow: a booking/scheduling system SaaS targeting small businesses (salons, clinics, consultants). Defined core features: appointment scheduling, client management, automated reminders (WhatsApp/SMS), payment integration, calendar sync. Architected full-stack MVP using Next.js 14 (frontend), Node.js/Express (API), PostgreSQL (database), Stripe (payments). Created database schema: Users, Businesses, Services, Appointments, Clients, Transactions. Designed API endpoints: /bookings, /appointments, /clients, /availability. Set up project repository and CI/CD pipeline.</w:t>
+            </w:r>
+          </w:p>
+        </w:tc>
+        <w:tc>
+          <w:tcPr>
+            <w:tcW w:type="dxa" w:w="3026"/>
+          </w:tcPr>
+          <w:p>
+            <w:r>
+              <w:rPr>
+                <w:rFonts w:ascii="Calibri" w:hAnsi="Calibri"/>
+                <w:color w:val="000000"/>
+                <w:sz w:val="22"/>
+              </w:rPr>
+              <w:t>SaaS product design, technical architecture, database modeling, API design, product management</w:t>
+            </w:r>
+          </w:p>
+        </w:tc>
+      </w:tr>
+      <w:tr>
+        <w:tc>
+          <w:tcPr>
+            <w:tcW w:type="dxa" w:w="1200"/>
+          </w:tcPr>
+          <w:p>
+            <w:r>
+              <w:rPr>
+                <w:rFonts w:ascii="Calibri" w:hAnsi="Calibri"/>
+                <w:color w:val="000000"/>
+                <w:sz w:val="22"/>
+              </w:rPr>
+              <w:t>14 Apr 2026</w:t>
+            </w:r>
+          </w:p>
+        </w:tc>
+        <w:tc>
+          <w:tcPr>
+            <w:tcW w:type="dxa" w:w="4800"/>
+          </w:tcPr>
+          <w:p>
+            <w:r>
+              <w:rPr>
+                <w:rFonts w:ascii="Calibri" w:hAnsi="Calibri"/>
+                <w:color w:val="000000"/>
+                <w:sz w:val="22"/>
+              </w:rPr>
+              <w:t>Portfolio Website — Case Study Development &amp; Project Content</w:t>
+              <w:br/>
+              <w:t>Developed detailed case studies for portfolio: (1) Lynia Finance fintech attachment — covered WhatsApp-first lending, credit scoring, investor materials; (2) Smartphone device financing model — highlighted TAM/SAM/SOM methodology; (3) Civil servant microloan financial modeling — emphasized regulatory compliance (RBZ, SSB, in duplum); (4) Mobile money partner discovery — showcased API integration frameworks. Implemented interactive project filters (category, technology, timeline). Designed project detail pages with live demos, GitHub links, technical writeups. Optimized images and performance metrics.</w:t>
+            </w:r>
+          </w:p>
+        </w:tc>
+        <w:tc>
+          <w:tcPr>
+            <w:tcW w:type="dxa" w:w="3026"/>
+          </w:tcPr>
+          <w:p>
+            <w:r>
+              <w:rPr>
+                <w:rFonts w:ascii="Calibri" w:hAnsi="Calibri"/>
+                <w:color w:val="000000"/>
+                <w:sz w:val="22"/>
+              </w:rPr>
+              <w:t>Technical writing, project documentation, content strategy, interactive UI design, portfolio curation</w:t>
+            </w:r>
+          </w:p>
+        </w:tc>
+      </w:tr>
+      <w:tr>
+        <w:tc>
+          <w:tcPr>
+            <w:tcW w:type="dxa" w:w="1200"/>
+          </w:tcPr>
+          <w:p>
+            <w:r>
+              <w:rPr>
+                <w:rFonts w:ascii="Calibri" w:hAnsi="Calibri"/>
+                <w:color w:val="000000"/>
+                <w:sz w:val="22"/>
+              </w:rPr>
+              <w:t>21 Apr 2026</w:t>
+            </w:r>
+          </w:p>
+        </w:tc>
+        <w:tc>
+          <w:tcPr>
+            <w:tcW w:type="dxa" w:w="4800"/>
+          </w:tcPr>
+          <w:p>
+            <w:r>
+              <w:rPr>
+                <w:rFonts w:ascii="Calibri" w:hAnsi="Calibri"/>
+                <w:color w:val="000000"/>
+                <w:sz w:val="22"/>
+              </w:rPr>
+              <w:t>SlotiFlow MVP — Core Features Implementation Phase 1</w:t>
+              <w:br/>
+              <w:t>Implemented core SlotiFlow features: (1) Business registration flow with Stripe Connect setup; (2) Service creation UI with duration, price, and availability configuration; (3) Customer booking form with calendar picker and slot availability logic; (4) Appointment confirmation emails and SMS notifications (Twilio integration). Built database queries for availability slot calculation: accounts for service duration, break times, and business hours. Implemented conflict detection for overlapping appointments. Created admin dashboard with appointment list, status management, and basic analytics (total bookings, revenue).</w:t>
+            </w:r>
+          </w:p>
+        </w:tc>
+        <w:tc>
+          <w:tcPr>
+            <w:tcW w:type="dxa" w:w="3026"/>
+          </w:tcPr>
+          <w:p>
+            <w:r>
+              <w:rPr>
+                <w:rFonts w:ascii="Calibri" w:hAnsi="Calibri"/>
+                <w:color w:val="000000"/>
+                <w:sz w:val="22"/>
+              </w:rPr>
+              <w:t>Full-stack development, payment gateway integration (Stripe), notification services, database queries, real-time availability logic</w:t>
+            </w:r>
+          </w:p>
+        </w:tc>
+      </w:tr>
+      <w:tr>
+        <w:tc>
+          <w:tcPr>
+            <w:tcW w:type="dxa" w:w="1200"/>
+          </w:tcPr>
+          <w:p>
+            <w:r>
+              <w:rPr>
+                <w:rFonts w:ascii="Calibri" w:hAnsi="Calibri"/>
+                <w:color w:val="000000"/>
+                <w:sz w:val="22"/>
+              </w:rPr>
+              <w:t>28 Apr 2026</w:t>
+            </w:r>
+          </w:p>
+        </w:tc>
+        <w:tc>
+          <w:tcPr>
+            <w:tcW w:type="dxa" w:w="4800"/>
+          </w:tcPr>
+          <w:p>
+            <w:r>
+              <w:rPr>
+                <w:rFonts w:ascii="Calibri" w:hAnsi="Calibri"/>
+                <w:color w:val="000000"/>
+                <w:sz w:val="22"/>
+              </w:rPr>
+              <w:t>Portfolio Website — Deployment &amp; Optimization</w:t>
+              <w:br/>
+              <w:t>Finalized portfolio website deployment to production on Vercel with custom domain. Implemented SEO optimization: meta tags, Open Graph images for social sharing, structured data schema for projects. Set up Google Analytics and performance monitoring. Achieved Lighthouse scores: Performance 95, Accessibility 98, Best Practices 96, SEO 100. Integrated GitHub webhook for automatic redeployment on code pushes. Created README documentation for portfolio repository with setup and deployment instructions. Portfolio now showcases 5 fintech projects, technical skills, and comprehensive case studies.</w:t>
+            </w:r>
+          </w:p>
+        </w:tc>
+        <w:tc>
+          <w:tcPr>
+            <w:tcW w:type="dxa" w:w="3026"/>
+          </w:tcPr>
+          <w:p>
+            <w:r>
+              <w:rPr>
+                <w:rFonts w:ascii="Calibri" w:hAnsi="Calibri"/>
+                <w:color w:val="000000"/>
+                <w:sz w:val="22"/>
+              </w:rPr>
+              <w:t>Production deployment, SEO optimization, performance monitoring, DevOps, CI/CD pipeline management</w:t>
+            </w:r>
+          </w:p>
+        </w:tc>
+      </w:tr>
+      <w:tr>
+        <w:tc>
+          <w:tcPr>
+            <w:tcW w:type="dxa" w:w="1200"/>
+          </w:tcPr>
+          <w:p>
+            <w:r>
+              <w:rPr>
+                <w:rFonts w:ascii="Calibri" w:hAnsi="Calibri"/>
+                <w:color w:val="000000"/>
+                <w:sz w:val="22"/>
+              </w:rPr>
+              <w:t>5 May 2026</w:t>
+            </w:r>
+          </w:p>
+        </w:tc>
+        <w:tc>
+          <w:tcPr>
+            <w:tcW w:type="dxa" w:w="4800"/>
+          </w:tcPr>
+          <w:p>
+            <w:r>
+              <w:rPr>
+                <w:rFonts w:ascii="Calibri" w:hAnsi="Calibri"/>
+                <w:color w:val="000000"/>
+                <w:sz w:val="22"/>
+              </w:rPr>
+              <w:t>SlotiFlow MVP — Refinement &amp; User Experience Optimization</w:t>
+              <w:br/>
+              <w:t>Refined SlotiFlow user experience: (1) Implemented timezone support for appointment scheduling across different regions; (2) Built customer appointment history page with cancellation/rescheduling functionality; (3) Created business owner dashboard with detailed analytics: appointment trends, no-show rate, average booking value, revenue by service; (4) Added automated reminder system: 24-hour email + SMS reminders to reduce no-shows; (5) Implemented email customization for reminder templates per business. Conducted internal usability testing with 3 beta users (salon owner, clinic receptionist, consultant). Addressed feedback: simplified booking flow, improved calendar UX, clearer pricing display.</w:t>
+            </w:r>
+          </w:p>
+        </w:tc>
+        <w:tc>
+          <w:tcPr>
+            <w:tcW w:type="dxa" w:w="3026"/>
+          </w:tcPr>
+          <w:p>
+            <w:r>
+              <w:rPr>
+                <w:rFonts w:ascii="Calibri" w:hAnsi="Calibri"/>
+                <w:color w:val="000000"/>
+                <w:sz w:val="22"/>
+              </w:rPr>
+              <w:t>UX research and iteration, analytics design, automated notification systems, user testing, iterative product development</w:t>
+            </w:r>
+          </w:p>
+        </w:tc>
+      </w:tr>
+      <w:tr>
+        <w:tc>
+          <w:tcPr>
+            <w:tcW w:type="dxa" w:w="1200"/>
+          </w:tcPr>
+          <w:p>
+            <w:r>
+              <w:rPr>
+                <w:rFonts w:ascii="Calibri" w:hAnsi="Calibri"/>
+                <w:color w:val="000000"/>
+                <w:sz w:val="22"/>
+              </w:rPr>
+              <w:t>12 May 2026</w:t>
+            </w:r>
+          </w:p>
+        </w:tc>
+        <w:tc>
+          <w:tcPr>
+            <w:tcW w:type="dxa" w:w="4800"/>
+          </w:tcPr>
+          <w:p>
+            <w:r>
+              <w:rPr>
+                <w:rFonts w:ascii="Calibri" w:hAnsi="Calibri"/>
+                <w:color w:val="000000"/>
+                <w:sz w:val="22"/>
+              </w:rPr>
+              <w:t>SlotiFlow MVP — Payment Integration &amp; Financial Reconciliation</w:t>
+              <w:br/>
+              <w:t>Completed Stripe payment integration for SlotiFlow: (1) Implemented customer payment collection at booking confirmation; (2) Set up Stripe Connect to route payments to business accounts with SaaS commission (8% of transaction value); (3) Built financial reconciliation system: automated daily reconciliation of Stripe transactions against appointment records; (4) Created payout dashboard for businesses showing settled earnings, pending payouts, and transaction history; (5) Implemented webhook handlers for payment.succeeded, payment.failed, and refund events. Calculated financial projections: 100 bookings/month × $50 avg booking = $5,000 GMV, $400 SaaS revenue at 8% commission.</w:t>
+            </w:r>
+          </w:p>
+        </w:tc>
+        <w:tc>
+          <w:tcPr>
+            <w:tcW w:type="dxa" w:w="3026"/>
+          </w:tcPr>
+          <w:p>
+            <w:r>
+              <w:rPr>
+                <w:rFonts w:ascii="Calibri" w:hAnsi="Calibri"/>
+                <w:color w:val="000000"/>
+                <w:sz w:val="22"/>
+              </w:rPr>
+              <w:t>Payment systems design, financial reconciliation logic, Stripe API integration, webhook event handling, SaaS economics modeling</w:t>
+            </w:r>
+          </w:p>
+        </w:tc>
+      </w:tr>
+      <w:tr>
+        <w:tc>
+          <w:tcPr>
+            <w:tcW w:type="dxa" w:w="1200"/>
+          </w:tcPr>
+          <w:p>
+            <w:r>
+              <w:rPr>
+                <w:rFonts w:ascii="Calibri" w:hAnsi="Calibri"/>
+                <w:color w:val="000000"/>
+                <w:sz w:val="22"/>
+              </w:rPr>
+              <w:t>19 May 2026</w:t>
+            </w:r>
+          </w:p>
+        </w:tc>
+        <w:tc>
+          <w:tcPr>
+            <w:tcW w:type="dxa" w:w="4800"/>
+          </w:tcPr>
+          <w:p>
+            <w:r>
+              <w:rPr>
+                <w:rFonts w:ascii="Calibri" w:hAnsi="Calibri"/>
+                <w:color w:val="000000"/>
+                <w:sz w:val="22"/>
+              </w:rPr>
+              <w:t>SlotiFlow Launch Preparation — Product Marketing &amp; Go-to-Market Strategy</w:t>
+              <w:br/>
+              <w:t>Prepared SlotiFlow for beta launch: (1) Created landing page highlighting core value props: "Save 10 hours/week on scheduling" targeting salon/clinic market; (2) Drafted customer success templates: onboarding email sequence, setup guide, video tutorials (YouTube shorts); (3) Developed pricing strategy: Starter ($29/mo), Professional ($79/mo), Enterprise (custom); (4) Set up beta user program: recruited 5 small businesses for 3-month free trial; (5) Wrote product blog post on scheduling pain points in SMB services sector. Created social media content (LinkedIn, Twitter) targeting salon owners and clinic managers.</w:t>
+            </w:r>
+          </w:p>
+        </w:tc>
+        <w:tc>
+          <w:tcPr>
+            <w:tcW w:type="dxa" w:w="3026"/>
+          </w:tcPr>
+          <w:p>
+            <w:r>
+              <w:rPr>
+                <w:rFonts w:ascii="Calibri" w:hAnsi="Calibri"/>
+                <w:color w:val="000000"/>
+                <w:sz w:val="22"/>
+              </w:rPr>
+              <w:t>Product marketing, go-to-market strategy, customer acquisition, content marketing, SaaS pricing strategy</w:t>
+            </w:r>
+          </w:p>
+        </w:tc>
+      </w:tr>
+      <w:tr>
+        <w:tc>
+          <w:tcPr>
+            <w:tcW w:type="dxa" w:w="1200"/>
+          </w:tcPr>
+          <w:p>
+            <w:r>
+              <w:rPr>
+                <w:rFonts w:ascii="Calibri" w:hAnsi="Calibri"/>
+                <w:color w:val="000000"/>
+                <w:sz w:val="22"/>
+              </w:rPr>
+              <w:t>27 May 2026</w:t>
+            </w:r>
+          </w:p>
+        </w:tc>
+        <w:tc>
+          <w:tcPr>
+            <w:tcW w:type="dxa" w:w="4800"/>
+          </w:tcPr>
+          <w:p>
+            <w:r>
+              <w:rPr>
+                <w:rFonts w:ascii="Calibri" w:hAnsi="Calibri"/>
+                <w:color w:val="000000"/>
+                <w:sz w:val="22"/>
+              </w:rPr>
+              <w:t>Capstone Reflection — Informatics &amp; Analytics Application to Product Development</w:t>
+              <w:br/>
+              <w:t>Reflected on 8-month journey blending Lynia Finance industrial attachment with personal SaaS product development: (1) Lynia Finance experience provided fintech regulatory knowledge, API integration frameworks, investor-grade financial modeling, and AWS infrastructure patterns; (2) Portfolio website synthesized technical and non-technical skills for professional positioning; (3) SlotiFlow SaaS application combined analytics (appointment trends, revenue forecasting), database design (normalized schema), and product management. Documented competencies developed across attachment and personal projects: cloud architecture, financial modeling, full-stack development, SaaS economics, product strategy. Identified key learnings: importance of user testing, iterative development, regulatory compliance in fintech, and cross-functional thinking. Prepared for transition to post-graduation professional role leveraging both corporate fintech experience and entrepreneurial SaaS product validation.</w:t>
+            </w:r>
+          </w:p>
+        </w:tc>
+        <w:tc>
+          <w:tcPr>
+            <w:tcW w:type="dxa" w:w="3026"/>
+          </w:tcPr>
+          <w:p>
+            <w:r>
+              <w:rPr>
+                <w:rFonts w:ascii="Calibri" w:hAnsi="Calibri"/>
+                <w:color w:val="000000"/>
+                <w:sz w:val="22"/>
+              </w:rPr>
+              <w:t>Professional reflection, competency integration, cross-functional product thinking, entrepreneurship, career planning</w:t>
             </w:r>
           </w:p>
         </w:tc>

</xml_diff>